<commit_message>
v4.4: narrow Section 4 (field records) to key results; move per-channel tables to Supplementary (Tables S1-S5); keep all moved values in supplementary_moved_values.md
Co-Authored-By: Claude Opus 5.5 <noreply@anthropic.com>
Claude-Session: https://claude.ai/code/session_01LGLpDzAMfdMgWcXQjLxauw
</commit_message>
<xml_diff>
--- a/manuscript/v4/word/Manuscript_v4.docx
+++ b/manuscript/v4/word/Manuscript_v4.docx
@@ -2,7 +2,7 @@
 <file path=word/document.xml><?xml version="1.0" encoding="utf-8"?>
 <w:document xmlns:w="http://schemas.openxmlformats.org/wordprocessingml/2006/main" xmlns:m="http://schemas.openxmlformats.org/officeDocument/2006/math" xmlns:r="http://schemas.openxmlformats.org/officeDocument/2006/relationships" xmlns:o="urn:schemas-microsoft-com:office:office" xmlns:v="urn:schemas-microsoft-com:vml" xmlns:w10="urn:schemas-microsoft-com:office:word" xmlns:a="http://schemas.openxmlformats.org/drawingml/2006/main" xmlns:pic="http://schemas.openxmlformats.org/drawingml/2006/picture" xmlns:wp="http://schemas.openxmlformats.org/drawingml/2006/wordprocessingDrawing">
   <w:body>
-    <w:bookmarkStart w:id="80" w:name="Xe84059547080af466f9bb5675d2e24099a46e6a"/>
+    <w:bookmarkStart w:id="79" w:name="Xe84059547080af466f9bb5675d2e24099a46e6a"/>
     <w:p>
       <w:pPr>
         <w:pStyle w:val="Heading1"/>
@@ -5349,7 +5349,7 @@
         <w:pStyle w:val="BodyText"/>
       </w:pPr>
       <w:r>
-        <w:t xml:space="preserve">Eq. (2) holds under five conditions, each of which the later sections test. The structure must be linear and time-invariant during the crossing (Section 3 and the superposition test of Section 4.4). A quasi-static response is assumed (Section 6). Because the axles must follow the path on which</w:t>
+        <w:t xml:space="preserve">Eq. (2) holds under five conditions, each of which the later sections test. The structure must be linear and time-invariant during the crossing (Section 3 and the superposition test of Section 4.2). A quasi-static response is assumed (Section 6). Because the axles must follow the path on which</w:t>
       </w:r>
       <w:r>
         <w:t xml:space="preserve"> </w:t>
@@ -5372,7 +5372,7 @@
         <w:t xml:space="preserve"> </w:t>
       </w:r>
       <w:r>
-        <w:t xml:space="preserve">is defined, each lane has its own constant (Section 4.4). A complete crossing is needed: truncating the record when the first axle leaves changes the rotation integral by up to 59 % on a two-span example (Appendix B). The record must be re-zeroed to the unloaded state, and any residual offset or slow drift enters the integral directly (Sections 2.3 and 4.3).</w:t>
+        <w:t xml:space="preserve">is defined, each lane has its own constant (Section 4.2). A complete crossing is needed: truncating the record when the first axle leaves changes the rotation integral by up to 59 % on a two-span example (Appendix B). The record must be re-zeroed to the unloaded state, and any residual offset or slow drift enters the integral directly (Sections 2.3 and 4.3).</w:t>
       </w:r>
     </w:p>
     <w:bookmarkEnd w:id="23"/>
@@ -14220,7 +14220,7 @@
       </w:r>
     </w:p>
     <w:bookmarkEnd w:id="29"/>
-    <w:bookmarkStart w:id="35" w:name="Xdadd06c016725474a00d3ead6ba4e194881151b"/>
+    <w:bookmarkStart w:id="34" w:name="Xdadd06c016725474a00d3ead6ba4e194881151b"/>
     <w:p>
       <w:pPr>
         <w:pStyle w:val="Heading2"/>
@@ -14234,7 +14234,7 @@
         <w:pStyle w:val="FirstParagraph"/>
       </w:pPr>
       <w:r>
-        <w:t xml:space="preserve">This section asks what integral estimators deliver on real moving-load records from a continuous girder. It reports every channel with 95 % confidence intervals (CIs), tests equivalence instead of stating agreement, and compares single- and multi-channel estimators out of sample.</w:t>
+        <w:t xml:space="preserve">This section asks what integral estimators deliver on real moving-load records from a continuous girder. It reports the main results with 95 % confidence intervals (CIs) and compares single- and multi-channel estimators out of sample. The per-channel tables, the equivalence tests, the noise correlations and the speed regressions are in the Supplementary Material (Tables S1–S4).</w:t>
       </w:r>
     </w:p>
     <w:bookmarkStart w:id="30" w:name="data-and-reference-weights"/>
@@ -14251,7 +14251,7 @@
         <w:pStyle w:val="FirstParagraph"/>
       </w:pPr>
       <w:r>
-        <w:t xml:space="preserve">The Nothing-on-Road BWIM (NOR-BWIM) dataset [48] (CC0 licence) contains strain records of the Virginia Smart Road Bridge, documented in [41–43,49]. The bridge is a post-tensioned concrete box girder continuous over five spans of 86.5 + 3 × 144 + 86.5 m = 605 m. Its depth is about 3.8 m at mid-span and 9.5 m at the piers. Strain transducers on the soffit of the top slab lie near mid-span of span 2, 158.5 m from the first abutment, in longitudinal stations about 2 m apart under the wheel path.</w:t>
+        <w:t xml:space="preserve">The Nothing-on-Road BWIM (NOR-BWIM) dataset [48] (CC0 licence) contains strain records of the Virginia Smart Road Bridge, documented in [41–43,49]. The bridge is a post-tensioned concrete box girder continuous over five spans of 86.5 + 3 × 144 + 86.5 m = 605 m. Strain transducers on the soffit of the top slab lie near mid-span of span 2, 158.5 m from the first abutment, in longitudinal stations about 2 m apart under the wheel path.</w:t>
       </w:r>
     </w:p>
     <w:p>
@@ -14259,7 +14259,7 @@
         <w:pStyle w:val="BodyText"/>
       </w:pPr>
       <w:r>
-        <w:t xml:space="preserve">Day 1 has 12 channels at 100 Hz, labelled with the prefix</w:t>
+        <w:t xml:space="preserve">Day 1 has 12 channels, labelled with the prefix</w:t>
       </w:r>
       <w:r>
         <w:t xml:space="preserve"> </w:t>
@@ -14274,7 +14274,7 @@
         <w:t xml:space="preserve">”</w:t>
       </w:r>
       <w:r>
-        <w:t xml:space="preserve">. They fall into three groups: four wheel-path gauges with clear axle spikes (ch4, ch5, ch11, ch12), a partner gauge at each of these four stations, and four further gauges without axle spikes (ch1, ch2, ch8, ch9). Day 2 has four in-line channels at 200 Hz, which keep the dataset’s labels with the prefix</w:t>
+        <w:t xml:space="preserve">. They fall into three groups: four wheel-path gauges with clear axle spikes (ch4, ch5, ch11, ch12), a partner gauge at each of these four stations, and four further gauges without axle spikes (ch1, ch2, ch8, ch9). Day 2 has four in-line channels, labelled with the prefix</w:t>
       </w:r>
       <w:r>
         <w:t xml:space="preserve"> </w:t>
@@ -14300,7 +14300,7 @@
         <w:pStyle w:val="BodyText"/>
       </w:pPr>
       <w:r>
-        <w:t xml:space="preserve">The reference weights differ in quality between the days. On day 1, two 3-axle trucks ran in the instrumented lane; their gross weights were reported by the drivers for each pass (21.2–22.8 t for the runs used) [49]. On day 2, a 3-axle truck of 26.8 t and a 5-axle truck of 25.9 t were weighed on a static scale [49]. They ran in the instrumented lane (lane A), on the return trip in the other lane (lane B), and in two in-line two-truck runs.</w:t>
+        <w:t xml:space="preserve">The reference weights differ in quality between the days. On day 1, two 3-axle trucks ran in the instrumented lane, and their gross weights were reported by the drivers [49]. On day 2, a 3-axle truck of 26.8 t and a 5-axle truck of 25.9 t were weighed on a static scale [49]. They ran in the instrumented lane (lane A), on the return trip in the other lane (lane B), and in two in-line two-truck runs.</w:t>
       </w:r>
     </w:p>
     <w:p>
@@ -14316,7 +14316,7 @@
         <w:pStyle w:val="BodyText"/>
       </w:pPr>
       <w:r>
-        <w:t xml:space="preserve">Speeds were obtained from the axle spikes and the measured wheelbase; they agree with the speeds computed by the dataset authors’ processing script within 1–2 %. For each crossing a linear baseline was fitted to vehicle-free segments before and after the event. The strain was integrated over the whole time the truck was on the bridge plus 5 s at each end, and the result was converted to</w:t>
+        <w:t xml:space="preserve">Each record was re-zeroed with a linear baseline fitted to vehicle-free segments before and after the crossing, integrated over the whole time the truck was on the bridge, and converted to</w:t>
       </w:r>
       <w:r>
         <w:t xml:space="preserve"> </w:t>
@@ -14348,17 +14348,17 @@
         <w:t xml:space="preserve"> </w:t>
       </w:r>
       <w:r>
-        <w:t xml:space="preserve">with the speed measured at the gauges. Three day-1 runs with two trucks on the bridge and four passes without documented weights were excluded; the same runs are used throughout. The noise of the integral was measured from vehicle-free windows of crossing length, at least 70 s from any detected vehicle. Fig. 5 shows three crossings.</w:t>
+        <w:t xml:space="preserve">with the speed measured from the axle spikes. The noise of the integral was measured from vehicle-free windows of crossing length. Processing details and the excluded runs are in the Supplementary Material; Fig. 5 shows three crossings.</w:t>
       </w:r>
     </w:p>
     <w:bookmarkEnd w:id="30"/>
-    <w:bookmarkStart w:id="31" w:name="invariance-of-the-constant-and-speed"/>
+    <w:bookmarkStart w:id="31" w:name="invariance-lanes-and-gauges"/>
     <w:p>
       <w:pPr>
         <w:pStyle w:val="Heading3"/>
       </w:pPr>
       <w:r>
-        <w:t xml:space="preserve">4.2. Invariance of the constant and speed</w:t>
+        <w:t xml:space="preserve">4.2. Invariance, lanes and gauges</w:t>
       </w:r>
     </w:p>
     <w:p>
@@ -14366,7 +14366,7 @@
         <w:pStyle w:val="FirstParagraph"/>
       </w:pPr>
       <w:r>
-        <w:t xml:space="preserve">The constant is stable within the noise for most gauges, but invariance between trucks can be shown only within wide margins. On day 1, eight of the twelve gauges have a coefficient of variation of 5.8–13.5 %, and the χ² test accepts consistency with the noise (Table 3). The full table, with every channel and every average, is in the Supplementary Material.</w:t>
+        <w:t xml:space="preserve">The constant is stable within the noise for most gauges, but invariance between trucks can be shown only within margins of 10–27 %. On day 1, eight of the twelve gauges scatter as much as the measured noise predicts, and one gauge, ch11, gives the same constant for both trucks within ±10 % (Fig. 6a).</w:t>
       </w:r>
     </w:p>
     <w:p>
@@ -14374,7 +14374,7 @@
         <w:pStyle w:val="BodyText"/>
       </w:pPr>
       <w:r>
-        <w:t xml:space="preserve">The four gauges without axle spikes fail the invariance test. Their crossing residuals are much larger than the vehicle-free noise (Table 3), and their constant is 22–26 % lower for the second truck, with 95 % CIs of the ratio that exclude 1 (Table 4, Fig. 6a).</w:t>
+        <w:t xml:space="preserve">The four gauges without axle spikes fail this test: their constant is 22–26 % lower for the second truck. On day 1, however, speed and truck are almost perfectly confounded (correlation 0.98), so the difference may reflect a different wheel path, local deck action or speed.</w:t>
       </w:r>
     </w:p>
     <w:p>
@@ -14382,712 +14382,7 @@
         <w:pStyle w:val="BodyText"/>
       </w:pPr>
       <w:r>
-        <w:rPr>
-          <w:bCs/>
-          <w:b/>
-        </w:rPr>
-        <w:t xml:space="preserve">Table 3.</w:t>
-      </w:r>
-      <w:r>
-        <w:t xml:space="preserve"> </w:t>
-      </w:r>
-      <w:r>
-        <w:t xml:space="preserve">Integral constant</w:t>
-      </w:r>
-      <w:r>
-        <w:t xml:space="preserve"> </w:t>
-      </w:r>
-      <m:oMath>
-        <m:r>
-          <m:t>C</m:t>
-        </m:r>
-      </m:oMath>
-      <w:r>
-        <w:t xml:space="preserve"> </w:t>
-      </w:r>
-      <w:r>
-        <w:t xml:space="preserve">and its scatter over the runs, lane A unless stated. CV expected: coefficient of variation predicted from the measured vehicle-free noise. For ch1, ch2, ch8 and ch9 the residual variance is 2.9–5.1 times the vehicle-free noise variance.</w:t>
-      </w:r>
-    </w:p>
-    <w:tbl>
-      <w:tblPr>
-        <w:tblStyle w:val="Table"/>
-        <w:tblW w:type="pct" w:w="5000"/>
-        <w:tblLook w:firstRow="1" w:lastRow="0" w:firstColumn="0" w:lastColumn="0" w:noHBand="0" w:noVBand="0" w:val="0020"/>
-        <w:jc w:val="start"/>
-        <w:tblBorders>
-          <w:top w:val="single" w:sz="8" w:space="0" w:color="000000"/>
-          <w:left w:val="nil"/>
-          <w:bottom w:val="single" w:sz="8" w:space="0" w:color="000000"/>
-          <w:right w:val="nil"/>
-          <w:insideH w:val="nil"/>
-          <w:insideV w:val="nil"/>
-        </w:tblBorders>
-      </w:tblPr>
-      <w:tblGrid>
-        <w:gridCol w:w="2633"/>
-        <w:gridCol w:w="804"/>
-        <w:gridCol w:w="1755"/>
-        <w:gridCol w:w="1536"/>
-        <w:gridCol w:w="1389"/>
-        <w:gridCol w:w="950"/>
-      </w:tblGrid>
-      <w:tr>
-        <w:trPr>
-          <w:tblHeader w:val="true"/>
-        </w:trPr>
-        <w:tc>
-          <w:tcPr>
-            <w:tcW w:type="dxa" w:w="2633"/>
-            <w:tcBorders>
-              <w:top w:val="nil"/>
-              <w:left w:val="nil"/>
-              <w:bottom w:val="single" w:sz="6" w:space="0" w:color="000000"/>
-              <w:right w:val="nil"/>
-            </w:tcBorders>
-          </w:tcPr>
-          <w:p>
-            <w:pPr>
-              <w:pStyle w:val="Compact"/>
-              <w:jc w:val="left"/>
-            </w:pPr>
-            <w:r>
-              <w:t xml:space="preserve">Day, channel</w:t>
-            </w:r>
-          </w:p>
-        </w:tc>
-        <w:tc>
-          <w:tcPr>
-            <w:tcW w:type="dxa" w:w="804"/>
-            <w:tcBorders>
-              <w:top w:val="nil"/>
-              <w:left w:val="nil"/>
-              <w:bottom w:val="single" w:sz="6" w:space="0" w:color="000000"/>
-              <w:right w:val="nil"/>
-            </w:tcBorders>
-          </w:tcPr>
-          <w:p>
-            <w:pPr>
-              <w:pStyle w:val="Compact"/>
-              <w:jc w:val="left"/>
-            </w:pPr>
-            <w:r>
-              <w:t xml:space="preserve">Runs</w:t>
-            </w:r>
-          </w:p>
-        </w:tc>
-        <w:tc>
-          <w:tcPr>
-            <w:tcW w:type="dxa" w:w="1755"/>
-            <w:tcBorders>
-              <w:top w:val="nil"/>
-              <w:left w:val="nil"/>
-              <w:bottom w:val="single" w:sz="6" w:space="0" w:color="000000"/>
-              <w:right w:val="nil"/>
-            </w:tcBorders>
-          </w:tcPr>
-          <w:p>
-            <w:pPr>
-              <w:pStyle w:val="Compact"/>
-              <w:jc w:val="left"/>
-            </w:pPr>
-            <m:oMath>
-              <m:r>
-                <m:t>C</m:t>
-              </m:r>
-            </m:oMath>
-            <w:r>
-              <w:t xml:space="preserve"> </w:t>
-            </w:r>
-            <w:r>
-              <w:t xml:space="preserve">(µε m/t), 95 % CI</w:t>
-            </w:r>
-          </w:p>
-        </w:tc>
-        <w:tc>
-          <w:tcPr>
-            <w:tcW w:type="dxa" w:w="1536"/>
-            <w:tcBorders>
-              <w:top w:val="nil"/>
-              <w:left w:val="nil"/>
-              <w:bottom w:val="single" w:sz="6" w:space="0" w:color="000000"/>
-              <w:right w:val="nil"/>
-            </w:tcBorders>
-          </w:tcPr>
-          <w:p>
-            <w:pPr>
-              <w:pStyle w:val="Compact"/>
-              <w:jc w:val="left"/>
-            </w:pPr>
-            <w:r>
-              <w:t xml:space="preserve">CV observed (%)</w:t>
-            </w:r>
-          </w:p>
-        </w:tc>
-        <w:tc>
-          <w:tcPr>
-            <w:tcW w:type="dxa" w:w="1389"/>
-            <w:tcBorders>
-              <w:top w:val="nil"/>
-              <w:left w:val="nil"/>
-              <w:bottom w:val="single" w:sz="6" w:space="0" w:color="000000"/>
-              <w:right w:val="nil"/>
-            </w:tcBorders>
-          </w:tcPr>
-          <w:p>
-            <w:pPr>
-              <w:pStyle w:val="Compact"/>
-              <w:jc w:val="left"/>
-            </w:pPr>
-            <w:r>
-              <w:t xml:space="preserve">CV expected (%)</w:t>
-            </w:r>
-          </w:p>
-        </w:tc>
-        <w:tc>
-          <w:tcPr>
-            <w:tcW w:type="dxa" w:w="950"/>
-            <w:tcBorders>
-              <w:top w:val="nil"/>
-              <w:left w:val="nil"/>
-              <w:bottom w:val="single" w:sz="6" w:space="0" w:color="000000"/>
-              <w:right w:val="nil"/>
-            </w:tcBorders>
-          </w:tcPr>
-          <w:p>
-            <w:pPr>
-              <w:pStyle w:val="Compact"/>
-              <w:jc w:val="left"/>
-            </w:pPr>
-            <w:r>
-              <w:t xml:space="preserve">χ² p</w:t>
-            </w:r>
-          </w:p>
-        </w:tc>
-      </w:tr>
-      <w:tr>
-        <w:tc>
-          <w:tcPr>
-            <w:tcW w:type="dxa" w:w="2633"/>
-          </w:tcPr>
-          <w:p>
-            <w:pPr>
-              <w:pStyle w:val="Compact"/>
-              <w:jc w:val="left"/>
-            </w:pPr>
-            <w:r>
-              <w:t xml:space="preserve">1, ch11 (best)</w:t>
-            </w:r>
-          </w:p>
-        </w:tc>
-        <w:tc>
-          <w:tcPr>
-            <w:tcW w:type="dxa" w:w="804"/>
-          </w:tcPr>
-          <w:p>
-            <w:pPr>
-              <w:pStyle w:val="Compact"/>
-              <w:jc w:val="left"/>
-            </w:pPr>
-            <w:r>
-              <w:t xml:space="preserve">7</w:t>
-            </w:r>
-          </w:p>
-        </w:tc>
-        <w:tc>
-          <w:tcPr>
-            <w:tcW w:type="dxa" w:w="1755"/>
-          </w:tcPr>
-          <w:p>
-            <w:pPr>
-              <w:pStyle w:val="Compact"/>
-              <w:jc w:val="left"/>
-            </w:pPr>
-            <w:r>
-              <w:t xml:space="preserve">−5.85 (−6.17, −5.53)</w:t>
-            </w:r>
-          </w:p>
-        </w:tc>
-        <w:tc>
-          <w:tcPr>
-            <w:tcW w:type="dxa" w:w="1536"/>
-          </w:tcPr>
-          <w:p>
-            <w:pPr>
-              <w:pStyle w:val="Compact"/>
-              <w:jc w:val="left"/>
-            </w:pPr>
-            <w:r>
-              <w:t xml:space="preserve">5.8</w:t>
-            </w:r>
-          </w:p>
-        </w:tc>
-        <w:tc>
-          <w:tcPr>
-            <w:tcW w:type="dxa" w:w="1389"/>
-          </w:tcPr>
-          <w:p>
-            <w:pPr>
-              <w:pStyle w:val="Compact"/>
-              <w:jc w:val="left"/>
-            </w:pPr>
-            <w:r>
-              <w:t xml:space="preserve">6.8</w:t>
-            </w:r>
-          </w:p>
-        </w:tc>
-        <w:tc>
-          <w:tcPr>
-            <w:tcW w:type="dxa" w:w="950"/>
-          </w:tcPr>
-          <w:p>
-            <w:pPr>
-              <w:pStyle w:val="Compact"/>
-              <w:jc w:val="left"/>
-            </w:pPr>
-            <w:r>
-              <w:t xml:space="preserve">0.60</w:t>
-            </w:r>
-          </w:p>
-        </w:tc>
-      </w:tr>
-      <w:tr>
-        <w:tc>
-          <w:tcPr>
-            <w:tcW w:type="dxa" w:w="2633"/>
-          </w:tcPr>
-          <w:p>
-            <w:pPr>
-              <w:pStyle w:val="Compact"/>
-              <w:jc w:val="left"/>
-            </w:pPr>
-            <w:r>
-              <w:t xml:space="preserve">1, gauge average (4 wheel-path gauges)</w:t>
-            </w:r>
-          </w:p>
-        </w:tc>
-        <w:tc>
-          <w:tcPr>
-            <w:tcW w:type="dxa" w:w="804"/>
-          </w:tcPr>
-          <w:p>
-            <w:pPr>
-              <w:pStyle w:val="Compact"/>
-              <w:jc w:val="left"/>
-            </w:pPr>
-            <w:r>
-              <w:t xml:space="preserve">7</w:t>
-            </w:r>
-          </w:p>
-        </w:tc>
-        <w:tc>
-          <w:tcPr>
-            <w:tcW w:type="dxa" w:w="1755"/>
-          </w:tcPr>
-          <w:p>
-            <w:pPr>
-              <w:pStyle w:val="Compact"/>
-              <w:jc w:val="left"/>
-            </w:pPr>
-            <w:r>
-              <w:t xml:space="preserve">−4.03 (−4.24, −3.82)</w:t>
-            </w:r>
-          </w:p>
-        </w:tc>
-        <w:tc>
-          <w:tcPr>
-            <w:tcW w:type="dxa" w:w="1536"/>
-          </w:tcPr>
-          <w:p>
-            <w:pPr>
-              <w:pStyle w:val="Compact"/>
-              <w:jc w:val="left"/>
-            </w:pPr>
-            <w:r>
-              <w:t xml:space="preserve">5.6</w:t>
-            </w:r>
-          </w:p>
-        </w:tc>
-        <w:tc>
-          <w:tcPr>
-            <w:tcW w:type="dxa" w:w="1389"/>
-          </w:tcPr>
-          <w:p>
-            <w:pPr>
-              <w:pStyle w:val="Compact"/>
-              <w:jc w:val="left"/>
-            </w:pPr>
-            <w:r>
-              <w:t xml:space="preserve">6.1</w:t>
-            </w:r>
-          </w:p>
-        </w:tc>
-        <w:tc>
-          <w:tcPr>
-            <w:tcW w:type="dxa" w:w="950"/>
-          </w:tcPr>
-          <w:p>
-            <w:pPr>
-              <w:pStyle w:val="Compact"/>
-              <w:jc w:val="left"/>
-            </w:pPr>
-            <w:r>
-              <w:t xml:space="preserve">0.53</w:t>
-            </w:r>
-          </w:p>
-        </w:tc>
-      </w:tr>
-      <w:tr>
-        <w:tc>
-          <w:tcPr>
-            <w:tcW w:type="dxa" w:w="2633"/>
-          </w:tcPr>
-          <w:p>
-            <w:pPr>
-              <w:pStyle w:val="Compact"/>
-              <w:jc w:val="left"/>
-            </w:pPr>
-            <w:r>
-              <w:t xml:space="preserve">1, ch1, ch2, ch8, ch9</w:t>
-            </w:r>
-          </w:p>
-        </w:tc>
-        <w:tc>
-          <w:tcPr>
-            <w:tcW w:type="dxa" w:w="804"/>
-          </w:tcPr>
-          <w:p>
-            <w:pPr>
-              <w:pStyle w:val="Compact"/>
-              <w:jc w:val="left"/>
-            </w:pPr>
-            <w:r>
-              <w:t xml:space="preserve">7</w:t>
-            </w:r>
-          </w:p>
-        </w:tc>
-        <w:tc>
-          <w:tcPr>
-            <w:tcW w:type="dxa" w:w="1755"/>
-          </w:tcPr>
-          <w:p>
-            <w:pPr>
-              <w:pStyle w:val="Compact"/>
-              <w:jc w:val="left"/>
-            </w:pPr>
-            <w:r>
-              <w:t xml:space="preserve">−1.49 to −2.38</w:t>
-            </w:r>
-          </w:p>
-        </w:tc>
-        <w:tc>
-          <w:tcPr>
-            <w:tcW w:type="dxa" w:w="1536"/>
-          </w:tcPr>
-          <w:p>
-            <w:pPr>
-              <w:pStyle w:val="Compact"/>
-              <w:jc w:val="left"/>
-            </w:pPr>
-            <w:r>
-              <w:t xml:space="preserve">17.2–19.1</w:t>
-            </w:r>
-          </w:p>
-        </w:tc>
-        <w:tc>
-          <w:tcPr>
-            <w:tcW w:type="dxa" w:w="1389"/>
-          </w:tcPr>
-          <w:p>
-            <w:pPr>
-              <w:pStyle w:val="Compact"/>
-              <w:jc w:val="left"/>
-            </w:pPr>
-            <w:r>
-              <w:t xml:space="preserve">7.8–11.0</w:t>
-            </w:r>
-          </w:p>
-        </w:tc>
-        <w:tc>
-          <w:tcPr>
-            <w:tcW w:type="dxa" w:w="950"/>
-          </w:tcPr>
-          <w:p>
-            <w:pPr>
-              <w:pStyle w:val="Compact"/>
-              <w:jc w:val="left"/>
-            </w:pPr>
-            <w:r>
-              <w:t xml:space="preserve">≤ 0.012</w:t>
-            </w:r>
-          </w:p>
-        </w:tc>
-      </w:tr>
-      <w:tr>
-        <w:tc>
-          <w:tcPr>
-            <w:tcW w:type="dxa" w:w="2633"/>
-          </w:tcPr>
-          <w:p>
-            <w:pPr>
-              <w:pStyle w:val="Compact"/>
-              <w:jc w:val="left"/>
-            </w:pPr>
-            <w:r>
-              <w:t xml:space="preserve">2, st36</w:t>
-            </w:r>
-          </w:p>
-        </w:tc>
-        <w:tc>
-          <w:tcPr>
-            <w:tcW w:type="dxa" w:w="804"/>
-          </w:tcPr>
-          <w:p>
-            <w:pPr>
-              <w:pStyle w:val="Compact"/>
-              <w:jc w:val="left"/>
-            </w:pPr>
-            <w:r>
-              <w:t xml:space="preserve">8</w:t>
-            </w:r>
-          </w:p>
-        </w:tc>
-        <w:tc>
-          <w:tcPr>
-            <w:tcW w:type="dxa" w:w="1755"/>
-          </w:tcPr>
-          <w:p>
-            <w:pPr>
-              <w:pStyle w:val="Compact"/>
-              <w:jc w:val="left"/>
-            </w:pPr>
-            <w:r>
-              <w:t xml:space="preserve">−5.97 (−6.57, −5.38)</w:t>
-            </w:r>
-          </w:p>
-        </w:tc>
-        <w:tc>
-          <w:tcPr>
-            <w:tcW w:type="dxa" w:w="1536"/>
-          </w:tcPr>
-          <w:p>
-            <w:pPr>
-              <w:pStyle w:val="Compact"/>
-              <w:jc w:val="left"/>
-            </w:pPr>
-            <w:r>
-              <w:t xml:space="preserve">12.0</w:t>
-            </w:r>
-          </w:p>
-        </w:tc>
-        <w:tc>
-          <w:tcPr>
-            <w:tcW w:type="dxa" w:w="1389"/>
-          </w:tcPr>
-          <w:p>
-            <w:pPr>
-              <w:pStyle w:val="Compact"/>
-              <w:jc w:val="left"/>
-            </w:pPr>
-            <w:r>
-              <w:t xml:space="preserve">16.5</w:t>
-            </w:r>
-          </w:p>
-        </w:tc>
-        <w:tc>
-          <w:tcPr>
-            <w:tcW w:type="dxa" w:w="950"/>
-          </w:tcPr>
-          <w:p>
-            <w:pPr>
-              <w:pStyle w:val="Compact"/>
-              <w:jc w:val="left"/>
-            </w:pPr>
-            <w:r>
-              <w:t xml:space="preserve">0.73</w:t>
-            </w:r>
-          </w:p>
-        </w:tc>
-      </w:tr>
-      <w:tr>
-        <w:tc>
-          <w:tcPr>
-            <w:tcW w:type="dxa" w:w="2633"/>
-          </w:tcPr>
-          <w:p>
-            <w:pPr>
-              <w:pStyle w:val="Compact"/>
-              <w:jc w:val="left"/>
-            </w:pPr>
-            <w:r>
-              <w:t xml:space="preserve">2, gauge average (4 gauges)</w:t>
-            </w:r>
-          </w:p>
-        </w:tc>
-        <w:tc>
-          <w:tcPr>
-            <w:tcW w:type="dxa" w:w="804"/>
-          </w:tcPr>
-          <w:p>
-            <w:pPr>
-              <w:pStyle w:val="Compact"/>
-              <w:jc w:val="left"/>
-            </w:pPr>
-            <w:r>
-              <w:t xml:space="preserve">8</w:t>
-            </w:r>
-          </w:p>
-        </w:tc>
-        <w:tc>
-          <w:tcPr>
-            <w:tcW w:type="dxa" w:w="1755"/>
-          </w:tcPr>
-          <w:p>
-            <w:pPr>
-              <w:pStyle w:val="Compact"/>
-              <w:jc w:val="left"/>
-            </w:pPr>
-            <w:r>
-              <w:t xml:space="preserve">−4.12 (−4.62, −3.63)</w:t>
-            </w:r>
-          </w:p>
-        </w:tc>
-        <w:tc>
-          <w:tcPr>
-            <w:tcW w:type="dxa" w:w="1536"/>
-          </w:tcPr>
-          <w:p>
-            <w:pPr>
-              <w:pStyle w:val="Compact"/>
-              <w:jc w:val="left"/>
-            </w:pPr>
-            <w:r>
-              <w:t xml:space="preserve">14.4</w:t>
-            </w:r>
-          </w:p>
-        </w:tc>
-        <w:tc>
-          <w:tcPr>
-            <w:tcW w:type="dxa" w:w="1389"/>
-          </w:tcPr>
-          <w:p>
-            <w:pPr>
-              <w:pStyle w:val="Compact"/>
-              <w:jc w:val="left"/>
-            </w:pPr>
-            <w:r>
-              <w:t xml:space="preserve">20.2</w:t>
-            </w:r>
-          </w:p>
-        </w:tc>
-        <w:tc>
-          <w:tcPr>
-            <w:tcW w:type="dxa" w:w="950"/>
-          </w:tcPr>
-          <w:p>
-            <w:pPr>
-              <w:pStyle w:val="Compact"/>
-              <w:jc w:val="left"/>
-            </w:pPr>
-            <w:r>
-              <w:t xml:space="preserve">0.79</w:t>
-            </w:r>
-          </w:p>
-        </w:tc>
-      </w:tr>
-      <w:tr>
-        <w:tc>
-          <w:tcPr>
-            <w:tcW w:type="dxa" w:w="2633"/>
-          </w:tcPr>
-          <w:p>
-            <w:pPr>
-              <w:pStyle w:val="Compact"/>
-              <w:jc w:val="left"/>
-            </w:pPr>
-            <w:r>
-              <w:t xml:space="preserve">2, lane B, average</w:t>
-            </w:r>
-          </w:p>
-        </w:tc>
-        <w:tc>
-          <w:tcPr>
-            <w:tcW w:type="dxa" w:w="804"/>
-          </w:tcPr>
-          <w:p>
-            <w:pPr>
-              <w:pStyle w:val="Compact"/>
-              <w:jc w:val="left"/>
-            </w:pPr>
-            <w:r>
-              <w:t xml:space="preserve">8</w:t>
-            </w:r>
-          </w:p>
-        </w:tc>
-        <w:tc>
-          <w:tcPr>
-            <w:tcW w:type="dxa" w:w="1755"/>
-          </w:tcPr>
-          <w:p>
-            <w:pPr>
-              <w:pStyle w:val="Compact"/>
-              <w:jc w:val="left"/>
-            </w:pPr>
-            <w:r>
-              <w:t xml:space="preserve">−3.27 (−4.19, −2.35)</w:t>
-            </w:r>
-          </w:p>
-        </w:tc>
-        <w:tc>
-          <w:tcPr>
-            <w:tcW w:type="dxa" w:w="1536"/>
-          </w:tcPr>
-          <w:p>
-            <w:pPr>
-              <w:pStyle w:val="Compact"/>
-              <w:jc w:val="left"/>
-            </w:pPr>
-            <w:r>
-              <w:t xml:space="preserve">33.7</w:t>
-            </w:r>
-          </w:p>
-        </w:tc>
-        <w:tc>
-          <w:tcPr>
-            <w:tcW w:type="dxa" w:w="1389"/>
-          </w:tcPr>
-          <w:p>
-            <w:pPr>
-              <w:pStyle w:val="Compact"/>
-              <w:jc w:val="left"/>
-            </w:pPr>
-            <w:r>
-              <w:t xml:space="preserve">23.2</w:t>
-            </w:r>
-          </w:p>
-        </w:tc>
-        <w:tc>
-          <w:tcPr>
-            <w:tcW w:type="dxa" w:w="950"/>
-          </w:tcPr>
-          <w:p>
-            <w:pPr>
-              <w:pStyle w:val="Compact"/>
-              <w:jc w:val="left"/>
-            </w:pPr>
-            <w:r>
-              <w:t xml:space="preserve">0.027</w:t>
-            </w:r>
-          </w:p>
-        </w:tc>
-      </w:tr>
-    </w:tbl>
-    <w:p>
-      <w:pPr>
-        <w:pStyle w:val="BodyText"/>
-      </w:pPr>
-      <w:r>
-        <w:t xml:space="preserve">On day 1 only one gauge, ch11, shows that the two trucks give the same constant within ±10 %. For the average of the four wheel-path gauges the smallest margin that can be shown is ±11.8 % (Table 4).</w:t>
+        <w:t xml:space="preserve">On day 2, the ratio of the gauge-average constants of the 5-axle and the 3-axle truck is 0.98 (95 % CI 0.70–1.37; Fig. 6b). The result is consistent with Eq. (2), but with eight runs it cannot exclude differences of up to about 27 %. It is therefore a coarse check of linearity and processing, not a sharp test of the identity. No speed effect was resolved.</w:t>
       </w:r>
     </w:p>
     <w:p>
@@ -15095,375 +14390,7 @@
         <w:pStyle w:val="BodyText"/>
       </w:pPr>
       <w:r>
-        <w:rPr>
-          <w:bCs/>
-          <w:b/>
-        </w:rPr>
-        <w:t xml:space="preserve">Table 4.</w:t>
-      </w:r>
-      <w:r>
-        <w:t xml:space="preserve"> </w:t>
-      </w:r>
-      <w:r>
-        <w:t xml:space="preserve">Ratio of the integral constants of two trucks, lane A unless stated. Day 1: second to first truck, both 3-axle; day 2: 5-axle to 3-axle truck. Equivalence by two one-sided tests (TOST) at the 5 % level: the 90 % CI of the ratio lies inside the stated margin (for ch11, 0.904–1.098), so a 95 % CI can extend beyond a margin that is shown.</w:t>
-      </w:r>
-    </w:p>
-    <w:tbl>
-      <w:tblPr>
-        <w:tblStyle w:val="Table"/>
-        <w:tblW w:type="pct" w:w="5000"/>
-        <w:tblLook w:firstRow="1" w:lastRow="0" w:firstColumn="0" w:lastColumn="0" w:noHBand="0" w:noVBand="0" w:val="0020"/>
-        <w:jc w:val="start"/>
-        <w:tblBorders>
-          <w:top w:val="single" w:sz="8" w:space="0" w:color="000000"/>
-          <w:left w:val="nil"/>
-          <w:bottom w:val="single" w:sz="8" w:space="0" w:color="000000"/>
-          <w:right w:val="nil"/>
-          <w:insideH w:val="nil"/>
-          <w:insideV w:val="nil"/>
-        </w:tblBorders>
-      </w:tblPr>
-      <w:tblGrid>
-        <w:gridCol w:w="3232"/>
-        <w:gridCol w:w="2604"/>
-        <w:gridCol w:w="3232"/>
-      </w:tblGrid>
-      <w:tr>
-        <w:trPr>
-          <w:tblHeader w:val="true"/>
-        </w:trPr>
-        <w:tc>
-          <w:tcPr>
-            <w:tcW w:type="dxa" w:w="3232"/>
-            <w:tcBorders>
-              <w:top w:val="nil"/>
-              <w:left w:val="nil"/>
-              <w:bottom w:val="single" w:sz="6" w:space="0" w:color="000000"/>
-              <w:right w:val="nil"/>
-            </w:tcBorders>
-          </w:tcPr>
-          <w:p>
-            <w:pPr>
-              <w:pStyle w:val="Compact"/>
-              <w:jc w:val="left"/>
-            </w:pPr>
-            <w:r>
-              <w:t xml:space="preserve">Day, channel</w:t>
-            </w:r>
-          </w:p>
-        </w:tc>
-        <w:tc>
-          <w:tcPr>
-            <w:tcW w:type="dxa" w:w="2604"/>
-            <w:tcBorders>
-              <w:top w:val="nil"/>
-              <w:left w:val="nil"/>
-              <w:bottom w:val="single" w:sz="6" w:space="0" w:color="000000"/>
-              <w:right w:val="nil"/>
-            </w:tcBorders>
-          </w:tcPr>
-          <w:p>
-            <w:pPr>
-              <w:pStyle w:val="Compact"/>
-              <w:jc w:val="left"/>
-            </w:pPr>
-            <w:r>
-              <w:t xml:space="preserve">Ratio (95 % CI)</w:t>
-            </w:r>
-          </w:p>
-        </w:tc>
-        <w:tc>
-          <w:tcPr>
-            <w:tcW w:type="dxa" w:w="3232"/>
-            <w:tcBorders>
-              <w:top w:val="nil"/>
-              <w:left w:val="nil"/>
-              <w:bottom w:val="single" w:sz="6" w:space="0" w:color="000000"/>
-              <w:right w:val="nil"/>
-            </w:tcBorders>
-          </w:tcPr>
-          <w:p>
-            <w:pPr>
-              <w:pStyle w:val="Compact"/>
-              <w:jc w:val="left"/>
-            </w:pPr>
-            <w:r>
-              <w:t xml:space="preserve">Equivalence</w:t>
-            </w:r>
-          </w:p>
-        </w:tc>
-      </w:tr>
-      <w:tr>
-        <w:tc>
-          <w:tcPr>
-            <w:tcW w:type="dxa" w:w="3232"/>
-          </w:tcPr>
-          <w:p>
-            <w:pPr>
-              <w:pStyle w:val="Compact"/>
-              <w:jc w:val="left"/>
-            </w:pPr>
-            <w:r>
-              <w:t xml:space="preserve">1, ch11 (best)</w:t>
-            </w:r>
-          </w:p>
-        </w:tc>
-        <w:tc>
-          <w:tcPr>
-            <w:tcW w:type="dxa" w:w="2604"/>
-          </w:tcPr>
-          <w:p>
-            <w:pPr>
-              <w:pStyle w:val="Compact"/>
-              <w:jc w:val="left"/>
-            </w:pPr>
-            <w:r>
-              <w:t xml:space="preserve">0.996 (0.874–1.136)</w:t>
-            </w:r>
-          </w:p>
-        </w:tc>
-        <w:tc>
-          <w:tcPr>
-            <w:tcW w:type="dxa" w:w="3232"/>
-          </w:tcPr>
-          <w:p>
-            <w:pPr>
-              <w:pStyle w:val="Compact"/>
-              <w:jc w:val="left"/>
-            </w:pPr>
-            <w:r>
-              <w:t xml:space="preserve">shown within ±10 %</w:t>
-            </w:r>
-          </w:p>
-        </w:tc>
-      </w:tr>
-      <w:tr>
-        <w:tc>
-          <w:tcPr>
-            <w:tcW w:type="dxa" w:w="3232"/>
-          </w:tcPr>
-          <w:p>
-            <w:pPr>
-              <w:pStyle w:val="Compact"/>
-              <w:jc w:val="left"/>
-            </w:pPr>
-            <w:r>
-              <w:t xml:space="preserve">1, gauge average (4 wheel-path gauges)</w:t>
-            </w:r>
-          </w:p>
-        </w:tc>
-        <w:tc>
-          <w:tcPr>
-            <w:tcW w:type="dxa" w:w="2604"/>
-          </w:tcPr>
-          <w:p>
-            <w:pPr>
-              <w:pStyle w:val="Compact"/>
-              <w:jc w:val="left"/>
-            </w:pPr>
-            <w:r>
-              <w:t xml:space="preserve">0.955 (0.863–1.057)</w:t>
-            </w:r>
-          </w:p>
-        </w:tc>
-        <w:tc>
-          <w:tcPr>
-            <w:tcW w:type="dxa" w:w="3232"/>
-          </w:tcPr>
-          <w:p>
-            <w:pPr>
-              <w:pStyle w:val="Compact"/>
-              <w:jc w:val="left"/>
-            </w:pPr>
-            <w:r>
-              <w:t xml:space="preserve">shown only within ±11.8 %</w:t>
-            </w:r>
-          </w:p>
-        </w:tc>
-      </w:tr>
-      <w:tr>
-        <w:tc>
-          <w:tcPr>
-            <w:tcW w:type="dxa" w:w="3232"/>
-          </w:tcPr>
-          <w:p>
-            <w:pPr>
-              <w:pStyle w:val="Compact"/>
-              <w:jc w:val="left"/>
-            </w:pPr>
-            <w:r>
-              <w:t xml:space="preserve">1, ch1, ch2, ch8, ch9</w:t>
-            </w:r>
-          </w:p>
-        </w:tc>
-        <w:tc>
-          <w:tcPr>
-            <w:tcW w:type="dxa" w:w="2604"/>
-          </w:tcPr>
-          <w:p>
-            <w:pPr>
-              <w:pStyle w:val="Compact"/>
-              <w:jc w:val="left"/>
-            </w:pPr>
-            <w:r>
-              <w:t xml:space="preserve">0.740–0.783</w:t>
-            </w:r>
-          </w:p>
-        </w:tc>
-        <w:tc>
-          <w:tcPr>
-            <w:tcW w:type="dxa" w:w="3232"/>
-          </w:tcPr>
-          <w:p>
-            <w:pPr>
-              <w:pStyle w:val="Compact"/>
-              <w:jc w:val="left"/>
-            </w:pPr>
-            <w:r>
-              <w:t xml:space="preserve">invariance rejected (CIs exclude 1)</w:t>
-            </w:r>
-          </w:p>
-        </w:tc>
-      </w:tr>
-      <w:tr>
-        <w:tc>
-          <w:tcPr>
-            <w:tcW w:type="dxa" w:w="3232"/>
-          </w:tcPr>
-          <w:p>
-            <w:pPr>
-              <w:pStyle w:val="Compact"/>
-              <w:jc w:val="left"/>
-            </w:pPr>
-            <w:r>
-              <w:t xml:space="preserve">2, st36</w:t>
-            </w:r>
-          </w:p>
-        </w:tc>
-        <w:tc>
-          <w:tcPr>
-            <w:tcW w:type="dxa" w:w="2604"/>
-          </w:tcPr>
-          <w:p>
-            <w:pPr>
-              <w:pStyle w:val="Compact"/>
-              <w:jc w:val="left"/>
-            </w:pPr>
-            <w:r>
-              <w:t xml:space="preserve">1.005 (0.735–1.375)</w:t>
-            </w:r>
-          </w:p>
-        </w:tc>
-        <w:tc>
-          <w:tcPr>
-            <w:tcW w:type="dxa" w:w="3232"/>
-          </w:tcPr>
-          <w:p>
-            <w:pPr>
-              <w:pStyle w:val="Compact"/>
-              <w:jc w:val="left"/>
-            </w:pPr>
-            <w:r>
-              <w:t xml:space="preserve">not shown</w:t>
-            </w:r>
-          </w:p>
-        </w:tc>
-      </w:tr>
-      <w:tr>
-        <w:tc>
-          <w:tcPr>
-            <w:tcW w:type="dxa" w:w="3232"/>
-          </w:tcPr>
-          <w:p>
-            <w:pPr>
-              <w:pStyle w:val="Compact"/>
-              <w:jc w:val="left"/>
-            </w:pPr>
-            <w:r>
-              <w:t xml:space="preserve">2, gauge average (4 gauges)</w:t>
-            </w:r>
-          </w:p>
-        </w:tc>
-        <w:tc>
-          <w:tcPr>
-            <w:tcW w:type="dxa" w:w="2604"/>
-          </w:tcPr>
-          <w:p>
-            <w:pPr>
-              <w:pStyle w:val="Compact"/>
-              <w:jc w:val="left"/>
-            </w:pPr>
-            <w:r>
-              <w:t xml:space="preserve">0.978 (0.697–1.374)</w:t>
-            </w:r>
-          </w:p>
-        </w:tc>
-        <w:tc>
-          <w:tcPr>
-            <w:tcW w:type="dxa" w:w="3232"/>
-          </w:tcPr>
-          <w:p>
-            <w:pPr>
-              <w:pStyle w:val="Compact"/>
-              <w:jc w:val="left"/>
-            </w:pPr>
-            <w:r>
-              <w:t xml:space="preserve">shown only within ±26.7 %</w:t>
-            </w:r>
-          </w:p>
-        </w:tc>
-      </w:tr>
-      <w:tr>
-        <w:tc>
-          <w:tcPr>
-            <w:tcW w:type="dxa" w:w="3232"/>
-          </w:tcPr>
-          <w:p>
-            <w:pPr>
-              <w:pStyle w:val="Compact"/>
-              <w:jc w:val="left"/>
-            </w:pPr>
-            <w:r>
-              <w:t xml:space="preserve">2, lane B, average</w:t>
-            </w:r>
-          </w:p>
-        </w:tc>
-        <w:tc>
-          <w:tcPr>
-            <w:tcW w:type="dxa" w:w="2604"/>
-          </w:tcPr>
-          <w:p>
-            <w:pPr>
-              <w:pStyle w:val="Compact"/>
-              <w:jc w:val="left"/>
-            </w:pPr>
-            <w:r>
-              <w:t xml:space="preserve">0.749 (0.440–1.276)</w:t>
-            </w:r>
-          </w:p>
-        </w:tc>
-        <w:tc>
-          <w:tcPr>
-            <w:tcW w:type="dxa" w:w="3232"/>
-          </w:tcPr>
-          <w:p>
-            <w:pPr>
-              <w:pStyle w:val="Compact"/>
-              <w:jc w:val="left"/>
-            </w:pPr>
-            <w:r>
-              <w:t xml:space="preserve">– (constants fail the χ² test, Table 3)</w:t>
-            </w:r>
-          </w:p>
-        </w:tc>
-      </w:tr>
-    </w:tbl>
-    <w:p>
-      <w:pPr>
-        <w:pStyle w:val="BodyText"/>
-      </w:pPr>
-      <w:r>
-        <w:t xml:space="preserve">On day 2 the constant does not depend detectably on the axle configuration, but the test is coarse. The ratio of the gauge-average constants of the 5-axle and the 3-axle truck is 0.98 (95 % CI 0.70–1.37). The result is consistent with Eq. (2), but with eight runs it cannot exclude differences of up to about 27 %. It is therefore a coarse check of linearity and processing, not a sharp test of the identity. In lane B the constants fail the χ² test (Table 3).</w:t>
+        <w:t xml:space="preserve">Each lane needs its own constant. For the gauge average, return trips in lane B gave constants 0.79 times those of lane A (95 % CI 0.59–1.00), as also found on another continuous girder [40]. The two in-line two-truck runs gave 0.92 of the summed single-truck predictions, consistent with superposition.</w:t>
       </w:r>
     </w:p>
     <w:p>
@@ -15471,7 +14398,7 @@
         <w:pStyle w:val="BodyText"/>
       </w:pPr>
       <w:r>
-        <w:t xml:space="preserve">On day 1, speed and truck are almost perfectly confounded, with a correlation of 0.98. The first truck ran at 10.4–12.8 m/s and the second at 19.1–19.8 m/s. The 22–26 % difference of the gauges without axle spikes may reflect a different transverse wheel path, local deck action or speed; the data cannot separate them.</w:t>
+        <w:t xml:space="preserve">Each deck gauge also needs its own constant. On day 1 the constant of ch11 is 3.9 times that of ch8, although the two gauges are within 6 m of each other and a one-dimensional beam model predicts nearly equal constants. The ratio of the st36 and st40 constants also changes with the lane, so gauge-factor spread is an unlikely cause; the deck-soffit gauges respond to slab bending and shear lag as well as to girder bending. The constant must therefore come from a weighed reference vehicle or a three-dimensional model, and a beam-model BPM would fail.</w:t>
       </w:r>
     </w:p>
     <w:p>
@@ -15479,7 +14406,7 @@
         <w:pStyle w:val="BodyText"/>
       </w:pPr>
       <w:r>
-        <w:t xml:space="preserve">On day 2 speed and truck are not confounded (13–28 m/s). No speed effect was resolved, but the confidence interval of the slope is too wide to call the constant speed-independent (Section 6; Supplementary Fig. S2).</w:t>
+        <w:t xml:space="preserve">A beam model of the girder nevertheless explains two global features. The gauges are not blind: the zeros of the uniform-load moment diagram in span 2 lie about 35 m from them. The whole 605 m crossing must be integrated, because span 2 contributes about 170 % of the net integral and the adjacent spans cancel the excess.</w:t>
       </w:r>
     </w:p>
     <w:bookmarkEnd w:id="31"/>
@@ -15497,7 +14424,21 @@
         <w:pStyle w:val="FirstParagraph"/>
       </w:pPr>
       <w:r>
-        <w:t xml:space="preserve">Combining gauges did not help on these records: on day 2 GLS was significantly worse than the gauge average. To test Section 2.4, the covariance of the integrated noise was measured from vehicle-free windows of crossing length (Table 5). On day 2 the four channels are strongly common-mode, with a mean correlation of 0.92, but their noise amplitudes are unequal (13.7–32.8 µε m at the median speed). On day 1 the mean correlation is only 0.42 (Supplementary Fig. S1).</w:t>
+        <w:t xml:space="preserve">Combining gauges did not help on these records. Four kinds of estimator were compared by leave-one-run-out cross-validation: single gauges, the gauge average, GLS (Eq. 13) and the zero-sum estimator (Eq. 14). In each fold the constants were calibrated without the test run, and</w:t>
+      </w:r>
+      <w:r>
+        <w:t xml:space="preserve"> </w:t>
+      </w:r>
+      <m:oMath>
+        <m:r>
+          <m:t>Σ</m:t>
+        </m:r>
+      </m:oMath>
+      <w:r>
+        <w:t xml:space="preserve"> </w:t>
+      </w:r>
+      <w:r>
+        <w:t xml:space="preserve">was estimated from vehicle-free windows only (Table 3, Fig. 7).</w:t>
       </w:r>
     </w:p>
     <w:p>
@@ -15509,13 +14450,13 @@
           <w:bCs/>
           <w:b/>
         </w:rPr>
-        <w:t xml:space="preserve">Table 5.</w:t>
-      </w:r>
-      <w:r>
-        <w:t xml:space="preserve"> </w:t>
-      </w:r>
-      <w:r>
-        <w:t xml:space="preserve">Correlation between gauges of the integrated strain: means over gauge pairs, with 95 % bootstrap CIs in brackets. Vehicle-free windows: 1227 on day 2 and 3405 on day 1. Crossing residual: deviation of a crossing’s integral from its calibrated value. –: not computed.</w:t>
+        <w:t xml:space="preserve">Table 3.</w:t>
+      </w:r>
+      <w:r>
+        <w:t xml:space="preserve"> </w:t>
+      </w:r>
+      <w:r>
+        <w:t xml:space="preserve">Mean absolute error of the gross weight (% of GVW), leave-one-run-out, with 95 % bootstrap CIs over the test runs (n = 8 on day 2, n = 7 on day 1). Leave-one-truck-out and in-sample results are in the Supplementary Material.</w:t>
       </w:r>
     </w:p>
     <w:tbl>
@@ -15558,7 +14499,7 @@
               <w:jc w:val="left"/>
             </w:pPr>
             <w:r>
-              <w:t xml:space="preserve">Correlation of</w:t>
+              <w:t xml:space="preserve">Estimator</w:t>
             </w:r>
           </w:p>
         </w:tc>
@@ -15614,7 +14555,7 @@
               <w:jc w:val="left"/>
             </w:pPr>
             <w:r>
-              <w:t xml:space="preserve">vehicle-free noise, non-overlapping windows</w:t>
+              <w:t xml:space="preserve">Best single gauge (chosen after the fact)</w:t>
             </w:r>
           </w:p>
         </w:tc>
@@ -15628,7 +14569,7 @@
               <w:jc w:val="left"/>
             </w:pPr>
             <w:r>
-              <w:t xml:space="preserve">0.92 (0.83–0.96)</w:t>
+              <w:t xml:space="preserve">8.4 (2.9–15.3)</w:t>
             </w:r>
           </w:p>
         </w:tc>
@@ -15642,7 +14583,7 @@
               <w:jc w:val="left"/>
             </w:pPr>
             <w:r>
-              <w:t xml:space="preserve">0.42 (0.26–0.54)</w:t>
+              <w:t xml:space="preserve">4.8 (1.8–7.9)</w:t>
             </w:r>
           </w:p>
         </w:tc>
@@ -15658,7 +14599,7 @@
               <w:jc w:val="left"/>
             </w:pPr>
             <w:r>
-              <w:t xml:space="preserve">vehicle-free noise, window length of each crossing</w:t>
+              <w:t xml:space="preserve">Worst single gauge</w:t>
             </w:r>
           </w:p>
         </w:tc>
@@ -15672,7 +14613,7 @@
               <w:jc w:val="left"/>
             </w:pPr>
             <w:r>
-              <w:t xml:space="preserve">0.90</w:t>
+              <w:t xml:space="preserve">27.9 (12.9–44.5)</w:t>
             </w:r>
           </w:p>
         </w:tc>
@@ -15686,7 +14627,7 @@
               <w:jc w:val="left"/>
             </w:pPr>
             <w:r>
-              <w:t xml:space="preserve">–</w:t>
+              <w:t xml:space="preserve">17.6 (11.0–23.4)</w:t>
             </w:r>
           </w:p>
         </w:tc>
@@ -15702,7 +14643,7 @@
               <w:jc w:val="left"/>
             </w:pPr>
             <w:r>
-              <w:t xml:space="preserve">crossing residuals</w:t>
+              <w:t xml:space="preserve">Gauge average</w:t>
             </w:r>
           </w:p>
         </w:tc>
@@ -15716,7 +14657,7 @@
               <w:jc w:val="left"/>
             </w:pPr>
             <w:r>
-              <w:t xml:space="preserve">0.63</w:t>
+              <w:t xml:space="preserve">11.9 (6.0–18.6)</w:t>
             </w:r>
           </w:p>
         </w:tc>
@@ -15730,7 +14671,7 @@
               <w:jc w:val="left"/>
             </w:pPr>
             <w:r>
-              <w:t xml:space="preserve">–</w:t>
+              <w:t xml:space="preserve">5.3 (2.5–7.8)</w:t>
             </w:r>
           </w:p>
         </w:tc>
@@ -15746,8 +14687,16 @@
               <w:jc w:val="left"/>
             </w:pPr>
             <w:r>
-              <w:t xml:space="preserve">crossing residuals, st40 with its neighbours</w:t>
-            </w:r>
+              <w:t xml:space="preserve">GLS, diagonal</w:t>
+            </w:r>
+            <w:r>
+              <w:t xml:space="preserve"> </w:t>
+            </w:r>
+            <m:oMath>
+              <m:r>
+                <m:t>Σ</m:t>
+              </m:r>
+            </m:oMath>
           </w:p>
         </w:tc>
         <w:tc>
@@ -15760,7 +14709,7 @@
               <w:jc w:val="left"/>
             </w:pPr>
             <w:r>
-              <w:t xml:space="preserve">0.30–0.37</w:t>
+              <w:t xml:space="preserve">11.4 (6.0–18.0)</w:t>
             </w:r>
           </w:p>
         </w:tc>
@@ -15774,7 +14723,213 @@
               <w:jc w:val="left"/>
             </w:pPr>
             <w:r>
-              <w:t xml:space="preserve">–</w:t>
+              <w:t xml:space="preserve">5.3 (2.5–8.0)</w:t>
+            </w:r>
+          </w:p>
+        </w:tc>
+      </w:tr>
+      <w:tr>
+        <w:tc>
+          <w:tcPr>
+            <w:tcW w:type="dxa" w:w="3796"/>
+          </w:tcPr>
+          <w:p>
+            <w:pPr>
+              <w:pStyle w:val="Compact"/>
+              <w:jc w:val="left"/>
+            </w:pPr>
+            <w:r>
+              <w:t xml:space="preserve">GLS, measured</w:t>
+            </w:r>
+            <w:r>
+              <w:t xml:space="preserve"> </w:t>
+            </w:r>
+            <m:oMath>
+              <m:r>
+                <m:t>Σ</m:t>
+              </m:r>
+            </m:oMath>
+          </w:p>
+        </w:tc>
+        <w:tc>
+          <w:tcPr>
+            <w:tcW w:type="dxa" w:w="2636"/>
+          </w:tcPr>
+          <w:p>
+            <w:pPr>
+              <w:pStyle w:val="Compact"/>
+              <w:jc w:val="left"/>
+            </w:pPr>
+            <w:r>
+              <w:t xml:space="preserve">20.4 (12.3–28.8)</w:t>
+            </w:r>
+          </w:p>
+        </w:tc>
+        <w:tc>
+          <w:tcPr>
+            <w:tcW w:type="dxa" w:w="2636"/>
+          </w:tcPr>
+          <w:p>
+            <w:pPr>
+              <w:pStyle w:val="Compact"/>
+              <w:jc w:val="left"/>
+            </w:pPr>
+            <w:r>
+              <w:t xml:space="preserve">5.8 (3.5–8.1)</w:t>
+            </w:r>
+          </w:p>
+        </w:tc>
+      </w:tr>
+      <w:tr>
+        <w:tc>
+          <w:tcPr>
+            <w:tcW w:type="dxa" w:w="3796"/>
+          </w:tcPr>
+          <w:p>
+            <w:pPr>
+              <w:pStyle w:val="Compact"/>
+              <w:jc w:val="left"/>
+            </w:pPr>
+            <w:r>
+              <w:t xml:space="preserve">Zero-sum, measured</w:t>
+            </w:r>
+            <w:r>
+              <w:t xml:space="preserve"> </w:t>
+            </w:r>
+            <m:oMath>
+              <m:r>
+                <m:t>Σ</m:t>
+              </m:r>
+            </m:oMath>
+          </w:p>
+        </w:tc>
+        <w:tc>
+          <w:tcPr>
+            <w:tcW w:type="dxa" w:w="2636"/>
+          </w:tcPr>
+          <w:p>
+            <w:pPr>
+              <w:pStyle w:val="Compact"/>
+              <w:jc w:val="left"/>
+            </w:pPr>
+            <w:r>
+              <w:t xml:space="preserve">20.3 (12.4–28.6)</w:t>
+            </w:r>
+          </w:p>
+        </w:tc>
+        <w:tc>
+          <w:tcPr>
+            <w:tcW w:type="dxa" w:w="2636"/>
+          </w:tcPr>
+          <w:p>
+            <w:pPr>
+              <w:pStyle w:val="Compact"/>
+              <w:jc w:val="left"/>
+            </w:pPr>
+            <w:r>
+              <w:t xml:space="preserve">6.0 (2.9–9.3)</w:t>
+            </w:r>
+          </w:p>
+        </w:tc>
+      </w:tr>
+      <w:tr>
+        <w:tc>
+          <w:tcPr>
+            <w:tcW w:type="dxa" w:w="3796"/>
+          </w:tcPr>
+          <w:p>
+            <w:pPr>
+              <w:pStyle w:val="Compact"/>
+              <w:jc w:val="left"/>
+            </w:pPr>
+            <w:r>
+              <w:t xml:space="preserve">Zero-sum,</w:t>
+            </w:r>
+            <w:r>
+              <w:t xml:space="preserve"> </w:t>
+            </w:r>
+            <m:oMath>
+              <m:r>
+                <m:t>Σ</m:t>
+              </m:r>
+            </m:oMath>
+            <w:r>
+              <w:t xml:space="preserve"> </w:t>
+            </w:r>
+            <w:r>
+              <w:t xml:space="preserve">= identity matrix</w:t>
+            </w:r>
+          </w:p>
+        </w:tc>
+        <w:tc>
+          <w:tcPr>
+            <w:tcW w:type="dxa" w:w="2636"/>
+          </w:tcPr>
+          <w:p>
+            <w:pPr>
+              <w:pStyle w:val="Compact"/>
+              <w:jc w:val="left"/>
+            </w:pPr>
+            <w:r>
+              <w:t xml:space="preserve">12.3 (6.1–20.2)</w:t>
+            </w:r>
+          </w:p>
+        </w:tc>
+        <w:tc>
+          <w:tcPr>
+            <w:tcW w:type="dxa" w:w="2636"/>
+          </w:tcPr>
+          <w:p>
+            <w:pPr>
+              <w:pStyle w:val="Compact"/>
+              <w:jc w:val="left"/>
+            </w:pPr>
+            <w:r>
+              <w:t xml:space="preserve">13.0 (7.1–19.0)</w:t>
+            </w:r>
+          </w:p>
+        </w:tc>
+      </w:tr>
+      <w:tr>
+        <w:tc>
+          <w:tcPr>
+            <w:tcW w:type="dxa" w:w="3796"/>
+          </w:tcPr>
+          <w:p>
+            <w:pPr>
+              <w:pStyle w:val="Compact"/>
+              <w:jc w:val="left"/>
+            </w:pPr>
+            <w:r>
+              <w:t xml:space="preserve">Mean weight of the calibration runs</w:t>
+            </w:r>
+          </w:p>
+        </w:tc>
+        <w:tc>
+          <w:tcPr>
+            <w:tcW w:type="dxa" w:w="2636"/>
+          </w:tcPr>
+          <w:p>
+            <w:pPr>
+              <w:pStyle w:val="Compact"/>
+              <w:jc w:val="left"/>
+            </w:pPr>
+            <w:r>
+              <w:t xml:space="preserve">2.0 (1.9–2.0)</w:t>
+            </w:r>
+          </w:p>
+        </w:tc>
+        <w:tc>
+          <w:tcPr>
+            <w:tcW w:type="dxa" w:w="2636"/>
+          </w:tcPr>
+          <w:p>
+            <w:pPr>
+              <w:pStyle w:val="Compact"/>
+              <w:jc w:val="left"/>
+            </w:pPr>
+            <w:r>
+              <w:t xml:space="preserve">2.2 (1.1–3.5)</w:t>
             </w:r>
           </w:p>
         </w:tc>
@@ -15785,21 +14940,7 @@
         <w:pStyle w:val="BodyText"/>
       </w:pPr>
       <w:r>
-        <w:t xml:space="preserve">Four kinds of estimator were compared by leave-one-run-out cross-validation: single gauges, the gauge average, GLS (Eq. 13) and the zero-sum estimator (Eq. 14). In each fold the constants were calibrated without the test run, and</w:t>
-      </w:r>
-      <w:r>
-        <w:t xml:space="preserve"> </w:t>
-      </w:r>
-      <m:oMath>
-        <m:r>
-          <m:t>Σ</m:t>
-        </m:r>
-      </m:oMath>
-      <w:r>
-        <w:t xml:space="preserve"> </w:t>
-      </w:r>
-      <w:r>
-        <w:t xml:space="preserve">was estimated from vehicle-free windows only. Leave-one-truck-out (LOTO) results, calibrated on one truck and tested on the other, are given as well (Table 6, Fig. 7).</w:t>
+        <w:t xml:space="preserve">On day 2, GLS with the measured covariance was worse than the gauge average: 20.4 % against 11.9 % MAE. The paired difference is +8.5 points (95 % CI +2.3 to +15.1), so GLS and the zero-sum estimator are both significantly worse than the average. On day 1 the estimators cannot be told apart, and on both days every estimator is worse than the mean-weight predictor.</w:t>
       </w:r>
     </w:p>
     <w:p>
@@ -15807,767 +14948,7 @@
         <w:pStyle w:val="BodyText"/>
       </w:pPr>
       <w:r>
-        <w:rPr>
-          <w:bCs/>
-          <w:b/>
-        </w:rPr>
-        <w:t xml:space="preserve">Table 6.</w:t>
-      </w:r>
-      <w:r>
-        <w:t xml:space="preserve"> </w:t>
-      </w:r>
-      <w:r>
-        <w:t xml:space="preserve">Mean absolute error of the gross weight (% of GVW), out of sample, with 95 % bootstrap CIs over the test runs (n = 8 on day 2, n = 7 on day 1). LOTO: calibrated on one truck, tested on the other.</w:t>
-      </w:r>
-    </w:p>
-    <w:tbl>
-      <w:tblPr>
-        <w:tblStyle w:val="Table"/>
-        <w:tblW w:type="pct" w:w="5000"/>
-        <w:tblLook w:firstRow="1" w:lastRow="0" w:firstColumn="0" w:lastColumn="0" w:noHBand="0" w:noVBand="0" w:val="0020"/>
-        <w:jc w:val="start"/>
-        <w:tblBorders>
-          <w:top w:val="single" w:sz="8" w:space="0" w:color="000000"/>
-          <w:left w:val="nil"/>
-          <w:bottom w:val="single" w:sz="8" w:space="0" w:color="000000"/>
-          <w:right w:val="nil"/>
-          <w:insideH w:val="nil"/>
-          <w:insideV w:val="nil"/>
-        </w:tblBorders>
-      </w:tblPr>
-      <w:tblGrid>
-        <w:gridCol w:w="2292"/>
-        <w:gridCol w:w="2356"/>
-        <w:gridCol w:w="840"/>
-        <w:gridCol w:w="1592"/>
-        <w:gridCol w:w="1987"/>
-      </w:tblGrid>
-      <w:tr>
-        <w:trPr>
-          <w:tblHeader w:val="true"/>
-        </w:trPr>
-        <w:tc>
-          <w:tcPr>
-            <w:tcW w:type="dxa" w:w="2292"/>
-            <w:tcBorders>
-              <w:top w:val="nil"/>
-              <w:left w:val="nil"/>
-              <w:bottom w:val="single" w:sz="6" w:space="0" w:color="000000"/>
-              <w:right w:val="nil"/>
-            </w:tcBorders>
-          </w:tcPr>
-          <w:p>
-            <w:pPr>
-              <w:pStyle w:val="Compact"/>
-              <w:jc w:val="left"/>
-            </w:pPr>
-            <w:r>
-              <w:t xml:space="preserve">Estimator</w:t>
-            </w:r>
-          </w:p>
-        </w:tc>
-        <w:tc>
-          <w:tcPr>
-            <w:tcW w:type="dxa" w:w="2356"/>
-            <w:tcBorders>
-              <w:top w:val="nil"/>
-              <w:left w:val="nil"/>
-              <w:bottom w:val="single" w:sz="6" w:space="0" w:color="000000"/>
-              <w:right w:val="nil"/>
-            </w:tcBorders>
-          </w:tcPr>
-          <w:p>
-            <w:pPr>
-              <w:pStyle w:val="Compact"/>
-              <w:jc w:val="left"/>
-            </w:pPr>
-            <w:r>
-              <w:t xml:space="preserve">Day 2, leave-one-run-out</w:t>
-            </w:r>
-          </w:p>
-        </w:tc>
-        <w:tc>
-          <w:tcPr>
-            <w:tcW w:type="dxa" w:w="840"/>
-            <w:tcBorders>
-              <w:top w:val="nil"/>
-              <w:left w:val="nil"/>
-              <w:bottom w:val="single" w:sz="6" w:space="0" w:color="000000"/>
-              <w:right w:val="nil"/>
-            </w:tcBorders>
-          </w:tcPr>
-          <w:p>
-            <w:pPr>
-              <w:pStyle w:val="Compact"/>
-              <w:jc w:val="left"/>
-            </w:pPr>
-            <w:r>
-              <w:t xml:space="preserve">Day 2, LOTO</w:t>
-            </w:r>
-          </w:p>
-        </w:tc>
-        <w:tc>
-          <w:tcPr>
-            <w:tcW w:type="dxa" w:w="1592"/>
-            <w:tcBorders>
-              <w:top w:val="nil"/>
-              <w:left w:val="nil"/>
-              <w:bottom w:val="single" w:sz="6" w:space="0" w:color="000000"/>
-              <w:right w:val="nil"/>
-            </w:tcBorders>
-          </w:tcPr>
-          <w:p>
-            <w:pPr>
-              <w:pStyle w:val="Compact"/>
-              <w:jc w:val="left"/>
-            </w:pPr>
-            <w:r>
-              <w:t xml:space="preserve">Day 1, 12 gauges</w:t>
-            </w:r>
-          </w:p>
-        </w:tc>
-        <w:tc>
-          <w:tcPr>
-            <w:tcW w:type="dxa" w:w="1987"/>
-            <w:tcBorders>
-              <w:top w:val="nil"/>
-              <w:left w:val="nil"/>
-              <w:bottom w:val="single" w:sz="6" w:space="0" w:color="000000"/>
-              <w:right w:val="nil"/>
-            </w:tcBorders>
-          </w:tcPr>
-          <w:p>
-            <w:pPr>
-              <w:pStyle w:val="Compact"/>
-              <w:jc w:val="left"/>
-            </w:pPr>
-            <w:r>
-              <w:t xml:space="preserve">Day 1, 4 wheel-path gauges</w:t>
-            </w:r>
-          </w:p>
-        </w:tc>
-      </w:tr>
-      <w:tr>
-        <w:tc>
-          <w:tcPr>
-            <w:tcW w:type="dxa" w:w="2292"/>
-          </w:tcPr>
-          <w:p>
-            <w:pPr>
-              <w:pStyle w:val="Compact"/>
-              <w:jc w:val="left"/>
-            </w:pPr>
-            <w:r>
-              <w:t xml:space="preserve">Best single gauge (chosen after the fact)</w:t>
-            </w:r>
-          </w:p>
-        </w:tc>
-        <w:tc>
-          <w:tcPr>
-            <w:tcW w:type="dxa" w:w="2356"/>
-          </w:tcPr>
-          <w:p>
-            <w:pPr>
-              <w:pStyle w:val="Compact"/>
-              <w:jc w:val="left"/>
-            </w:pPr>
-            <w:r>
-              <w:t xml:space="preserve">8.4 (2.9–15.3)</w:t>
-            </w:r>
-          </w:p>
-        </w:tc>
-        <w:tc>
-          <w:tcPr>
-            <w:tcW w:type="dxa" w:w="840"/>
-          </w:tcPr>
-          <w:p>
-            <w:pPr>
-              <w:pStyle w:val="Compact"/>
-              <w:jc w:val="left"/>
-            </w:pPr>
-            <w:r>
-              <w:t xml:space="preserve">7.6</w:t>
-            </w:r>
-          </w:p>
-        </w:tc>
-        <w:tc>
-          <w:tcPr>
-            <w:tcW w:type="dxa" w:w="1592"/>
-          </w:tcPr>
-          <w:p>
-            <w:pPr>
-              <w:pStyle w:val="Compact"/>
-              <w:jc w:val="left"/>
-            </w:pPr>
-            <w:r>
-              <w:t xml:space="preserve">4.8 (1.8–7.9)</w:t>
-            </w:r>
-          </w:p>
-        </w:tc>
-        <w:tc>
-          <w:tcPr>
-            <w:tcW w:type="dxa" w:w="1987"/>
-          </w:tcPr>
-          <w:p>
-            <w:pPr>
-              <w:pStyle w:val="Compact"/>
-              <w:jc w:val="left"/>
-            </w:pPr>
-            <w:r>
-              <w:t xml:space="preserve">4.8 (1.8–7.9)</w:t>
-            </w:r>
-          </w:p>
-        </w:tc>
-      </w:tr>
-      <w:tr>
-        <w:tc>
-          <w:tcPr>
-            <w:tcW w:type="dxa" w:w="2292"/>
-          </w:tcPr>
-          <w:p>
-            <w:pPr>
-              <w:pStyle w:val="Compact"/>
-              <w:jc w:val="left"/>
-            </w:pPr>
-            <w:r>
-              <w:t xml:space="preserve">Worst single gauge</w:t>
-            </w:r>
-          </w:p>
-        </w:tc>
-        <w:tc>
-          <w:tcPr>
-            <w:tcW w:type="dxa" w:w="2356"/>
-          </w:tcPr>
-          <w:p>
-            <w:pPr>
-              <w:pStyle w:val="Compact"/>
-              <w:jc w:val="left"/>
-            </w:pPr>
-            <w:r>
-              <w:t xml:space="preserve">27.9 (12.9–44.5)</w:t>
-            </w:r>
-          </w:p>
-        </w:tc>
-        <w:tc>
-          <w:tcPr>
-            <w:tcW w:type="dxa" w:w="840"/>
-          </w:tcPr>
-          <w:p>
-            <w:pPr>
-              <w:pStyle w:val="Compact"/>
-              <w:jc w:val="left"/>
-            </w:pPr>
-            <w:r>
-              <w:t xml:space="preserve">24.3</w:t>
-            </w:r>
-          </w:p>
-        </w:tc>
-        <w:tc>
-          <w:tcPr>
-            <w:tcW w:type="dxa" w:w="1592"/>
-          </w:tcPr>
-          <w:p>
-            <w:pPr>
-              <w:pStyle w:val="Compact"/>
-              <w:jc w:val="left"/>
-            </w:pPr>
-            <w:r>
-              <w:t xml:space="preserve">17.6 (11.0–23.4)</w:t>
-            </w:r>
-          </w:p>
-        </w:tc>
-        <w:tc>
-          <w:tcPr>
-            <w:tcW w:type="dxa" w:w="1987"/>
-          </w:tcPr>
-          <w:p>
-            <w:pPr>
-              <w:pStyle w:val="Compact"/>
-              <w:jc w:val="left"/>
-            </w:pPr>
-            <w:r>
-              <w:t xml:space="preserve">12.1</w:t>
-            </w:r>
-          </w:p>
-        </w:tc>
-      </w:tr>
-      <w:tr>
-        <w:tc>
-          <w:tcPr>
-            <w:tcW w:type="dxa" w:w="2292"/>
-          </w:tcPr>
-          <w:p>
-            <w:pPr>
-              <w:pStyle w:val="Compact"/>
-              <w:jc w:val="left"/>
-            </w:pPr>
-            <w:r>
-              <w:t xml:space="preserve">Gauge average</w:t>
-            </w:r>
-          </w:p>
-        </w:tc>
-        <w:tc>
-          <w:tcPr>
-            <w:tcW w:type="dxa" w:w="2356"/>
-          </w:tcPr>
-          <w:p>
-            <w:pPr>
-              <w:pStyle w:val="Compact"/>
-              <w:jc w:val="left"/>
-            </w:pPr>
-            <w:r>
-              <w:t xml:space="preserve">11.9 (6.0–18.6)</w:t>
-            </w:r>
-          </w:p>
-        </w:tc>
-        <w:tc>
-          <w:tcPr>
-            <w:tcW w:type="dxa" w:w="840"/>
-          </w:tcPr>
-          <w:p>
-            <w:pPr>
-              <w:pStyle w:val="Compact"/>
-              <w:jc w:val="left"/>
-            </w:pPr>
-            <w:r>
-              <w:t xml:space="preserve">11.1</w:t>
-            </w:r>
-          </w:p>
-        </w:tc>
-        <w:tc>
-          <w:tcPr>
-            <w:tcW w:type="dxa" w:w="1592"/>
-          </w:tcPr>
-          <w:p>
-            <w:pPr>
-              <w:pStyle w:val="Compact"/>
-              <w:jc w:val="left"/>
-            </w:pPr>
-            <w:r>
-              <w:t xml:space="preserve">5.3 (2.5–7.8)</w:t>
-            </w:r>
-          </w:p>
-        </w:tc>
-        <w:tc>
-          <w:tcPr>
-            <w:tcW w:type="dxa" w:w="1987"/>
-          </w:tcPr>
-          <w:p>
-            <w:pPr>
-              <w:pStyle w:val="Compact"/>
-              <w:jc w:val="left"/>
-            </w:pPr>
-            <w:r>
-              <w:t xml:space="preserve">5.4 (3.3–7.4)</w:t>
-            </w:r>
-          </w:p>
-        </w:tc>
-      </w:tr>
-      <w:tr>
-        <w:tc>
-          <w:tcPr>
-            <w:tcW w:type="dxa" w:w="2292"/>
-          </w:tcPr>
-          <w:p>
-            <w:pPr>
-              <w:pStyle w:val="Compact"/>
-              <w:jc w:val="left"/>
-            </w:pPr>
-            <w:r>
-              <w:t xml:space="preserve">GLS, diagonal</w:t>
-            </w:r>
-            <w:r>
-              <w:t xml:space="preserve"> </w:t>
-            </w:r>
-            <m:oMath>
-              <m:r>
-                <m:t>Σ</m:t>
-              </m:r>
-            </m:oMath>
-          </w:p>
-        </w:tc>
-        <w:tc>
-          <w:tcPr>
-            <w:tcW w:type="dxa" w:w="2356"/>
-          </w:tcPr>
-          <w:p>
-            <w:pPr>
-              <w:pStyle w:val="Compact"/>
-              <w:jc w:val="left"/>
-            </w:pPr>
-            <w:r>
-              <w:t xml:space="preserve">11.4 (6.0–18.0)</w:t>
-            </w:r>
-          </w:p>
-        </w:tc>
-        <w:tc>
-          <w:tcPr>
-            <w:tcW w:type="dxa" w:w="840"/>
-          </w:tcPr>
-          <w:p>
-            <w:pPr>
-              <w:pStyle w:val="Compact"/>
-              <w:jc w:val="left"/>
-            </w:pPr>
-            <w:r>
-              <w:t xml:space="preserve">10.8</w:t>
-            </w:r>
-          </w:p>
-        </w:tc>
-        <w:tc>
-          <w:tcPr>
-            <w:tcW w:type="dxa" w:w="1592"/>
-          </w:tcPr>
-          <w:p>
-            <w:pPr>
-              <w:pStyle w:val="Compact"/>
-              <w:jc w:val="left"/>
-            </w:pPr>
-            <w:r>
-              <w:t xml:space="preserve">5.3 (2.5–8.0)</w:t>
-            </w:r>
-          </w:p>
-        </w:tc>
-        <w:tc>
-          <w:tcPr>
-            <w:tcW w:type="dxa" w:w="1987"/>
-          </w:tcPr>
-          <w:p>
-            <w:pPr>
-              <w:pStyle w:val="Compact"/>
-              <w:jc w:val="left"/>
-            </w:pPr>
-            <w:r>
-              <w:t xml:space="preserve">5.2 (3.3–7.1)</w:t>
-            </w:r>
-          </w:p>
-        </w:tc>
-      </w:tr>
-      <w:tr>
-        <w:tc>
-          <w:tcPr>
-            <w:tcW w:type="dxa" w:w="2292"/>
-          </w:tcPr>
-          <w:p>
-            <w:pPr>
-              <w:pStyle w:val="Compact"/>
-              <w:jc w:val="left"/>
-            </w:pPr>
-            <w:r>
-              <w:t xml:space="preserve">GLS, measured</w:t>
-            </w:r>
-            <w:r>
-              <w:t xml:space="preserve"> </w:t>
-            </w:r>
-            <m:oMath>
-              <m:r>
-                <m:t>Σ</m:t>
-              </m:r>
-            </m:oMath>
-          </w:p>
-        </w:tc>
-        <w:tc>
-          <w:tcPr>
-            <w:tcW w:type="dxa" w:w="2356"/>
-          </w:tcPr>
-          <w:p>
-            <w:pPr>
-              <w:pStyle w:val="Compact"/>
-              <w:jc w:val="left"/>
-            </w:pPr>
-            <w:r>
-              <w:t xml:space="preserve">20.4 (12.3–28.8)</w:t>
-            </w:r>
-          </w:p>
-        </w:tc>
-        <w:tc>
-          <w:tcPr>
-            <w:tcW w:type="dxa" w:w="840"/>
-          </w:tcPr>
-          <w:p>
-            <w:pPr>
-              <w:pStyle w:val="Compact"/>
-              <w:jc w:val="left"/>
-            </w:pPr>
-            <w:r>
-              <w:t xml:space="preserve">17.7</w:t>
-            </w:r>
-          </w:p>
-        </w:tc>
-        <w:tc>
-          <w:tcPr>
-            <w:tcW w:type="dxa" w:w="1592"/>
-          </w:tcPr>
-          <w:p>
-            <w:pPr>
-              <w:pStyle w:val="Compact"/>
-              <w:jc w:val="left"/>
-            </w:pPr>
-            <w:r>
-              <w:t xml:space="preserve">5.8 (3.5–8.1)</w:t>
-            </w:r>
-          </w:p>
-        </w:tc>
-        <w:tc>
-          <w:tcPr>
-            <w:tcW w:type="dxa" w:w="1987"/>
-          </w:tcPr>
-          <w:p>
-            <w:pPr>
-              <w:pStyle w:val="Compact"/>
-              <w:jc w:val="left"/>
-            </w:pPr>
-            <w:r>
-              <w:t xml:space="preserve">4.9 (3.0–6.9)</w:t>
-            </w:r>
-          </w:p>
-        </w:tc>
-      </w:tr>
-      <w:tr>
-        <w:tc>
-          <w:tcPr>
-            <w:tcW w:type="dxa" w:w="2292"/>
-          </w:tcPr>
-          <w:p>
-            <w:pPr>
-              <w:pStyle w:val="Compact"/>
-              <w:jc w:val="left"/>
-            </w:pPr>
-            <w:r>
-              <w:t xml:space="preserve">Zero-sum, measured</w:t>
-            </w:r>
-            <w:r>
-              <w:t xml:space="preserve"> </w:t>
-            </w:r>
-            <m:oMath>
-              <m:r>
-                <m:t>Σ</m:t>
-              </m:r>
-            </m:oMath>
-          </w:p>
-        </w:tc>
-        <w:tc>
-          <w:tcPr>
-            <w:tcW w:type="dxa" w:w="2356"/>
-          </w:tcPr>
-          <w:p>
-            <w:pPr>
-              <w:pStyle w:val="Compact"/>
-              <w:jc w:val="left"/>
-            </w:pPr>
-            <w:r>
-              <w:t xml:space="preserve">20.3 (12.4–28.6)</w:t>
-            </w:r>
-          </w:p>
-        </w:tc>
-        <w:tc>
-          <w:tcPr>
-            <w:tcW w:type="dxa" w:w="840"/>
-          </w:tcPr>
-          <w:p>
-            <w:pPr>
-              <w:pStyle w:val="Compact"/>
-              <w:jc w:val="left"/>
-            </w:pPr>
-            <w:r>
-              <w:t xml:space="preserve">18.0</w:t>
-            </w:r>
-          </w:p>
-        </w:tc>
-        <w:tc>
-          <w:tcPr>
-            <w:tcW w:type="dxa" w:w="1592"/>
-          </w:tcPr>
-          <w:p>
-            <w:pPr>
-              <w:pStyle w:val="Compact"/>
-              <w:jc w:val="left"/>
-            </w:pPr>
-            <w:r>
-              <w:t xml:space="preserve">6.0 (2.9–9.3)</w:t>
-            </w:r>
-          </w:p>
-        </w:tc>
-        <w:tc>
-          <w:tcPr>
-            <w:tcW w:type="dxa" w:w="1987"/>
-          </w:tcPr>
-          <w:p>
-            <w:pPr>
-              <w:pStyle w:val="Compact"/>
-              <w:jc w:val="left"/>
-            </w:pPr>
-            <w:r>
-              <w:t xml:space="preserve">8.3 (3.9–13.4)</w:t>
-            </w:r>
-          </w:p>
-        </w:tc>
-      </w:tr>
-      <w:tr>
-        <w:tc>
-          <w:tcPr>
-            <w:tcW w:type="dxa" w:w="2292"/>
-          </w:tcPr>
-          <w:p>
-            <w:pPr>
-              <w:pStyle w:val="Compact"/>
-              <w:jc w:val="left"/>
-            </w:pPr>
-            <w:r>
-              <w:t xml:space="preserve">Zero-sum,</w:t>
-            </w:r>
-            <w:r>
-              <w:t xml:space="preserve"> </w:t>
-            </w:r>
-            <m:oMath>
-              <m:r>
-                <m:t>Σ</m:t>
-              </m:r>
-            </m:oMath>
-            <w:r>
-              <w:t xml:space="preserve"> </w:t>
-            </w:r>
-            <w:r>
-              <w:t xml:space="preserve">= identity matrix</w:t>
-            </w:r>
-          </w:p>
-        </w:tc>
-        <w:tc>
-          <w:tcPr>
-            <w:tcW w:type="dxa" w:w="2356"/>
-          </w:tcPr>
-          <w:p>
-            <w:pPr>
-              <w:pStyle w:val="Compact"/>
-              <w:jc w:val="left"/>
-            </w:pPr>
-            <w:r>
-              <w:t xml:space="preserve">12.3 (6.1–20.2)</w:t>
-            </w:r>
-          </w:p>
-        </w:tc>
-        <w:tc>
-          <w:tcPr>
-            <w:tcW w:type="dxa" w:w="840"/>
-          </w:tcPr>
-          <w:p>
-            <w:pPr>
-              <w:pStyle w:val="Compact"/>
-              <w:jc w:val="left"/>
-            </w:pPr>
-            <w:r>
-              <w:t xml:space="preserve">10.8</w:t>
-            </w:r>
-          </w:p>
-        </w:tc>
-        <w:tc>
-          <w:tcPr>
-            <w:tcW w:type="dxa" w:w="1592"/>
-          </w:tcPr>
-          <w:p>
-            <w:pPr>
-              <w:pStyle w:val="Compact"/>
-              <w:jc w:val="left"/>
-            </w:pPr>
-            <w:r>
-              <w:t xml:space="preserve">13.0 (7.1–19.0)</w:t>
-            </w:r>
-          </w:p>
-        </w:tc>
-        <w:tc>
-          <w:tcPr>
-            <w:tcW w:type="dxa" w:w="1987"/>
-          </w:tcPr>
-          <w:p>
-            <w:pPr>
-              <w:pStyle w:val="Compact"/>
-              <w:jc w:val="left"/>
-            </w:pPr>
-            <w:r>
-              <w:t xml:space="preserve">8.4 (4.6–12.9)</w:t>
-            </w:r>
-          </w:p>
-        </w:tc>
-      </w:tr>
-      <w:tr>
-        <w:tc>
-          <w:tcPr>
-            <w:tcW w:type="dxa" w:w="2292"/>
-          </w:tcPr>
-          <w:p>
-            <w:pPr>
-              <w:pStyle w:val="Compact"/>
-              <w:jc w:val="left"/>
-            </w:pPr>
-            <w:r>
-              <w:t xml:space="preserve">Mean weight of the calibration runs</w:t>
-            </w:r>
-          </w:p>
-        </w:tc>
-        <w:tc>
-          <w:tcPr>
-            <w:tcW w:type="dxa" w:w="2356"/>
-          </w:tcPr>
-          <w:p>
-            <w:pPr>
-              <w:pStyle w:val="Compact"/>
-              <w:jc w:val="left"/>
-            </w:pPr>
-            <w:r>
-              <w:t xml:space="preserve">2.0 (1.9–2.0)</w:t>
-            </w:r>
-          </w:p>
-        </w:tc>
-        <w:tc>
-          <w:tcPr>
-            <w:tcW w:type="dxa" w:w="840"/>
-          </w:tcPr>
-          <w:p>
-            <w:pPr>
-              <w:pStyle w:val="Compact"/>
-              <w:jc w:val="left"/>
-            </w:pPr>
-            <w:r>
-              <w:t xml:space="preserve">3.4</w:t>
-            </w:r>
-          </w:p>
-        </w:tc>
-        <w:tc>
-          <w:tcPr>
-            <w:tcW w:type="dxa" w:w="1592"/>
-          </w:tcPr>
-          <w:p>
-            <w:pPr>
-              <w:pStyle w:val="Compact"/>
-              <w:jc w:val="left"/>
-            </w:pPr>
-            <w:r>
-              <w:t xml:space="preserve">2.2 (1.1–3.5)</w:t>
-            </w:r>
-          </w:p>
-        </w:tc>
-        <w:tc>
-          <w:tcPr>
-            <w:tcW w:type="dxa" w:w="1987"/>
-          </w:tcPr>
-          <w:p>
-            <w:pPr>
-              <w:pStyle w:val="Compact"/>
-              <w:jc w:val="left"/>
-            </w:pPr>
-            <w:r>
-              <w:t xml:space="preserve">2.2 (1.1–3.5)</w:t>
-            </w:r>
-          </w:p>
-        </w:tc>
-      </w:tr>
-    </w:tbl>
-    <w:p>
-      <w:pPr>
-        <w:pStyle w:val="BodyText"/>
-      </w:pPr>
-      <w:r>
-        <w:t xml:space="preserve">On day 2, GLS with the measured covariance was worse than the gauge average: 20.4 % against 11.9 % MAE (Table 6). The paired difference is +8.5 points (95 % CI +2.3 to +15.1), so GLS and the zero-sum estimator are both significantly worse than the average. The vehicle-free noise model had predicted the opposite order (Table 7). On day 1 the estimators cannot be told apart. On both days every estimator is worse than the mean-weight predictor.</w:t>
+        <w:t xml:space="preserve">The failure on day 2 is itself a finding. The vehicle-free noise of the four channels is strongly common-mode, but the crossing residuals are much less correlated between gauges: 0.63 against 0.90 for vehicle-free noise at the same window length. The vehicle-free covariance therefore predicted GLS to beat the average, whereas the covariance of the crossing residuals predicts the observed reverse order (Supplementary Table S4).</w:t>
       </w:r>
     </w:p>
     <w:p>
@@ -16575,7 +14956,25 @@
         <w:pStyle w:val="BodyText"/>
       </w:pPr>
       <w:r>
-        <w:t xml:space="preserve">The failure on day 2 is itself a finding: crossing residuals are much less correlated between gauges than the vehicle-free noise, 0.63 against 0.90 at the same window length (Table 5). With the covariance of the crossing residuals, the predicted order reverses, and GLS is expected to be worse than the average, as observed (Table 7).</w:t>
+        <w:t xml:space="preserve">Each crossing thus carries a gauge-specific component, plausibly from the wheel path and local slab action, and GLS amplifies it by giving st40 and st36 large weights of opposite sign. As anticipated in Section 2.4, the zero-sum estimator helps only when the disturbance is common-mode during the crossings themselves.</w:t>
+      </w:r>
+    </w:p>
+    <w:bookmarkEnd w:id="32"/>
+    <w:bookmarkStart w:id="33" w:name="what-the-field-records-show"/>
+    <w:p>
+      <w:pPr>
+        <w:pStyle w:val="Heading3"/>
+      </w:pPr>
+      <w:r>
+        <w:t xml:space="preserve">4.4. What the field records show</w:t>
+      </w:r>
+    </w:p>
+    <w:p>
+      <w:pPr>
+        <w:pStyle w:val="FirstParagraph"/>
+      </w:pPr>
+      <w:r>
+        <w:t xml:space="preserve">The records support linearity, superposition and per-gauge invariance within the 10–27 % that the noise allows, and they show that each lane, and each deck gauge, needs its own constant. They cannot show weight discrimination, because the reference weights hardly vary. They show no benefit from GLS or zero-sum combinations, because the common-mode assumption behind Eq. (14) holds for vehicle-free noise but not for crossing residuals.</w:t>
       </w:r>
     </w:p>
     <w:p>
@@ -16583,251 +14982,60 @@
         <w:pStyle w:val="BodyText"/>
       </w:pPr>
       <w:r>
-        <w:rPr>
-          <w:bCs/>
-          <w:b/>
-        </w:rPr>
-        <w:t xml:space="preserve">Table 7.</w:t>
-      </w:r>
-      <w:r>
-        <w:t xml:space="preserve"> </w:t>
-      </w:r>
-      <w:r>
-        <w:t xml:space="preserve">Day 2: per-crossing standard deviation (SD) of the gross weight predicted by two covariance models, and the observed error (% of GVW). SD and MAE are different measures; the table compares the order of the two estimators, not magnitudes.</w:t>
+        <w:t xml:space="preserve">The tests rest on four trucks, two axle counts and seven or eight runs per day. The gauge calibration factors and exact positions are not published, so absolute constants cannot be checked. The GVW accuracy that the dataset authors reported for their influence-line system on this bridge [41–43] was not compared [NEED VALUE: GVW accuracy reported in [41–43] for the same runs, if the authors wish to add it].</w:t>
       </w:r>
     </w:p>
-    <w:tbl>
-      <w:tblPr>
-        <w:tblStyle w:val="Table"/>
-        <w:tblW w:type="pct" w:w="5000"/>
-        <w:tblLook w:firstRow="1" w:lastRow="0" w:firstColumn="0" w:lastColumn="0" w:noHBand="0" w:noVBand="0" w:val="0020"/>
-        <w:jc w:val="start"/>
-        <w:tblBorders>
-          <w:top w:val="single" w:sz="8" w:space="0" w:color="000000"/>
-          <w:left w:val="nil"/>
-          <w:bottom w:val="single" w:sz="8" w:space="0" w:color="000000"/>
-          <w:right w:val="nil"/>
-          <w:insideH w:val="nil"/>
-          <w:insideV w:val="nil"/>
-        </w:tblBorders>
-      </w:tblPr>
-      <w:tblGrid>
-        <w:gridCol w:w="4597"/>
-        <w:gridCol w:w="2360"/>
-        <w:gridCol w:w="2112"/>
-      </w:tblGrid>
-      <w:tr>
-        <w:trPr>
-          <w:tblHeader w:val="true"/>
-        </w:trPr>
-        <w:tc>
-          <w:tcPr>
-            <w:tcW w:type="dxa" w:w="4597"/>
-            <w:tcBorders>
-              <w:top w:val="nil"/>
-              <w:left w:val="nil"/>
-              <w:bottom w:val="single" w:sz="6" w:space="0" w:color="000000"/>
-              <w:right w:val="nil"/>
-            </w:tcBorders>
-          </w:tcPr>
-          <w:p>
-            <w:pPr>
-              <w:pStyle w:val="Compact"/>
-              <w:jc w:val="left"/>
-            </w:pPr>
-            <w:r>
-              <w:t xml:space="preserve">Quantity</w:t>
-            </w:r>
-          </w:p>
-        </w:tc>
-        <w:tc>
-          <w:tcPr>
-            <w:tcW w:type="dxa" w:w="2360"/>
-            <w:tcBorders>
-              <w:top w:val="nil"/>
-              <w:left w:val="nil"/>
-              <w:bottom w:val="single" w:sz="6" w:space="0" w:color="000000"/>
-              <w:right w:val="nil"/>
-            </w:tcBorders>
-          </w:tcPr>
-          <w:p>
-            <w:pPr>
-              <w:pStyle w:val="Compact"/>
-              <w:jc w:val="left"/>
-            </w:pPr>
-            <w:r>
-              <w:t xml:space="preserve">GLS, measured</w:t>
-            </w:r>
-            <w:r>
-              <w:t xml:space="preserve"> </w:t>
-            </w:r>
-            <m:oMath>
-              <m:r>
-                <m:t>Σ</m:t>
-              </m:r>
-            </m:oMath>
-          </w:p>
-        </w:tc>
-        <w:tc>
-          <w:tcPr>
-            <w:tcW w:type="dxa" w:w="2112"/>
-            <w:tcBorders>
-              <w:top w:val="nil"/>
-              <w:left w:val="nil"/>
-              <w:bottom w:val="single" w:sz="6" w:space="0" w:color="000000"/>
-              <w:right w:val="nil"/>
-            </w:tcBorders>
-          </w:tcPr>
-          <w:p>
-            <w:pPr>
-              <w:pStyle w:val="Compact"/>
-              <w:jc w:val="left"/>
-            </w:pPr>
-            <w:r>
-              <w:t xml:space="preserve">Gauge average</w:t>
-            </w:r>
-          </w:p>
-        </w:tc>
-      </w:tr>
-      <w:tr>
-        <w:tc>
-          <w:tcPr>
-            <w:tcW w:type="dxa" w:w="4597"/>
-          </w:tcPr>
-          <w:p>
-            <w:pPr>
-              <w:pStyle w:val="Compact"/>
-              <w:jc w:val="left"/>
-            </w:pPr>
-            <w:r>
-              <w:t xml:space="preserve">SD predicted from the vehicle-free covariance</w:t>
-            </w:r>
-          </w:p>
-        </w:tc>
-        <w:tc>
-          <w:tcPr>
-            <w:tcW w:type="dxa" w:w="2360"/>
-          </w:tcPr>
-          <w:p>
-            <w:pPr>
-              <w:pStyle w:val="Compact"/>
-              <w:jc w:val="left"/>
-            </w:pPr>
-            <w:r>
-              <w:t xml:space="preserve">12.7</w:t>
-            </w:r>
-          </w:p>
-        </w:tc>
-        <w:tc>
-          <w:tcPr>
-            <w:tcW w:type="dxa" w:w="2112"/>
-          </w:tcPr>
-          <w:p>
-            <w:pPr>
-              <w:pStyle w:val="Compact"/>
-              <w:jc w:val="left"/>
-            </w:pPr>
-            <w:r>
-              <w:t xml:space="preserve">19.8</w:t>
-            </w:r>
-          </w:p>
-        </w:tc>
-      </w:tr>
-      <w:tr>
-        <w:tc>
-          <w:tcPr>
-            <w:tcW w:type="dxa" w:w="4597"/>
-          </w:tcPr>
-          <w:p>
-            <w:pPr>
-              <w:pStyle w:val="Compact"/>
-              <w:jc w:val="left"/>
-            </w:pPr>
-            <w:r>
-              <w:t xml:space="preserve">SD predicted from the covariance of the crossing residuals</w:t>
-            </w:r>
-          </w:p>
-        </w:tc>
-        <w:tc>
-          <w:tcPr>
-            <w:tcW w:type="dxa" w:w="2360"/>
-          </w:tcPr>
-          <w:p>
-            <w:pPr>
-              <w:pStyle w:val="Compact"/>
-              <w:jc w:val="left"/>
-            </w:pPr>
-            <w:r>
-              <w:t xml:space="preserve">21.0</w:t>
-            </w:r>
-          </w:p>
-        </w:tc>
-        <w:tc>
-          <w:tcPr>
-            <w:tcW w:type="dxa" w:w="2112"/>
-          </w:tcPr>
-          <w:p>
-            <w:pPr>
-              <w:pStyle w:val="Compact"/>
-              <w:jc w:val="left"/>
-            </w:pPr>
-            <w:r>
-              <w:t xml:space="preserve">14.6</w:t>
-            </w:r>
-          </w:p>
-        </w:tc>
-      </w:tr>
-      <w:tr>
-        <w:tc>
-          <w:tcPr>
-            <w:tcW w:type="dxa" w:w="4597"/>
-          </w:tcPr>
-          <w:p>
-            <w:pPr>
-              <w:pStyle w:val="Compact"/>
-              <w:jc w:val="left"/>
-            </w:pPr>
-            <w:r>
-              <w:t xml:space="preserve">Observed MAE, leave-one-run-out (Table 6)</w:t>
-            </w:r>
-          </w:p>
-        </w:tc>
-        <w:tc>
-          <w:tcPr>
-            <w:tcW w:type="dxa" w:w="2360"/>
-          </w:tcPr>
-          <w:p>
-            <w:pPr>
-              <w:pStyle w:val="Compact"/>
-              <w:jc w:val="left"/>
-            </w:pPr>
-            <w:r>
-              <w:t xml:space="preserve">20.4</w:t>
-            </w:r>
-          </w:p>
-        </w:tc>
-        <w:tc>
-          <w:tcPr>
-            <w:tcW w:type="dxa" w:w="2112"/>
-          </w:tcPr>
-          <w:p>
-            <w:pPr>
-              <w:pStyle w:val="Compact"/>
-              <w:jc w:val="left"/>
-            </w:pPr>
-            <w:r>
-              <w:t xml:space="preserve">11.9</w:t>
-            </w:r>
-          </w:p>
-        </w:tc>
-      </w:tr>
-    </w:tbl>
+    <w:bookmarkEnd w:id="33"/>
+    <w:bookmarkEnd w:id="34"/>
+    <w:bookmarkStart w:id="38" w:name="X80959e8cf6f992baeb70ddee111b40ab53e3716"/>
     <w:p>
       <w:pPr>
-        <w:pStyle w:val="BodyText"/>
+        <w:pStyle w:val="Heading2"/>
       </w:pPr>
       <w:r>
-        <w:t xml:space="preserve">The common-mode wander measured in vehicle-free periods is real, but each crossing also carries a gauge-specific component, plausibly from the wheel path and local slab action. GLS amplifies this component, because it gives st40 and st36 large weights of opposite sign (+0.16 and −0.35).</w:t>
+        <w:t xml:space="preserve">5. In-service box girder: identifiability and channel design</w:t>
+      </w:r>
+    </w:p>
+    <w:p>
+      <w:pPr>
+        <w:pStyle w:val="FirstParagraph"/>
+      </w:pPr>
+      <w:r>
+        <w:t xml:space="preserve">This section applies the criteria to an in-service three-span box girder with static acceptance-test data. It asks how far the data determine the observability of each installed gauge, which channel and position would be robust, and which measurement would decide between the models that fit the data.</w:t>
+      </w:r>
+    </w:p>
+    <w:bookmarkStart w:id="35" w:name="bridge-data-and-model"/>
+    <w:p>
+      <w:pPr>
+        <w:pStyle w:val="Heading3"/>
+      </w:pPr>
+      <w:r>
+        <w:t xml:space="preserve">5.1. Bridge, data and model</w:t>
+      </w:r>
+    </w:p>
+    <w:p>
+      <w:pPr>
+        <w:pStyle w:val="FirstParagraph"/>
+      </w:pPr>
+      <w:r>
+        <w:t xml:space="preserve">The Cầu Mây Bridge carries provincial road DT389 over the Kinh Môn River in Hải Dương, Viet Nam. Its main bridge is a three-span continuous prestressed concrete box girder of 55 + 90 + 55 m, built by balanced cantilever (</w:t>
+      </w:r>
+      <m:oMath>
+        <m:r>
+          <m:t>β</m:t>
+        </m:r>
+        <m:r>
+          <m:rPr>
+            <m:sty m:val="p"/>
+          </m:rPr>
+          <m:t>=</m:t>
+        </m:r>
+        <m:r>
+          <m:t>1.636</m:t>
+        </m:r>
+      </m:oMath>
+      <w:r>
+        <w:t xml:space="preserve">). The depth varies from 2.40 m at mid-span to 5.40 m at the piers; the design section properties are in the Supplementary Material. The inner piers, including pier T7, are monolithic with the girder, and the end supports T5 and T8 carry pot bearings.</w:t>
       </w:r>
     </w:p>
     <w:p>
@@ -16835,31 +15043,312 @@
         <w:pStyle w:val="BodyText"/>
       </w:pPr>
       <w:r>
-        <w:t xml:space="preserve">Estimating</w:t>
-      </w:r>
-      <w:r>
-        <w:t xml:space="preserve"> </w:t>
-      </w:r>
-      <m:oMath>
-        <m:r>
-          <m:t>Σ</m:t>
-        </m:r>
-      </m:oMath>
-      <w:r>
-        <w:t xml:space="preserve"> </w:t>
-      </w:r>
-      <w:r>
-        <w:t xml:space="preserve">from the crossing residuals instead of vehicle-free windows over-fits with only eight runs (Supplementary Material). As anticipated in Section 2.4, the zero-sum estimator helps only when the disturbance is common-mode during the crossings themselves.</w:t>
+        <w:t xml:space="preserve">Two deflection gauges were read: N8 at 0.4L of the side span between pier T7 and end support T8, and N7 at mid main span. In the June 2020 acceptance test, four trucks stood in the side span (gauge N8) and six in the main span (gauge N7). The trucks were 3-axle, nominally 5 + 10 + 10 t, with a weighed mean of 25.06 t. Dial gauges read the peak deflection under centric and eccentric transverse positions [NEED VALUE: instrument type and fixed reference datum of the dial gauges, temperature correction, load-hold time and zero-reading procedure]. Each gauge has six readings (three lines, each centric and eccentric); their mean is 5.55 mm at N8 and 15.42 mm at N7.</w:t>
       </w:r>
     </w:p>
-    <w:bookmarkEnd w:id="32"/>
-    <w:bookmarkStart w:id="33" w:name="Xd4d1bd5c5ac2f2a93432c1f664cfa296aebfb99"/>
+    <w:p>
+      <w:pPr>
+        <w:pStyle w:val="BodyText"/>
+      </w:pPr>
+      <w:r>
+        <w:t xml:space="preserve">The girder was modelled with Euler–Bernoulli elements, a parabolic depth variation over</w:t>
+      </w:r>
+      <w:r>
+        <w:t xml:space="preserve"> </w:t>
+      </w:r>
+      <m:oMath>
+        <m:sSub>
+          <m:e>
+            <m:r>
+              <m:t>L</m:t>
+            </m:r>
+          </m:e>
+          <m:sub>
+            <m:r>
+              <m:t>v</m:t>
+            </m:r>
+          </m:sub>
+        </m:sSub>
+        <m:r>
+          <m:rPr>
+            <m:sty m:val="p"/>
+          </m:rPr>
+          <m:t>=</m:t>
+        </m:r>
+        <m:r>
+          <m:t>44</m:t>
+        </m:r>
+      </m:oMath>
+      <w:r>
+        <w:t xml:space="preserve"> </w:t>
+      </w:r>
+      <w:r>
+        <w:t xml:space="preserve">m from each inner pier, a second moment proportional to</w:t>
+      </w:r>
+      <w:r>
+        <w:t xml:space="preserve"> </w:t>
+      </w:r>
+      <m:oMath>
+        <m:sSup>
+          <m:e>
+            <m:r>
+              <m:t>h</m:t>
+            </m:r>
+          </m:e>
+          <m:sup>
+            <m:r>
+              <m:t>2.943</m:t>
+            </m:r>
+          </m:sup>
+        </m:sSup>
+      </m:oMath>
+      <w:r>
+        <w:t xml:space="preserve"> </w:t>
+      </w:r>
+      <w:r>
+        <w:t xml:space="preserve">fitted to the two design sections, and a rotational spring</w:t>
+      </w:r>
+      <w:r>
+        <w:t xml:space="preserve"> </w:t>
+      </w:r>
+      <m:oMath>
+        <m:r>
+          <m:t>k</m:t>
+        </m:r>
+      </m:oMath>
+      <w:r>
+        <w:t xml:space="preserve"> </w:t>
+      </w:r>
+      <w:r>
+        <w:t xml:space="preserve">at each inner pier. The depth law and the pier dimensions are not documented, so other depth lengths and exponents and a rigid pier zone were tested as model-form variants (Supplementary Material).</w:t>
+      </w:r>
+    </w:p>
+    <w:p>
+      <w:pPr>
+        <w:pStyle w:val="BodyText"/>
+      </w:pPr>
+      <w:r>
+        <w:t xml:space="preserve">Two reference calibrations are used. Calibration A is the design model, with</w:t>
+      </w:r>
+      <w:r>
+        <w:t xml:space="preserve"> </w:t>
+      </w:r>
+      <m:oMath>
+        <m:r>
+          <m:t>α</m:t>
+        </m:r>
+        <m:r>
+          <m:rPr>
+            <m:sty m:val="p"/>
+          </m:rPr>
+          <m:t>=</m:t>
+        </m:r>
+        <m:r>
+          <m:t>1</m:t>
+        </m:r>
+      </m:oMath>
+      <w:r>
+        <w:t xml:space="preserve"> </w:t>
+      </w:r>
+      <w:r>
+        <w:t xml:space="preserve">and</w:t>
+      </w:r>
+      <w:r>
+        <w:t xml:space="preserve"> </w:t>
+      </w:r>
+      <m:oMath>
+        <m:r>
+          <m:t>k</m:t>
+        </m:r>
+        <m:r>
+          <m:rPr>
+            <m:sty m:val="p"/>
+          </m:rPr>
+          <m:t>=</m:t>
+        </m:r>
+        <m:r>
+          <m:t>2.75</m:t>
+        </m:r>
+        <m:r>
+          <m:rPr>
+            <m:sty m:val="p"/>
+          </m:rPr>
+          <m:t>×</m:t>
+        </m:r>
+        <m:sSup>
+          <m:e>
+            <m:r>
+              <m:t>10</m:t>
+            </m:r>
+          </m:e>
+          <m:sup>
+            <m:r>
+              <m:t>7</m:t>
+            </m:r>
+          </m:sup>
+        </m:sSup>
+      </m:oMath>
+      <w:r>
+        <w:t xml:space="preserve"> </w:t>
+      </w:r>
+      <w:r>
+        <w:t xml:space="preserve">kN m/rad fitted to the designer’s FE output; it misfits the measurements by +2.4 % at N8 and +12.3 % at N7. Calibration B is the joint least-squares fit to the two readings, with</w:t>
+      </w:r>
+      <w:r>
+        <w:t xml:space="preserve"> </w:t>
+      </w:r>
+      <m:oMath>
+        <m:r>
+          <m:t>α</m:t>
+        </m:r>
+        <m:r>
+          <m:rPr>
+            <m:sty m:val="p"/>
+          </m:rPr>
+          <m:t>=</m:t>
+        </m:r>
+        <m:r>
+          <m:t>0.716</m:t>
+        </m:r>
+      </m:oMath>
+      <w:r>
+        <w:t xml:space="preserve"> </w:t>
+      </w:r>
+      <w:r>
+        <w:t xml:space="preserve">and</w:t>
+      </w:r>
+      <w:r>
+        <w:t xml:space="preserve"> </w:t>
+      </w:r>
+      <m:oMath>
+        <m:r>
+          <m:t>k</m:t>
+        </m:r>
+        <m:r>
+          <m:rPr>
+            <m:sty m:val="p"/>
+          </m:rPr>
+          <m:t>=</m:t>
+        </m:r>
+        <m:r>
+          <m:t>1.2</m:t>
+        </m:r>
+        <m:r>
+          <m:rPr>
+            <m:sty m:val="p"/>
+          </m:rPr>
+          <m:t>×</m:t>
+        </m:r>
+        <m:sSup>
+          <m:e>
+            <m:r>
+              <m:t>10</m:t>
+            </m:r>
+          </m:e>
+          <m:sup>
+            <m:r>
+              <m:t>8</m:t>
+            </m:r>
+          </m:sup>
+        </m:sSup>
+      </m:oMath>
+      <w:r>
+        <w:t xml:space="preserve"> </w:t>
+      </w:r>
+      <w:r>
+        <w:t xml:space="preserve">kN m/rad; its misfits are −2.8 % and +2.9 %. In terms of the scaled pier stiffness, calibration A lies at</w:t>
+      </w:r>
+      <w:r>
+        <w:t xml:space="preserve"> </w:t>
+      </w:r>
+      <m:oMath>
+        <m:r>
+          <m:t>κ</m:t>
+        </m:r>
+        <m:r>
+          <m:rPr>
+            <m:sty m:val="p"/>
+          </m:rPr>
+          <m:t>=</m:t>
+        </m:r>
+        <m:r>
+          <m:t>2.75</m:t>
+        </m:r>
+        <m:r>
+          <m:rPr>
+            <m:sty m:val="p"/>
+          </m:rPr>
+          <m:t>×</m:t>
+        </m:r>
+        <m:sSup>
+          <m:e>
+            <m:r>
+              <m:t>10</m:t>
+            </m:r>
+          </m:e>
+          <m:sup>
+            <m:r>
+              <m:t>7</m:t>
+            </m:r>
+          </m:sup>
+        </m:sSup>
+      </m:oMath>
+      <w:r>
+        <w:t xml:space="preserve"> </w:t>
+      </w:r>
+      <w:r>
+        <w:t xml:space="preserve">kN m/rad and calibration B at</w:t>
+      </w:r>
+      <w:r>
+        <w:t xml:space="preserve"> </w:t>
+      </w:r>
+      <m:oMath>
+        <m:r>
+          <m:t>κ</m:t>
+        </m:r>
+        <m:r>
+          <m:rPr>
+            <m:sty m:val="p"/>
+          </m:rPr>
+          <m:t>=</m:t>
+        </m:r>
+        <m:r>
+          <m:t>1.68</m:t>
+        </m:r>
+        <m:r>
+          <m:rPr>
+            <m:sty m:val="p"/>
+          </m:rPr>
+          <m:t>×</m:t>
+        </m:r>
+        <m:sSup>
+          <m:e>
+            <m:r>
+              <m:t>10</m:t>
+            </m:r>
+          </m:e>
+          <m:sup>
+            <m:r>
+              <m:t>8</m:t>
+            </m:r>
+          </m:sup>
+        </m:sSup>
+      </m:oMath>
+      <w:r>
+        <w:t xml:space="preserve"> </w:t>
+      </w:r>
+      <w:r>
+        <w:t xml:space="preserve">kN m/rad. Fig. 8 shows the indicators along the girder for the prismatic model and both calibrations.</w:t>
+      </w:r>
+    </w:p>
+    <w:bookmarkEnd w:id="35"/>
+    <w:bookmarkStart w:id="36" w:name="what-the-static-data-identify"/>
     <w:p>
       <w:pPr>
         <w:pStyle w:val="Heading3"/>
       </w:pPr>
       <w:r>
-        <w:t xml:space="preserve">4.4. Lane, superposition and the limits of a beam model</w:t>
+        <w:t xml:space="preserve">5.2. What the static data identify</w:t>
       </w:r>
     </w:p>
     <w:p>
@@ -16867,7 +15356,7 @@
         <w:pStyle w:val="FirstParagraph"/>
       </w:pPr>
       <w:r>
-        <w:t xml:space="preserve">Each lane needs its own constant. For the gauge average, return trips in the other lane gave constants 0.79 times those of lane A (95 % CI 0.59–1.00). The lane effect is clearly resolved for one gauge only (st36: 0.64, 95 % CI 0.47–0.81). The same need was found on another continuous girder [40].</w:t>
+        <w:t xml:space="preserve">The static data leave the constant of the side-span gauge N8 uncertain by a factor of 6.6, whereas the constant of the centre-span gauge N7 is well determined. Two facts explain this: a model-form misfit that no pier stiffness removes, and the Möbius law of Eq. (15).</w:t>
       </w:r>
     </w:p>
     <w:p>
@@ -16875,7 +15364,59 @@
         <w:pStyle w:val="BodyText"/>
       </w:pPr>
       <w:r>
-        <w:t xml:space="preserve">The two in-line two-truck runs are consistent with superposition, although both fall below the prediction. For the gauge average each gave 0.92 of the summed single-truck predictions (pooled 95 % CI 0.77–1.06); the GLS combination gave 0.82.</w:t>
+        <w:t xml:space="preserve">No pier stiffness lets the beam model fit both static readings exactly. The test quantity is</w:t>
+      </w:r>
+      <w:r>
+        <w:t xml:space="preserve"> </w:t>
+      </w:r>
+      <m:oMath>
+        <m:sSub>
+          <m:e>
+            <m:r>
+              <m:t>r</m:t>
+            </m:r>
+          </m:e>
+          <m:sub>
+            <m:r>
+              <m:t>87</m:t>
+            </m:r>
+          </m:sub>
+        </m:sSub>
+      </m:oMath>
+      <w:r>
+        <w:t xml:space="preserve">, the measured-to-model ratio at N8 divided by that at N7;</w:t>
+      </w:r>
+      <w:r>
+        <w:t xml:space="preserve"> </w:t>
+      </w:r>
+      <m:oMath>
+        <m:sSub>
+          <m:e>
+            <m:r>
+              <m:t>r</m:t>
+            </m:r>
+          </m:e>
+          <m:sub>
+            <m:r>
+              <m:t>87</m:t>
+            </m:r>
+          </m:sub>
+        </m:sSub>
+        <m:r>
+          <m:rPr>
+            <m:sty m:val="p"/>
+          </m:rPr>
+          <m:t>=</m:t>
+        </m:r>
+        <m:r>
+          <m:t>1</m:t>
+        </m:r>
+      </m:oMath>
+      <w:r>
+        <w:t xml:space="preserve"> </w:t>
+      </w:r>
+      <w:r>
+        <w:t xml:space="preserve">would mean that one model fits both gauges. It never reaches 1 (Fig. 9a). Its minimum, 1.058, lies at calibration B.</w:t>
       </w:r>
     </w:p>
     <w:p>
@@ -16883,7 +15424,30 @@
         <w:pStyle w:val="BodyText"/>
       </w:pPr>
       <w:r>
-        <w:t xml:space="preserve">Gauges within 6 m of each other along the girder have very different constants. On day 1 the constant of ch11 is 3.9 times that of ch8, and their 95 % CIs do not overlap (Table 3), whereas a one-dimensional beam model predicts ratios of 0.978–1.003.</w:t>
+        <w:t xml:space="preserve">The model-form variants move this minimum between 1.039 and 1.092 but never to 1, so the 4–9 % residual is model-form error. Calibration B is therefore the nearest fit, not an exact one, and its</w:t>
+      </w:r>
+      <w:r>
+        <w:t xml:space="preserve"> </w:t>
+      </w:r>
+      <m:oMath>
+        <m:r>
+          <m:t>α</m:t>
+        </m:r>
+        <m:r>
+          <m:rPr>
+            <m:sty m:val="p"/>
+          </m:rPr>
+          <m:t>=</m:t>
+        </m:r>
+        <m:r>
+          <m:t>0.716</m:t>
+        </m:r>
+      </m:oMath>
+      <w:r>
+        <w:t xml:space="preserve"> </w:t>
+      </w:r>
+      <w:r>
+        <w:t xml:space="preserve">would mean a 28 % loss of rigidity in a young prestressed girder.</w:t>
       </w:r>
     </w:p>
     <w:p>
@@ -16891,7 +15455,41 @@
         <w:pStyle w:val="BodyText"/>
       </w:pPr>
       <w:r>
-        <w:t xml:space="preserve">Gauge-factor spread is unlikely to explain these differences, because the ratio of the st36 and st40 constants changes with the lane: 3.24 ± 0.56 in lane A against 1.82 ± 0.10 in lane B (± one standard error), about 2.5 standard errors apart. The deck-soffit gauges respond to slab bending and shear lag as well as to girder bending. The constant must therefore come from a weighed reference vehicle or a three-dimensional model; a beam-model BPM would fail.</w:t>
+        <w:t xml:space="preserve">The admissible set contains every model whose misfit at each gauge stays within a tolerance</w:t>
+      </w:r>
+      <w:r>
+        <w:t xml:space="preserve"> </w:t>
+      </w:r>
+      <m:oMath>
+        <m:r>
+          <m:t>τ</m:t>
+        </m:r>
+      </m:oMath>
+      <w:r>
+        <w:t xml:space="preserve">. The six readings of each gauge spread by 1.9–2.0 % about their mean. This spread comes from the transverse positions and is not a repeatability, because the readings are not replicates. Combined in quadrature with a model-form spread of 1.75 %, it gives a standard uncertainty of 2.64 % per reading, and</w:t>
+      </w:r>
+      <w:r>
+        <w:t xml:space="preserve"> </w:t>
+      </w:r>
+      <m:oMath>
+        <m:r>
+          <m:t>τ</m:t>
+        </m:r>
+        <m:r>
+          <m:rPr>
+            <m:sty m:val="p"/>
+          </m:rPr>
+          <m:t>=</m:t>
+        </m:r>
+        <m:r>
+          <m:t>5.3</m:t>
+        </m:r>
+      </m:oMath>
+      <w:r>
+        <w:t xml:space="preserve"> </w:t>
+      </w:r>
+      <w:r>
+        <w:t xml:space="preserve">% at two standard deviations.</w:t>
       </w:r>
     </w:p>
     <w:p>
@@ -16899,47 +15497,122 @@
         <w:pStyle w:val="BodyText"/>
       </w:pPr>
       <w:r>
-        <w:t xml:space="preserve">A beam model of the girder (Euler–Bernoulli, parabolic haunch, second moment proportional to</w:t>
-      </w:r>
-      <w:r>
-        <w:t xml:space="preserve"> </w:t>
-      </w:r>
-      <m:oMath>
+        <w:t xml:space="preserve">At this tolerance the static data bound</w:t>
+      </w:r>
+      <w:r>
+        <w:t xml:space="preserve"> </w:t>
+      </w:r>
+      <m:oMath>
+        <m:r>
+          <m:t>κ</m:t>
+        </m:r>
+      </m:oMath>
+      <w:r>
+        <w:t xml:space="preserve"> </w:t>
+      </w:r>
+      <w:r>
+        <w:t xml:space="preserve">only from below: every</w:t>
+      </w:r>
+      <w:r>
+        <w:t xml:space="preserve"> </w:t>
+      </w:r>
+      <m:oMath>
+        <m:r>
+          <m:t>κ</m:t>
+        </m:r>
+        <m:r>
+          <m:rPr>
+            <m:sty m:val="p"/>
+          </m:rPr>
+          <m:t>≥</m:t>
+        </m:r>
+        <m:r>
+          <m:t>1.8</m:t>
+        </m:r>
+        <m:r>
+          <m:rPr>
+            <m:sty m:val="p"/>
+          </m:rPr>
+          <m:t>×</m:t>
+        </m:r>
         <m:sSup>
           <m:e>
             <m:r>
-              <m:t>h</m:t>
+              <m:t>10</m:t>
             </m:r>
           </m:e>
           <m:sup>
             <m:r>
-              <m:t>2</m:t>
+              <m:t>7</m:t>
             </m:r>
           </m:sup>
         </m:sSup>
       </m:oMath>
       <w:r>
-        <w:t xml:space="preserve">) reproduces the global shape of the strain history (</w:t>
-      </w:r>
-      <m:oMath>
-        <m:sSup>
-          <m:e>
-            <m:r>
-              <m:t>r</m:t>
-            </m:r>
-          </m:e>
-          <m:sup>
-            <m:r>
-              <m:t>2</m:t>
-            </m:r>
-          </m:sup>
-        </m:sSup>
-      </m:oMath>
-      <w:r>
-        <w:t xml:space="preserve"> </w:t>
-      </w:r>
-      <w:r>
-        <w:t xml:space="preserve">= 0.79–0.94). The gauges are not blind: the zeros of the uniform-load moment diagram in span 2 lie at 121.6 m and 190.8 m, about 35 m from the gauges.</w:t>
+        <w:t xml:space="preserve"> </w:t>
+      </w:r>
+      <w:r>
+        <w:t xml:space="preserve">kN m/rad is admissible, with</w:t>
+      </w:r>
+      <w:r>
+        <w:t xml:space="preserve"> </w:t>
+      </w:r>
+      <m:oMath>
+        <m:r>
+          <m:t>α</m:t>
+        </m:r>
+      </m:oMath>
+      <w:r>
+        <w:t xml:space="preserve"> </w:t>
+      </w:r>
+      <w:r>
+        <w:t xml:space="preserve">between 0.51 and 1.15. The conclusion depends on the tolerance. At</w:t>
+      </w:r>
+      <w:r>
+        <w:t xml:space="preserve"> </w:t>
+      </w:r>
+      <m:oMath>
+        <m:r>
+          <m:t>τ</m:t>
+        </m:r>
+        <m:r>
+          <m:rPr>
+            <m:sty m:val="p"/>
+          </m:rPr>
+          <m:t>=</m:t>
+        </m:r>
+        <m:r>
+          <m:t>3</m:t>
+        </m:r>
+      </m:oMath>
+      <w:r>
+        <w:t xml:space="preserve"> </w:t>
+      </w:r>
+      <w:r>
+        <w:t xml:space="preserve">% the admissible set shrinks and excludes the design rigidity,</w:t>
+      </w:r>
+      <w:r>
+        <w:t xml:space="preserve"> </w:t>
+      </w:r>
+      <m:oMath>
+        <m:r>
+          <m:t>α</m:t>
+        </m:r>
+        <m:r>
+          <m:rPr>
+            <m:sty m:val="p"/>
+          </m:rPr>
+          <m:t>=</m:t>
+        </m:r>
+        <m:r>
+          <m:t>1</m:t>
+        </m:r>
+      </m:oMath>
+      <w:r>
+        <w:t xml:space="preserve"> </w:t>
+      </w:r>
+      <w:r>
+        <w:t xml:space="preserve">(Supplementary Material).</w:t>
       </w:r>
     </w:p>
     <w:p>
@@ -16947,39 +15620,53 @@
         <w:pStyle w:val="BodyText"/>
       </w:pPr>
       <w:r>
-        <w:t xml:space="preserve">The same model shows why the whole 605 m crossing must be integrated. The cancellation ratio</w:t>
-      </w:r>
-      <w:r>
-        <w:t xml:space="preserve"> </w:t>
-      </w:r>
-      <m:oMath>
-        <m:r>
-          <m:t>R</m:t>
-        </m:r>
-      </m:oMath>
-      <w:r>
-        <w:t xml:space="preserve"> </w:t>
-      </w:r>
-      <w:r>
-        <w:t xml:space="preserve">of the gauges’ influence line is 0.51: span 2 contributes about 170 % of the net integral, and the adjacent spans −26 % and −66 %.</w:t>
-      </w:r>
-    </w:p>
-    <w:bookmarkEnd w:id="33"/>
-    <w:bookmarkStart w:id="34" w:name="what-the-field-records-show"/>
-    <w:p>
-      <w:pPr>
-        <w:pStyle w:val="Heading3"/>
-      </w:pPr>
-      <w:r>
-        <w:t xml:space="preserve">4.5. What the field records show</w:t>
-      </w:r>
-    </w:p>
-    <w:p>
-      <w:pPr>
-        <w:pStyle w:val="FirstParagraph"/>
-      </w:pPr>
-      <w:r>
-        <w:t xml:space="preserve">The records support linearity, superposition and per-gauge invariance within the 10–27 % that the noise allows, and they show that each lane, and each deck gauge, needs its own constant. They cannot show weight discrimination, because the reference weights hardly vary. They show no benefit from GLS or zero-sum combinations, because the common-mode assumption behind Eq. (14) holds for vehicle-free noise but not for crossing residuals.</w:t>
+        <w:t xml:space="preserve">Over the admissible set, the absolute constant</w:t>
+      </w:r>
+      <w:r>
+        <w:t xml:space="preserve"> </w:t>
+      </w:r>
+      <m:oMath>
+        <m:sSub>
+          <m:e>
+            <m:r>
+              <m:t>C</m:t>
+            </m:r>
+          </m:e>
+          <m:sub>
+            <m:r>
+              <m:t>8</m:t>
+            </m:r>
+          </m:sub>
+        </m:sSub>
+      </m:oMath>
+      <w:r>
+        <w:t xml:space="preserve"> </w:t>
+      </w:r>
+      <w:r>
+        <w:t xml:space="preserve">ranges from 3.0 × 10⁻⁵ to 2.0 × 10⁻⁴ m²/kN, whereas</w:t>
+      </w:r>
+      <w:r>
+        <w:t xml:space="preserve"> </w:t>
+      </w:r>
+      <m:oMath>
+        <m:sSub>
+          <m:e>
+            <m:r>
+              <m:t>C</m:t>
+            </m:r>
+          </m:e>
+          <m:sub>
+            <m:r>
+              <m:t>7</m:t>
+            </m:r>
+          </m:sub>
+        </m:sSub>
+      </m:oMath>
+      <w:r>
+        <w:t xml:space="preserve"> </w:t>
+      </w:r>
+      <w:r>
+        <w:t xml:space="preserve">stays within 3.3–5.0 × 10⁻⁴ m²/kN. The deflection indicators show the same contrast: with the design rigidity as reference, N8 spans 0.124–0.822 and N7 only 0.190–0.286 (Table 4).</w:t>
       </w:r>
     </w:p>
     <w:p>
@@ -16987,703 +15674,11 @@
         <w:pStyle w:val="BodyText"/>
       </w:pPr>
       <w:r>
-        <w:t xml:space="preserve">The tests rest on four trucks, two axle counts and seven or eight runs per day. The gauge calibration factors and exact positions are not published, so absolute constants cannot be checked. The GVW accuracy that the dataset authors reported for their influence-line system on this bridge [41–43] was not compared [NEED VALUE: GVW accuracy reported in [41–43] for the same runs, if the authors wish to add it].</w:t>
-      </w:r>
-    </w:p>
-    <w:bookmarkEnd w:id="34"/>
-    <w:bookmarkEnd w:id="35"/>
-    <w:bookmarkStart w:id="39" w:name="X80959e8cf6f992baeb70ddee111b40ab53e3716"/>
-    <w:p>
-      <w:pPr>
-        <w:pStyle w:val="Heading2"/>
-      </w:pPr>
-      <w:r>
-        <w:t xml:space="preserve">5. In-service box girder: identifiability and channel design</w:t>
-      </w:r>
-    </w:p>
-    <w:p>
-      <w:pPr>
-        <w:pStyle w:val="FirstParagraph"/>
-      </w:pPr>
-      <w:r>
-        <w:t xml:space="preserve">This section applies the criteria to an in-service three-span box girder with static acceptance-test data. It asks how far the data determine the observability of each installed gauge, which channel and position would be robust, and which measurement would decide between the models that fit the data.</w:t>
-      </w:r>
-    </w:p>
-    <w:bookmarkStart w:id="36" w:name="bridge-data-and-model"/>
-    <w:p>
-      <w:pPr>
-        <w:pStyle w:val="Heading3"/>
-      </w:pPr>
-      <w:r>
-        <w:t xml:space="preserve">5.1. Bridge, data and model</w:t>
-      </w:r>
-    </w:p>
-    <w:p>
-      <w:pPr>
-        <w:pStyle w:val="FirstParagraph"/>
-      </w:pPr>
-      <w:r>
-        <w:t xml:space="preserve">The Cầu Mây Bridge carries provincial road DT389 over the Kinh Môn River in Hải Dương, Viet Nam. Its main bridge is a three-span continuous prestressed concrete box girder of 55 + 90 + 55 m, built by balanced cantilever (</w:t>
-      </w:r>
-      <m:oMath>
-        <m:r>
-          <m:t>β</m:t>
-        </m:r>
-        <m:r>
-          <m:rPr>
-            <m:sty m:val="p"/>
-          </m:rPr>
-          <m:t>=</m:t>
-        </m:r>
-        <m:r>
-          <m:t>1.636</m:t>
-        </m:r>
-      </m:oMath>
-      <w:r>
-        <w:t xml:space="preserve">). The depth varies from 2.40 m at mid-span to 5.40 m at the piers; the design section properties are in the Supplementary Material. The inner piers, including pier T7, are monolithic with the girder, and the end supports T5 and T8 carry pot bearings.</w:t>
-      </w:r>
-    </w:p>
-    <w:p>
-      <w:pPr>
-        <w:pStyle w:val="BodyText"/>
-      </w:pPr>
-      <w:r>
-        <w:t xml:space="preserve">Two deflection gauges were read: N8 at 0.4L of the side span between pier T7 and end support T8, and N7 at mid main span. In the June 2020 acceptance test, four trucks stood in the side span (gauge N8) and six in the main span (gauge N7). The trucks were 3-axle, nominally 5 + 10 + 10 t, with a weighed mean of 25.06 t. Dial gauges read the peak deflection under centric and eccentric transverse positions [NEED VALUE: instrument type and fixed reference datum of the dial gauges, temperature correction, load-hold time and zero-reading procedure]. Each gauge has six readings (three lines, each centric and eccentric); their mean is 5.55 mm at N8 and 15.42 mm at N7.</w:t>
-      </w:r>
-    </w:p>
-    <w:p>
-      <w:pPr>
-        <w:pStyle w:val="BodyText"/>
-      </w:pPr>
-      <w:r>
-        <w:t xml:space="preserve">The girder was modelled with Euler–Bernoulli elements, a parabolic depth variation over</w:t>
-      </w:r>
-      <w:r>
-        <w:t xml:space="preserve"> </w:t>
-      </w:r>
-      <m:oMath>
-        <m:sSub>
-          <m:e>
-            <m:r>
-              <m:t>L</m:t>
-            </m:r>
-          </m:e>
-          <m:sub>
-            <m:r>
-              <m:t>v</m:t>
-            </m:r>
-          </m:sub>
-        </m:sSub>
-        <m:r>
-          <m:rPr>
-            <m:sty m:val="p"/>
-          </m:rPr>
-          <m:t>=</m:t>
-        </m:r>
-        <m:r>
-          <m:t>44</m:t>
-        </m:r>
-      </m:oMath>
-      <w:r>
-        <w:t xml:space="preserve"> </w:t>
-      </w:r>
-      <w:r>
-        <w:t xml:space="preserve">m from each inner pier, a second moment proportional to</w:t>
-      </w:r>
-      <w:r>
-        <w:t xml:space="preserve"> </w:t>
-      </w:r>
-      <m:oMath>
-        <m:sSup>
-          <m:e>
-            <m:r>
-              <m:t>h</m:t>
-            </m:r>
-          </m:e>
-          <m:sup>
-            <m:r>
-              <m:t>2.943</m:t>
-            </m:r>
-          </m:sup>
-        </m:sSup>
-      </m:oMath>
-      <w:r>
-        <w:t xml:space="preserve"> </w:t>
-      </w:r>
-      <w:r>
-        <w:t xml:space="preserve">fitted to the two design sections, and a rotational spring</w:t>
-      </w:r>
-      <w:r>
-        <w:t xml:space="preserve"> </w:t>
-      </w:r>
-      <m:oMath>
-        <m:r>
-          <m:t>k</m:t>
-        </m:r>
-      </m:oMath>
-      <w:r>
-        <w:t xml:space="preserve"> </w:t>
-      </w:r>
-      <w:r>
-        <w:t xml:space="preserve">at each inner pier. The depth law and the pier dimensions are not documented, so other depth lengths and exponents and a rigid pier zone were tested as model-form variants (Supplementary Material).</w:t>
-      </w:r>
-    </w:p>
-    <w:p>
-      <w:pPr>
-        <w:pStyle w:val="BodyText"/>
-      </w:pPr>
-      <w:r>
-        <w:t xml:space="preserve">Two reference calibrations are used. Calibration A is the design model, with</w:t>
-      </w:r>
-      <w:r>
-        <w:t xml:space="preserve"> </w:t>
-      </w:r>
-      <m:oMath>
-        <m:r>
-          <m:t>α</m:t>
-        </m:r>
-        <m:r>
-          <m:rPr>
-            <m:sty m:val="p"/>
-          </m:rPr>
-          <m:t>=</m:t>
-        </m:r>
-        <m:r>
-          <m:t>1</m:t>
-        </m:r>
-      </m:oMath>
-      <w:r>
-        <w:t xml:space="preserve"> </w:t>
-      </w:r>
-      <w:r>
-        <w:t xml:space="preserve">and</w:t>
-      </w:r>
-      <w:r>
-        <w:t xml:space="preserve"> </w:t>
-      </w:r>
-      <m:oMath>
-        <m:r>
-          <m:t>k</m:t>
-        </m:r>
-        <m:r>
-          <m:rPr>
-            <m:sty m:val="p"/>
-          </m:rPr>
-          <m:t>=</m:t>
-        </m:r>
-        <m:r>
-          <m:t>2.75</m:t>
-        </m:r>
-        <m:r>
-          <m:rPr>
-            <m:sty m:val="p"/>
-          </m:rPr>
-          <m:t>×</m:t>
-        </m:r>
-        <m:sSup>
-          <m:e>
-            <m:r>
-              <m:t>10</m:t>
-            </m:r>
-          </m:e>
-          <m:sup>
-            <m:r>
-              <m:t>7</m:t>
-            </m:r>
-          </m:sup>
-        </m:sSup>
-      </m:oMath>
-      <w:r>
-        <w:t xml:space="preserve"> </w:t>
-      </w:r>
-      <w:r>
-        <w:t xml:space="preserve">kN m/rad fitted to the designer’s FE output; it misfits the measurements by +2.4 % at N8 and +12.3 % at N7. Calibration B is the joint least-squares fit to the two readings, with</w:t>
-      </w:r>
-      <w:r>
-        <w:t xml:space="preserve"> </w:t>
-      </w:r>
-      <m:oMath>
-        <m:r>
-          <m:t>α</m:t>
-        </m:r>
-        <m:r>
-          <m:rPr>
-            <m:sty m:val="p"/>
-          </m:rPr>
-          <m:t>=</m:t>
-        </m:r>
-        <m:r>
-          <m:t>0.716</m:t>
-        </m:r>
-      </m:oMath>
-      <w:r>
-        <w:t xml:space="preserve"> </w:t>
-      </w:r>
-      <w:r>
-        <w:t xml:space="preserve">and</w:t>
-      </w:r>
-      <w:r>
-        <w:t xml:space="preserve"> </w:t>
-      </w:r>
-      <m:oMath>
-        <m:r>
-          <m:t>k</m:t>
-        </m:r>
-        <m:r>
-          <m:rPr>
-            <m:sty m:val="p"/>
-          </m:rPr>
-          <m:t>=</m:t>
-        </m:r>
-        <m:r>
-          <m:t>1.2</m:t>
-        </m:r>
-        <m:r>
-          <m:rPr>
-            <m:sty m:val="p"/>
-          </m:rPr>
-          <m:t>×</m:t>
-        </m:r>
-        <m:sSup>
-          <m:e>
-            <m:r>
-              <m:t>10</m:t>
-            </m:r>
-          </m:e>
-          <m:sup>
-            <m:r>
-              <m:t>8</m:t>
-            </m:r>
-          </m:sup>
-        </m:sSup>
-      </m:oMath>
-      <w:r>
-        <w:t xml:space="preserve"> </w:t>
-      </w:r>
-      <w:r>
-        <w:t xml:space="preserve">kN m/rad; its misfits are −2.8 % and +2.9 %. In terms of the scaled pier stiffness, calibration A lies at</w:t>
-      </w:r>
-      <w:r>
-        <w:t xml:space="preserve"> </w:t>
-      </w:r>
-      <m:oMath>
-        <m:r>
-          <m:t>κ</m:t>
-        </m:r>
-        <m:r>
-          <m:rPr>
-            <m:sty m:val="p"/>
-          </m:rPr>
-          <m:t>=</m:t>
-        </m:r>
-        <m:r>
-          <m:t>2.75</m:t>
-        </m:r>
-        <m:r>
-          <m:rPr>
-            <m:sty m:val="p"/>
-          </m:rPr>
-          <m:t>×</m:t>
-        </m:r>
-        <m:sSup>
-          <m:e>
-            <m:r>
-              <m:t>10</m:t>
-            </m:r>
-          </m:e>
-          <m:sup>
-            <m:r>
-              <m:t>7</m:t>
-            </m:r>
-          </m:sup>
-        </m:sSup>
-      </m:oMath>
-      <w:r>
-        <w:t xml:space="preserve"> </w:t>
-      </w:r>
-      <w:r>
-        <w:t xml:space="preserve">kN m/rad and calibration B at</w:t>
-      </w:r>
-      <w:r>
-        <w:t xml:space="preserve"> </w:t>
-      </w:r>
-      <m:oMath>
-        <m:r>
-          <m:t>κ</m:t>
-        </m:r>
-        <m:r>
-          <m:rPr>
-            <m:sty m:val="p"/>
-          </m:rPr>
-          <m:t>=</m:t>
-        </m:r>
-        <m:r>
-          <m:t>1.68</m:t>
-        </m:r>
-        <m:r>
-          <m:rPr>
-            <m:sty m:val="p"/>
-          </m:rPr>
-          <m:t>×</m:t>
-        </m:r>
-        <m:sSup>
-          <m:e>
-            <m:r>
-              <m:t>10</m:t>
-            </m:r>
-          </m:e>
-          <m:sup>
-            <m:r>
-              <m:t>8</m:t>
-            </m:r>
-          </m:sup>
-        </m:sSup>
-      </m:oMath>
-      <w:r>
-        <w:t xml:space="preserve"> </w:t>
-      </w:r>
-      <w:r>
-        <w:t xml:space="preserve">kN m/rad. Fig. 8 shows the indicators along the girder for the prismatic model and both calibrations.</w:t>
-      </w:r>
-    </w:p>
-    <w:bookmarkEnd w:id="36"/>
-    <w:bookmarkStart w:id="37" w:name="what-the-static-data-identify"/>
-    <w:p>
-      <w:pPr>
-        <w:pStyle w:val="Heading3"/>
-      </w:pPr>
-      <w:r>
-        <w:t xml:space="preserve">5.2. What the static data identify</w:t>
-      </w:r>
-    </w:p>
-    <w:p>
-      <w:pPr>
-        <w:pStyle w:val="FirstParagraph"/>
-      </w:pPr>
-      <w:r>
-        <w:t xml:space="preserve">The static data leave the constant of the side-span gauge N8 uncertain by a factor of 6.6, whereas the constant of the centre-span gauge N7 is well determined. Two facts explain this: a model-form misfit that no pier stiffness removes, and the Möbius law of Eq. (15).</w:t>
-      </w:r>
-    </w:p>
-    <w:p>
-      <w:pPr>
-        <w:pStyle w:val="BodyText"/>
-      </w:pPr>
-      <w:r>
-        <w:t xml:space="preserve">No pier stiffness lets the beam model fit both static readings exactly. The test quantity is</w:t>
-      </w:r>
-      <w:r>
-        <w:t xml:space="preserve"> </w:t>
-      </w:r>
-      <m:oMath>
-        <m:sSub>
-          <m:e>
-            <m:r>
-              <m:t>r</m:t>
-            </m:r>
-          </m:e>
-          <m:sub>
-            <m:r>
-              <m:t>87</m:t>
-            </m:r>
-          </m:sub>
-        </m:sSub>
-      </m:oMath>
-      <w:r>
-        <w:t xml:space="preserve">, the measured-to-model ratio at N8 divided by that at N7;</w:t>
-      </w:r>
-      <w:r>
-        <w:t xml:space="preserve"> </w:t>
-      </w:r>
-      <m:oMath>
-        <m:sSub>
-          <m:e>
-            <m:r>
-              <m:t>r</m:t>
-            </m:r>
-          </m:e>
-          <m:sub>
-            <m:r>
-              <m:t>87</m:t>
-            </m:r>
-          </m:sub>
-        </m:sSub>
-        <m:r>
-          <m:rPr>
-            <m:sty m:val="p"/>
-          </m:rPr>
-          <m:t>=</m:t>
-        </m:r>
-        <m:r>
-          <m:t>1</m:t>
-        </m:r>
-      </m:oMath>
-      <w:r>
-        <w:t xml:space="preserve"> </w:t>
-      </w:r>
-      <w:r>
-        <w:t xml:space="preserve">would mean that one model fits both gauges. It never reaches 1 (Fig. 9a). Its minimum, 1.058, lies at calibration B.</w:t>
-      </w:r>
-    </w:p>
-    <w:p>
-      <w:pPr>
-        <w:pStyle w:val="BodyText"/>
-      </w:pPr>
-      <w:r>
-        <w:t xml:space="preserve">The model-form variants move this minimum between 1.039 and 1.092 but never to 1, so the 4–9 % residual is model-form error. Calibration B is therefore the nearest fit, not an exact one, and its</w:t>
-      </w:r>
-      <w:r>
-        <w:t xml:space="preserve"> </w:t>
-      </w:r>
-      <m:oMath>
-        <m:r>
-          <m:t>α</m:t>
-        </m:r>
-        <m:r>
-          <m:rPr>
-            <m:sty m:val="p"/>
-          </m:rPr>
-          <m:t>=</m:t>
-        </m:r>
-        <m:r>
-          <m:t>0.716</m:t>
-        </m:r>
-      </m:oMath>
-      <w:r>
-        <w:t xml:space="preserve"> </w:t>
-      </w:r>
-      <w:r>
-        <w:t xml:space="preserve">would mean a 28 % loss of rigidity in a young prestressed girder.</w:t>
-      </w:r>
-    </w:p>
-    <w:p>
-      <w:pPr>
-        <w:pStyle w:val="BodyText"/>
-      </w:pPr>
-      <w:r>
-        <w:t xml:space="preserve">The admissible set contains every model whose misfit at each gauge stays within a tolerance</w:t>
-      </w:r>
-      <w:r>
-        <w:t xml:space="preserve"> </w:t>
-      </w:r>
-      <m:oMath>
-        <m:r>
-          <m:t>τ</m:t>
-        </m:r>
-      </m:oMath>
-      <w:r>
-        <w:t xml:space="preserve">. The six readings of each gauge spread by 1.9–2.0 % about their mean. This spread comes from the transverse positions and is not a repeatability, because the readings are not replicates. Combined in quadrature with a model-form spread of 1.75 %, it gives a standard uncertainty of 2.64 % per reading, and</w:t>
-      </w:r>
-      <w:r>
-        <w:t xml:space="preserve"> </w:t>
-      </w:r>
-      <m:oMath>
-        <m:r>
-          <m:t>τ</m:t>
-        </m:r>
-        <m:r>
-          <m:rPr>
-            <m:sty m:val="p"/>
-          </m:rPr>
-          <m:t>=</m:t>
-        </m:r>
-        <m:r>
-          <m:t>5.3</m:t>
-        </m:r>
-      </m:oMath>
-      <w:r>
-        <w:t xml:space="preserve"> </w:t>
-      </w:r>
-      <w:r>
-        <w:t xml:space="preserve">% at two standard deviations.</w:t>
-      </w:r>
-    </w:p>
-    <w:p>
-      <w:pPr>
-        <w:pStyle w:val="BodyText"/>
-      </w:pPr>
-      <w:r>
-        <w:t xml:space="preserve">At this tolerance the static data bound</w:t>
-      </w:r>
-      <w:r>
-        <w:t xml:space="preserve"> </w:t>
-      </w:r>
-      <m:oMath>
-        <m:r>
-          <m:t>κ</m:t>
-        </m:r>
-      </m:oMath>
-      <w:r>
-        <w:t xml:space="preserve"> </w:t>
-      </w:r>
-      <w:r>
-        <w:t xml:space="preserve">only from below: every</w:t>
-      </w:r>
-      <w:r>
-        <w:t xml:space="preserve"> </w:t>
-      </w:r>
-      <m:oMath>
-        <m:r>
-          <m:t>κ</m:t>
-        </m:r>
-        <m:r>
-          <m:rPr>
-            <m:sty m:val="p"/>
-          </m:rPr>
-          <m:t>≥</m:t>
-        </m:r>
-        <m:r>
-          <m:t>1.8</m:t>
-        </m:r>
-        <m:r>
-          <m:rPr>
-            <m:sty m:val="p"/>
-          </m:rPr>
-          <m:t>×</m:t>
-        </m:r>
-        <m:sSup>
-          <m:e>
-            <m:r>
-              <m:t>10</m:t>
-            </m:r>
-          </m:e>
-          <m:sup>
-            <m:r>
-              <m:t>7</m:t>
-            </m:r>
-          </m:sup>
-        </m:sSup>
-      </m:oMath>
-      <w:r>
-        <w:t xml:space="preserve"> </w:t>
-      </w:r>
-      <w:r>
-        <w:t xml:space="preserve">kN m/rad is admissible, with</w:t>
-      </w:r>
-      <w:r>
-        <w:t xml:space="preserve"> </w:t>
-      </w:r>
-      <m:oMath>
-        <m:r>
-          <m:t>α</m:t>
-        </m:r>
-      </m:oMath>
-      <w:r>
-        <w:t xml:space="preserve"> </w:t>
-      </w:r>
-      <w:r>
-        <w:t xml:space="preserve">between 0.51 and 1.15. The conclusion depends on the tolerance. At</w:t>
-      </w:r>
-      <w:r>
-        <w:t xml:space="preserve"> </w:t>
-      </w:r>
-      <m:oMath>
-        <m:r>
-          <m:t>τ</m:t>
-        </m:r>
-        <m:r>
-          <m:rPr>
-            <m:sty m:val="p"/>
-          </m:rPr>
-          <m:t>=</m:t>
-        </m:r>
-        <m:r>
-          <m:t>3</m:t>
-        </m:r>
-      </m:oMath>
-      <w:r>
-        <w:t xml:space="preserve"> </w:t>
-      </w:r>
-      <w:r>
-        <w:t xml:space="preserve">% the admissible set shrinks and excludes the design rigidity,</w:t>
-      </w:r>
-      <w:r>
-        <w:t xml:space="preserve"> </w:t>
-      </w:r>
-      <m:oMath>
-        <m:r>
-          <m:t>α</m:t>
-        </m:r>
-        <m:r>
-          <m:rPr>
-            <m:sty m:val="p"/>
-          </m:rPr>
-          <m:t>=</m:t>
-        </m:r>
-        <m:r>
-          <m:t>1</m:t>
-        </m:r>
-      </m:oMath>
-      <w:r>
-        <w:t xml:space="preserve"> </w:t>
-      </w:r>
-      <w:r>
-        <w:t xml:space="preserve">(Supplementary Material).</w:t>
-      </w:r>
-    </w:p>
-    <w:p>
-      <w:pPr>
-        <w:pStyle w:val="BodyText"/>
-      </w:pPr>
-      <w:r>
-        <w:t xml:space="preserve">Over the admissible set, the absolute constant</w:t>
-      </w:r>
-      <w:r>
-        <w:t xml:space="preserve"> </w:t>
-      </w:r>
-      <m:oMath>
-        <m:sSub>
-          <m:e>
-            <m:r>
-              <m:t>C</m:t>
-            </m:r>
-          </m:e>
-          <m:sub>
-            <m:r>
-              <m:t>8</m:t>
-            </m:r>
-          </m:sub>
-        </m:sSub>
-      </m:oMath>
-      <w:r>
-        <w:t xml:space="preserve"> </w:t>
-      </w:r>
-      <w:r>
-        <w:t xml:space="preserve">ranges from 3.0 × 10⁻⁵ to 2.0 × 10⁻⁴ m²/kN, whereas</w:t>
-      </w:r>
-      <w:r>
-        <w:t xml:space="preserve"> </w:t>
-      </w:r>
-      <m:oMath>
-        <m:sSub>
-          <m:e>
-            <m:r>
-              <m:t>C</m:t>
-            </m:r>
-          </m:e>
-          <m:sub>
-            <m:r>
-              <m:t>7</m:t>
-            </m:r>
-          </m:sub>
-        </m:sSub>
-      </m:oMath>
-      <w:r>
-        <w:t xml:space="preserve"> </w:t>
-      </w:r>
-      <w:r>
-        <w:t xml:space="preserve">stays within 3.3–5.0 × 10⁻⁴ m²/kN. The deflection indicators show the same contrast: with the design rigidity as reference, N8 spans 0.124–0.822 and N7 only 0.190–0.286 (Table 8).</w:t>
-      </w:r>
-    </w:p>
-    <w:p>
-      <w:pPr>
-        <w:pStyle w:val="BodyText"/>
-      </w:pPr>
-      <w:r>
         <w:rPr>
           <w:bCs/>
           <w:b/>
         </w:rPr>
-        <w:t xml:space="preserve">Table 8.</w:t>
+        <w:t xml:space="preserve">Table 4.</w:t>
       </w:r>
       <w:r>
         <w:t xml:space="preserve"> </w:t>
@@ -18483,7 +16478,7 @@
         <w:t xml:space="preserve"> </w:t>
       </w:r>
       <w:r>
-        <w:t xml:space="preserve">is much larger at N8 than at N7 (Table 9).</w:t>
+        <w:t xml:space="preserve">is much larger at N8 than at N7 (Table 5).</w:t>
       </w:r>
     </w:p>
     <w:p>
@@ -18526,7 +16521,7 @@
           <w:bCs/>
           <w:b/>
         </w:rPr>
-        <w:t xml:space="preserve">Table 9.</w:t>
+        <w:t xml:space="preserve">Table 5.</w:t>
       </w:r>
       <w:r>
         <w:t xml:space="preserve"> </w:t>
@@ -19092,8 +17087,8 @@
         <w:t xml:space="preserve">is 0.56–1.00, so its smallness reflects restraint by the haunches, not cancellation. The measured vertical frequencies (3.43–3.64 Hz) would narrow the admissible set further if they belonged to the third vertical mode. This interpretation is conditional and is analysed in the Supplementary Material.</w:t>
       </w:r>
     </w:p>
-    <w:bookmarkEnd w:id="37"/>
-    <w:bookmarkStart w:id="38" w:name="which-channel-where"/>
+    <w:bookmarkEnd w:id="36"/>
+    <w:bookmarkStart w:id="37" w:name="which-channel-where"/>
     <w:p>
       <w:pPr>
         <w:pStyle w:val="Heading3"/>
@@ -19757,7 +17752,7 @@
         <w:pStyle w:val="BodyText"/>
       </w:pPr>
       <w:r>
-        <w:t xml:space="preserve">A moving-load test with weighed trucks has been designed for this bridge, and Table 10 gives the predicted values that would decide between the reference calibrations. These are predictions, not results. The ratio of integrals at the side-span and centre-span deflection gauges is independent of truck weight and absolute rigidity, and it differs by a factor of 2.3 between calibrations A and B.</w:t>
+        <w:t xml:space="preserve">A moving-load test with weighed trucks has been designed for this bridge, and Table 6 gives the predicted values that would decide between the reference calibrations. These are predictions, not results. The ratio of integrals at the side-span and centre-span deflection gauges is independent of truck weight and absolute rigidity, and it differs by a factor of 2.3 between calibrations A and B.</w:t>
       </w:r>
     </w:p>
     <w:p>
@@ -19769,7 +17764,7 @@
           <w:bCs/>
           <w:b/>
         </w:rPr>
-        <w:t xml:space="preserve">Table 10.</w:t>
+        <w:t xml:space="preserve">Table 6.</w:t>
       </w:r>
       <w:r>
         <w:t xml:space="preserve"> </w:t>
@@ -20004,9 +17999,9 @@
         <w:t xml:space="preserve">The in-service girder shows that a side-span deflection gauge on a layout near the prismatic blind locus is not identifiable from static acceptance data, whereas a centre-span gauge is. One tiltmeter or one integral ratio would discriminate between the reference calibrations.</w:t>
       </w:r>
     </w:p>
+    <w:bookmarkEnd w:id="37"/>
     <w:bookmarkEnd w:id="38"/>
-    <w:bookmarkEnd w:id="39"/>
-    <w:bookmarkStart w:id="40" w:name="error-budget"/>
+    <w:bookmarkStart w:id="39" w:name="error-budget"/>
     <w:p>
       <w:pPr>
         <w:pStyle w:val="Heading2"/>
@@ -20020,7 +18015,7 @@
         <w:pStyle w:val="FirstParagraph"/>
       </w:pPr>
       <w:r>
-        <w:t xml:space="preserve">This section states the error terms of the integral estimator with their sensitivities and the values measured or assumed in this paper (Table 12). The budget is indicative, not an evaluation according to the Guide to the Expression of Uncertainty in Measurement (GUM): several entries are scenario ranges and the correlations between terms are not quantified.</w:t>
+        <w:t xml:space="preserve">This section states the error terms of the integral estimator with their sensitivities and the values measured or assumed in this paper. The budget is indicative, not an evaluation according to the Guide to the Expression of Uncertainty in Measurement (GUM): several entries are scenario ranges and the correlations between terms are not quantified.</w:t>
       </w:r>
     </w:p>
     <w:p>
@@ -20110,7 +18105,7 @@
         <w:pStyle w:val="BodyText"/>
       </w:pPr>
       <w:r>
-        <w:t xml:space="preserve">Table 11 evaluates Eq. (12) for the Cầu Mây gauges over the admissible set, with</w:t>
+        <w:t xml:space="preserve">Table 7 evaluates Eq. (12) for the Cầu Mây gauges over the admissible set, with</w:t>
       </w:r>
       <w:r>
         <w:t xml:space="preserve"> </w:t>
@@ -20157,7 +18152,7 @@
         <w:t xml:space="preserve"> </w:t>
       </w:r>
       <w:r>
-        <w:t xml:space="preserve">m and the mean weighed truck of 25.06 t. The smaller offsets in Table 11 are typical of displacement transducers. Absolute deflection on a 90 m span over water would usually come from a non-contact technique, whose residual offset after re-zeroing has to be established on site, since environmental effects act over the same window [51,52].</w:t>
+        <w:t xml:space="preserve">m and the mean weighed truck of 25.06 t. The smaller offsets in Table 7 are typical of displacement transducers. Absolute deflection on a 90 m span over water would usually come from a non-contact technique, whose residual offset after re-zeroing has to be established on site, since environmental effects act over the same window [51,52].</w:t>
       </w:r>
     </w:p>
     <w:p>
@@ -20197,7 +18192,7 @@
           <w:bCs/>
           <w:b/>
         </w:rPr>
-        <w:t xml:space="preserve">Table 11.</w:t>
+        <w:t xml:space="preserve">Table 7.</w:t>
       </w:r>
       <w:r>
         <w:t xml:space="preserve"> </w:t>
@@ -20698,7 +18693,7 @@
         <w:pStyle w:val="BodyText"/>
       </w:pPr>
       <w:r>
-        <w:t xml:space="preserve">Transverse position and multiple presence add further terms. On the five-span girder the far-lane constant was 0.79 of the near-lane value. At Cầu Mây the readings across one section spread by up to 2.05 mm in the eccentric N7 case, about 13 % of the mean reading.</w:t>
+        <w:t xml:space="preserve">Transverse position and multiple presence add further terms; Table 8 collects all terms. On the five-span girder the far-lane constant was 0.79 of the near-lane value. At Cầu Mây the readings across one section spread by up to 2.05 mm in the eccentric N7 case, about 13 % of the mean reading.</w:t>
       </w:r>
     </w:p>
     <w:p>
@@ -20718,7 +18713,7 @@
           <w:bCs/>
           <w:b/>
         </w:rPr>
-        <w:t xml:space="preserve">Table 12.</w:t>
+        <w:t xml:space="preserve">Table 8.</w:t>
       </w:r>
       <w:r>
         <w:t xml:space="preserve"> </w:t>
@@ -21204,7 +19199,7 @@
               <w:jc w:val="left"/>
             </w:pPr>
             <w:r>
-              <w:t xml:space="preserve">Table 11; field per-crossing SD of the gauge average predicted 19.8 % (day 2), 5.3 % (day 1)</w:t>
+              <w:t xml:space="preserve">Table 7; field per-crossing SD of the gauge average predicted 19.8 % (day 2), 5.3 % (day 1)</w:t>
             </w:r>
           </w:p>
         </w:tc>
@@ -21641,8 +19636,8 @@
         <w:t xml:space="preserve">The method is therefore proposed for preliminary overload screening, with the decision threshold set apart from the legal limit and the design live loads [53,54]. Setting that threshold needs field calibration with trucks of clearly different weights, which this study did not have.</w:t>
       </w:r>
     </w:p>
-    <w:bookmarkEnd w:id="40"/>
-    <w:bookmarkStart w:id="41" w:name="design-workflow-and-limitations"/>
+    <w:bookmarkEnd w:id="39"/>
+    <w:bookmarkStart w:id="40" w:name="design-workflow-and-limitations"/>
     <w:p>
       <w:pPr>
         <w:pStyle w:val="Heading2"/>
@@ -22465,8 +20460,8 @@
         <w:t xml:space="preserve">Several limitations remain. The laboratory beam had equal spans and statically positioned loads, and the blind configuration was not tested. The field assessment rests on one public dataset with four trucks, two axle counts, nearly constant reference weights and no gauge at a zero-moment point; it could not test weight discrimination, the deflection blind loci or a deflection pair. The in-service application uses static data and an Euler–Bernoulli beam model with an assumed depth law and equal pier springs. The treatment is one-dimensional along each lane.</w:t>
       </w:r>
     </w:p>
-    <w:bookmarkEnd w:id="41"/>
-    <w:bookmarkStart w:id="42" w:name="conclusions"/>
+    <w:bookmarkEnd w:id="40"/>
+    <w:bookmarkStart w:id="41" w:name="conclusions"/>
     <w:p>
       <w:pPr>
         <w:pStyle w:val="Heading2"/>
@@ -22734,8 +20729,8 @@
         <w:t xml:space="preserve">The next steps are the moving-load test designed for the in-service girder, laboratory tests of the blind configuration, and field calibration with trucks of clearly different weights.</w:t>
       </w:r>
     </w:p>
-    <w:bookmarkEnd w:id="42"/>
-    <w:bookmarkStart w:id="43" w:name="X456e826d03272217d785932542538504df7f2c0"/>
+    <w:bookmarkEnd w:id="41"/>
+    <w:bookmarkStart w:id="42" w:name="X456e826d03272217d785932542538504df7f2c0"/>
     <w:p>
       <w:pPr>
         <w:pStyle w:val="Heading2"/>
@@ -25072,8 +23067,8 @@
         </w:tc>
       </w:tr>
     </w:tbl>
-    <w:bookmarkEnd w:id="43"/>
-    <w:bookmarkStart w:id="44" w:name="X0ebc401f1b08b90996efef4e255e7d7d96e4ee0"/>
+    <w:bookmarkEnd w:id="42"/>
+    <w:bookmarkStart w:id="43" w:name="X0ebc401f1b08b90996efef4e255e7d7d96e4ee0"/>
     <w:p>
       <w:pPr>
         <w:pStyle w:val="Heading2"/>
@@ -26855,8 +24850,8 @@
         <w:t xml:space="preserve">is therefore constant, and the only freedom lies across channels. When the influence line is known, other invariant weighting functions exist; for two equal spans their white-noise variance is 1.5–6.6 times smaller, but a 20 % stiffness error in the adjacent span then produces configuration-dependent errors of −1.1 % to +2.0 % (Supplementary Material).</w:t>
       </w:r>
     </w:p>
-    <w:bookmarkEnd w:id="44"/>
-    <w:bookmarkStart w:id="45" w:name="X9dd822d35e64776c84c0a7f16a469d327c3e534"/>
+    <w:bookmarkEnd w:id="43"/>
+    <w:bookmarkStart w:id="44" w:name="X9dd822d35e64776c84c0a7f16a469d327c3e534"/>
     <w:p>
       <w:pPr>
         <w:pStyle w:val="Heading2"/>
@@ -27727,8 +25722,8 @@
         <w:t xml:space="preserve">; this determinant vanishes at the minimum of the ratio misfit, that is at calibration B. A frequency adds a row with the mass as nuisance parameter; a pier rotation adds a row without nuisance. Unequal pier stiffnesses would bring in the symmetric pattern, which Eq. (15) does not cover.</w:t>
       </w:r>
     </w:p>
-    <w:bookmarkEnd w:id="45"/>
-    <w:bookmarkStart w:id="46" w:name="computational-implementation"/>
+    <w:bookmarkEnd w:id="44"/>
+    <w:bookmarkStart w:id="45" w:name="computational-implementation"/>
     <w:p>
       <w:pPr>
         <w:pStyle w:val="Heading2"/>
@@ -27745,8 +25740,8 @@
         <w:t xml:space="preserve">All analyses were implemented by the authors in reproducible scripts: the closed forms and their FE verification, the multi-channel estimators, placement study and Monte Carlo simulation, the identifiability analysis of the in-service girder, the processing of the public field records and the laboratory evaluation. Generative artificial intelligence was used as an assistance tool during code development and debugging. Every equation and numerical output was checked independently against an analytical, finite element or convergence-based route, and the scripts and the console output of each run are provided as supplementary material.</w:t>
       </w:r>
     </w:p>
-    <w:bookmarkEnd w:id="46"/>
-    <w:bookmarkStart w:id="47" w:name="data-availability"/>
+    <w:bookmarkEnd w:id="45"/>
+    <w:bookmarkStart w:id="46" w:name="data-availability"/>
     <w:p>
       <w:pPr>
         <w:pStyle w:val="Heading2"/>
@@ -27763,8 +25758,8 @@
         <w:t xml:space="preserve">The field strain records analysed in Section 4 are publicly available in the NOR-BWIM dataset (figshare, https://doi.org/10.7294/26880898.v1, CC0) [48]. The laboratory deflection data are given in full in the Supplementary Material. The derived data behind every figure and table, the analysis scripts and the console output of each run are provided as supplementary material. The Cầu Mây load test was performed by an author of this paper, and the authors are permitted to publish the processed data (static deflection readings, truck positions, weighed truck masses and reported frequencies), which are available at [NEED VALUE: repository name and DOI].</w:t>
       </w:r>
     </w:p>
-    <w:bookmarkEnd w:id="47"/>
-    <w:bookmarkStart w:id="48" w:name="conflicts-of-interest"/>
+    <w:bookmarkEnd w:id="46"/>
+    <w:bookmarkStart w:id="47" w:name="conflicts-of-interest"/>
     <w:p>
       <w:pPr>
         <w:pStyle w:val="Heading2"/>
@@ -27781,8 +25776,8 @@
         <w:t xml:space="preserve">The Cầu Mây load test analysed in Section 5 was performed by the authors’ team as part of inspection work carried out by Công ty TNHH Tư vấn Đại học Xây dựng (HUCE consultancy) [NEED VALUE: name(s) of authors involved and nature of relationship]. The authors declare that there is no other conflict of interest regarding the publication of this article.</w:t>
       </w:r>
     </w:p>
-    <w:bookmarkEnd w:id="48"/>
-    <w:bookmarkStart w:id="49" w:name="funding-statement"/>
+    <w:bookmarkEnd w:id="47"/>
+    <w:bookmarkStart w:id="48" w:name="funding-statement"/>
     <w:p>
       <w:pPr>
         <w:pStyle w:val="Heading2"/>
@@ -27799,8 +25794,8 @@
         <w:t xml:space="preserve">This research did not receive any specific grant from funding agencies in the public, commercial or not-for-profit sectors. [NEED VALUE: name the employer under whose employment the work was performed, and the source of the article processing charge, if any.]</w:t>
       </w:r>
     </w:p>
-    <w:bookmarkEnd w:id="49"/>
-    <w:bookmarkStart w:id="50" w:name="author-contributions"/>
+    <w:bookmarkEnd w:id="48"/>
+    <w:bookmarkStart w:id="49" w:name="author-contributions"/>
     <w:p>
       <w:pPr>
         <w:pStyle w:val="Heading2"/>
@@ -27859,8 +25854,8 @@
         <w:t xml:space="preserve">Investigation, Data curation, Visualization, Writing – review &amp; editing.</w:t>
       </w:r>
     </w:p>
-    <w:bookmarkEnd w:id="50"/>
-    <w:bookmarkStart w:id="51" w:name="disclosure-of-generative-ai-use"/>
+    <w:bookmarkEnd w:id="49"/>
+    <w:bookmarkStart w:id="50" w:name="disclosure-of-generative-ai-use"/>
     <w:p>
       <w:pPr>
         <w:pStyle w:val="Heading2"/>
@@ -27877,8 +25872,8 @@
         <w:t xml:space="preserve">During the preparation of this work the authors used Claude (Anthropic) to assist with code development and debugging and with language editing. All scientific formulations, procedures, numerical results and interpretations were independently reviewed and verified by the authors, who take full responsibility for the content of the manuscript.</w:t>
       </w:r>
     </w:p>
-    <w:bookmarkEnd w:id="51"/>
-    <w:bookmarkStart w:id="52" w:name="acknowledgments"/>
+    <w:bookmarkEnd w:id="50"/>
+    <w:bookmarkStart w:id="51" w:name="acknowledgments"/>
     <w:p>
       <w:pPr>
         <w:pStyle w:val="Heading2"/>
@@ -27895,8 +25890,8 @@
         <w:t xml:space="preserve">The authors gratefully acknowledge the Laboratory of Transportation Technology and Systems, Faculty of Bridge and Road Engineering, Hanoi University of Civil Engineering, for providing the test facilities used in this study, and A. Moghadam and R. Sarlo for making the NOR-BWIM dataset publicly available. [NEED VALUE: whether to acknowledge Hai Duong PMU and the testing consultant for access to the acceptance-test report.]</w:t>
       </w:r>
     </w:p>
-    <w:bookmarkEnd w:id="52"/>
-    <w:bookmarkStart w:id="53" w:name="supplementary-materials"/>
+    <w:bookmarkEnd w:id="51"/>
+    <w:bookmarkStart w:id="52" w:name="supplementary-materials"/>
     <w:p>
       <w:pPr>
         <w:pStyle w:val="Heading2"/>
@@ -27910,7 +25905,7 @@
         <w:pStyle w:val="FirstParagraph"/>
       </w:pPr>
       <w:r>
-        <w:t xml:space="preserve">The supplementary material contains: (i) the analysis scripts and the console output of each run, with a README that maps every table and figure to a script and log; (ii) the derived data behind every figure and table; (iii) the laboratory specimen, influence line, quadrature study and full data; (iv) the full per-channel invariance table of the field records (23 channel and average rows, with all χ² p-values), the noise correlation matrices, the speed regressions and all estimator results, including in-sample values, GLS with the covariance estimated from crossing residuals, the predicted per-crossing standard deviation of every estimator, per-channel lane-B results and the confidence interval of the GLS superposition ratio (Figs. S1–S2); (v) the beam model of the five-span girder, including the strain constant of the gauges relative to the largest on the girder, and the synthetic records of the dataset authors (Figs. S3–S4); (vi) strain blind-locus maps (Figs. S5–S6); (vii) the multi-channel placement study (brute-force search over all cases), Monte Carlo verification and structure-aware weighting functions (Figs. S7–S9); (viii) the asymmetric three-span closed forms; (ix) the Cầu Mây design section properties and concrete modulus, the model-form variants (depth lengths, exponents, rigid pier zone), the frequency interpretation, admissible sets against tolerance (3 %, 4 % and 5.3 %, with and without a prior on</w:t>
+        <w:t xml:space="preserve">The supplementary material contains: (i) the analysis scripts and the console output of each run, with a README that maps every table and figure to a script and log; (ii) the derived data behind every figure and table; (iii) the laboratory specimen, influence line, quadrature study and full data; (iv) the field-record tables: per-channel constants and scatter with χ² tests (Table S1), truck-to-truck ratios with equivalence tests (Table S2), correlations of vehicle-free noise and crossing residuals (Table S3) and the per-crossing standard deviations predicted by both covariance models (Table S4); the processing details and excluded runs, the speed regressions, lane-B and two-truck results, and all estimator results including leave-one-truck-out, in-sample and GLS with the covariance estimated from crossing residuals (Figs. S1–S2); (v) the beam model of the five-span girder, including the strain constant of the gauges relative to the largest on the girder, and the synthetic records of the dataset authors (Figs. S3–S4); (vi) strain blind-locus maps (Figs. S5–S6); (vii) the multi-channel placement study (brute-force search over all cases), Monte Carlo verification and structure-aware weighting functions (Figs. S7–S9); (viii) the asymmetric three-span closed forms; (ix) the Cầu Mây design section properties and concrete modulus, the model-form variants (depth lengths, exponents, rigid pier zone), the frequency interpretation, admissible sets against tolerance (3 %, 4 % and 5.3 %, with and without a prior on</w:t>
       </w:r>
       <w:r>
         <w:t xml:space="preserve"> </w:t>
@@ -27961,8 +25956,8 @@
         <w:t xml:space="preserve">and the closed-form Möbius law (Figs. S10–S12); (x) the moving-force analysis behind the dynamic bound; (xi) the deflection records of two simply supported bridges, which illustrate baseline handling and low-pass filtering (Figs. S13–S14).</w:t>
       </w:r>
     </w:p>
-    <w:bookmarkEnd w:id="53"/>
-    <w:bookmarkStart w:id="54" w:name="references"/>
+    <w:bookmarkEnd w:id="52"/>
+    <w:bookmarkStart w:id="53" w:name="references"/>
     <w:p>
       <w:pPr>
         <w:pStyle w:val="Heading2"/>
@@ -28403,8 +26398,8 @@
         <w:t xml:space="preserve">[54] AASHTO, LRFD Bridge Design Specifications, 10th ed., American Association of State Highway and Transportation Officials, Washington, DC, 2024.</w:t>
       </w:r>
     </w:p>
-    <w:bookmarkEnd w:id="54"/>
-    <w:bookmarkStart w:id="79" w:name="figures"/>
+    <w:bookmarkEnd w:id="53"/>
+    <w:bookmarkStart w:id="78" w:name="figures"/>
     <w:p>
       <w:pPr>
         <w:pStyle w:val="Heading2"/>
@@ -28622,18 +26617,18 @@
           <wp:inline>
             <wp:extent cx="5753100" cy="2363323"/>
             <wp:effectExtent b="0" l="0" r="0" t="0"/>
-            <wp:docPr descr="" title="" id="56" name="Picture"/>
+            <wp:docPr descr="" title="" id="55" name="Picture"/>
             <a:graphic>
               <a:graphicData uri="http://schemas.openxmlformats.org/drawingml/2006/picture">
                 <pic:pic>
                   <pic:nvPicPr>
-                    <pic:cNvPr descr="/home/user/SHM-Paper1-1D/manuscript/v4/figures/Fig2_obs_map_3span.png" id="57" name="Picture"/>
+                    <pic:cNvPr descr="/home/user/SHM-Paper1-1D/manuscript/v4/figures/Fig2_obs_map_3span.png" id="56" name="Picture"/>
                     <pic:cNvPicPr>
                       <a:picLocks noChangeArrowheads="1" noChangeAspect="1"/>
                     </pic:cNvPicPr>
                   </pic:nvPicPr>
                   <pic:blipFill>
-                    <a:blip r:embed="rId55"/>
+                    <a:blip r:embed="rId54"/>
                     <a:stretch>
                       <a:fillRect/>
                     </a:stretch>
@@ -28895,18 +26890,18 @@
           <wp:inline>
             <wp:extent cx="5753100" cy="2121274"/>
             <wp:effectExtent b="0" l="0" r="0" t="0"/>
-            <wp:docPr descr="" title="" id="59" name="Picture"/>
+            <wp:docPr descr="" title="" id="58" name="Picture"/>
             <a:graphic>
               <a:graphicData uri="http://schemas.openxmlformats.org/drawingml/2006/picture">
                 <pic:pic>
                   <pic:nvPicPr>
-                    <pic:cNvPr descr="/home/user/SHM-Paper1-1D/manuscript/v4/figures/Fig3_channels_prismatic.png" id="60" name="Picture"/>
+                    <pic:cNvPr descr="/home/user/SHM-Paper1-1D/manuscript/v4/figures/Fig3_channels_prismatic.png" id="59" name="Picture"/>
                     <pic:cNvPicPr>
                       <a:picLocks noChangeArrowheads="1" noChangeAspect="1"/>
                     </pic:cNvPicPr>
                   </pic:nvPicPr>
                   <pic:blipFill>
-                    <a:blip r:embed="rId58"/>
+                    <a:blip r:embed="rId57"/>
                     <a:stretch>
                       <a:fillRect/>
                     </a:stretch>
@@ -29099,18 +27094,18 @@
           <wp:inline>
             <wp:extent cx="5753100" cy="2635498"/>
             <wp:effectExtent b="0" l="0" r="0" t="0"/>
-            <wp:docPr descr="" title="" id="62" name="Picture"/>
+            <wp:docPr descr="" title="" id="61" name="Picture"/>
             <a:graphic>
               <a:graphicData uri="http://schemas.openxmlformats.org/drawingml/2006/picture">
                 <pic:pic>
                   <pic:nvPicPr>
-                    <pic:cNvPr descr="/home/user/SHM-Paper1-1D/manuscript/v4/figures/Fig4_multichannel_gain.png" id="63" name="Picture"/>
+                    <pic:cNvPr descr="/home/user/SHM-Paper1-1D/manuscript/v4/figures/Fig4_multichannel_gain.png" id="62" name="Picture"/>
                     <pic:cNvPicPr>
                       <a:picLocks noChangeArrowheads="1" noChangeAspect="1"/>
                     </pic:cNvPicPr>
                   </pic:nvPicPr>
                   <pic:blipFill>
-                    <a:blip r:embed="rId61"/>
+                    <a:blip r:embed="rId60"/>
                     <a:stretch>
                       <a:fillRect/>
                     </a:stretch>
@@ -29221,18 +27216,18 @@
           <wp:inline>
             <wp:extent cx="5753100" cy="5992812"/>
             <wp:effectExtent b="0" l="0" r="0" t="0"/>
-            <wp:docPr descr="" title="" id="65" name="Picture"/>
+            <wp:docPr descr="" title="" id="64" name="Picture"/>
             <a:graphic>
               <a:graphicData uri="http://schemas.openxmlformats.org/drawingml/2006/picture">
                 <pic:pic>
                   <pic:nvPicPr>
-                    <pic:cNvPr descr="/home/user/SHM-Paper1-1D/manuscript/v4/figures/Fig5_norbwim_crossings.png" id="66" name="Picture"/>
+                    <pic:cNvPr descr="/home/user/SHM-Paper1-1D/manuscript/v4/figures/Fig5_norbwim_crossings.png" id="65" name="Picture"/>
                     <pic:cNvPicPr>
                       <a:picLocks noChangeArrowheads="1" noChangeAspect="1"/>
                     </pic:cNvPicPr>
                   </pic:nvPicPr>
                   <pic:blipFill>
-                    <a:blip r:embed="rId64"/>
+                    <a:blip r:embed="rId63"/>
                     <a:stretch>
                       <a:fillRect/>
                     </a:stretch>
@@ -29318,18 +27313,18 @@
           <wp:inline>
             <wp:extent cx="5753100" cy="2556933"/>
             <wp:effectExtent b="0" l="0" r="0" t="0"/>
-            <wp:docPr descr="" title="" id="68" name="Picture"/>
+            <wp:docPr descr="" title="" id="67" name="Picture"/>
             <a:graphic>
               <a:graphicData uri="http://schemas.openxmlformats.org/drawingml/2006/picture">
                 <pic:pic>
                   <pic:nvPicPr>
-                    <pic:cNvPr descr="/home/user/SHM-Paper1-1D/manuscript/v4/figures/Fig6_norbwim_invariance.png" id="69" name="Picture"/>
+                    <pic:cNvPr descr="/home/user/SHM-Paper1-1D/manuscript/v4/figures/Fig6_norbwim_invariance.png" id="68" name="Picture"/>
                     <pic:cNvPicPr>
                       <a:picLocks noChangeArrowheads="1" noChangeAspect="1"/>
                     </pic:cNvPicPr>
                   </pic:nvPicPr>
                   <pic:blipFill>
-                    <a:blip r:embed="rId67"/>
+                    <a:blip r:embed="rId66"/>
                     <a:stretch>
                       <a:fillRect/>
                     </a:stretch>
@@ -29383,18 +27378,18 @@
           <wp:inline>
             <wp:extent cx="5753100" cy="2556933"/>
             <wp:effectExtent b="0" l="0" r="0" t="0"/>
-            <wp:docPr descr="" title="" id="71" name="Picture"/>
+            <wp:docPr descr="" title="" id="70" name="Picture"/>
             <a:graphic>
               <a:graphicData uri="http://schemas.openxmlformats.org/drawingml/2006/picture">
                 <pic:pic>
                   <pic:nvPicPr>
-                    <pic:cNvPr descr="/home/user/SHM-Paper1-1D/manuscript/v4/figures/Fig7_norbwim_estimators.png" id="72" name="Picture"/>
+                    <pic:cNvPr descr="/home/user/SHM-Paper1-1D/manuscript/v4/figures/Fig7_norbwim_estimators.png" id="71" name="Picture"/>
                     <pic:cNvPicPr>
                       <a:picLocks noChangeArrowheads="1" noChangeAspect="1"/>
                     </pic:cNvPicPr>
                   </pic:nvPicPr>
                   <pic:blipFill>
-                    <a:blip r:embed="rId70"/>
+                    <a:blip r:embed="rId69"/>
                     <a:stretch>
                       <a:fillRect/>
                     </a:stretch>
@@ -29459,18 +27454,18 @@
           <wp:inline>
             <wp:extent cx="5753100" cy="6036736"/>
             <wp:effectExtent b="0" l="0" r="0" t="0"/>
-            <wp:docPr descr="" title="" id="74" name="Picture"/>
+            <wp:docPr descr="" title="" id="73" name="Picture"/>
             <a:graphic>
               <a:graphicData uri="http://schemas.openxmlformats.org/drawingml/2006/picture">
                 <pic:pic>
                   <pic:nvPicPr>
-                    <pic:cNvPr descr="/home/user/SHM-Paper1-1D/manuscript/v4/figures/Fig8_caumay_channels.png" id="75" name="Picture"/>
+                    <pic:cNvPr descr="/home/user/SHM-Paper1-1D/manuscript/v4/figures/Fig8_caumay_channels.png" id="74" name="Picture"/>
                     <pic:cNvPicPr>
                       <a:picLocks noChangeArrowheads="1" noChangeAspect="1"/>
                     </pic:cNvPicPr>
                   </pic:nvPicPr>
                   <pic:blipFill>
-                    <a:blip r:embed="rId73"/>
+                    <a:blip r:embed="rId72"/>
                     <a:stretch>
                       <a:fillRect/>
                     </a:stretch>
@@ -29607,18 +27602,18 @@
           <wp:inline>
             <wp:extent cx="5753100" cy="4881418"/>
             <wp:effectExtent b="0" l="0" r="0" t="0"/>
-            <wp:docPr descr="" title="" id="77" name="Picture"/>
+            <wp:docPr descr="" title="" id="76" name="Picture"/>
             <a:graphic>
               <a:graphicData uri="http://schemas.openxmlformats.org/drawingml/2006/picture">
                 <pic:pic>
                   <pic:nvPicPr>
-                    <pic:cNvPr descr="/home/user/SHM-Paper1-1D/manuscript/v4/figures/Fig9_caumay_identifiability.png" id="78" name="Picture"/>
+                    <pic:cNvPr descr="/home/user/SHM-Paper1-1D/manuscript/v4/figures/Fig9_caumay_identifiability.png" id="77" name="Picture"/>
                     <pic:cNvPicPr>
                       <a:picLocks noChangeArrowheads="1" noChangeAspect="1"/>
                     </pic:cNvPicPr>
                   </pic:nvPicPr>
                   <pic:blipFill>
-                    <a:blip r:embed="rId76"/>
+                    <a:blip r:embed="rId75"/>
                     <a:stretch>
                       <a:fillRect/>
                     </a:stretch>
@@ -29849,8 +27844,8 @@
         <w:t xml:space="preserve">.</w:t>
       </w:r>
     </w:p>
+    <w:bookmarkEnd w:id="78"/>
     <w:bookmarkEnd w:id="79"/>
-    <w:bookmarkEnd w:id="80"/>
     <w:sectPr>
       <w:footerReference r:id="rId9" w:type="default"/>
       <w:pgSz w:h="16838" w:w="11906"/>

</xml_diff>

<commit_message>
v4.4: restore hedges and evidence lost in Section 4 cut (post-edit check), cite Table S5, fix supplementary cross-reference
Co-Authored-By: Claude Opus 5.5 <noreply@anthropic.com>
Claude-Session: https://claude.ai/code/session_01LGLpDzAMfdMgWcXQjLxauw
</commit_message>
<xml_diff>
--- a/manuscript/v4/word/Manuscript_v4.docx
+++ b/manuscript/v4/word/Manuscript_v4.docx
@@ -14234,7 +14234,7 @@
         <w:pStyle w:val="FirstParagraph"/>
       </w:pPr>
       <w:r>
-        <w:t xml:space="preserve">This section asks what integral estimators deliver on real moving-load records from a continuous girder. It reports the main results with 95 % confidence intervals (CIs) and compares single- and multi-channel estimators out of sample. The per-channel tables, the equivalence tests, the noise correlations and the speed regressions are in the Supplementary Material (Tables S1–S4).</w:t>
+        <w:t xml:space="preserve">This section asks what integral estimators deliver on real moving-load records from a continuous girder. It reports the main results with 95 % confidence intervals (CIs) and compares single- and multi-channel estimators out of sample. The per-channel tables, the equivalence tests, the noise correlations and the full estimator table are in Supplementary Tables S1–S5, and the speed regressions in Supplementary Fig. S2.</w:t>
       </w:r>
     </w:p>
     <w:bookmarkStart w:id="30" w:name="data-and-reference-weights"/>
@@ -14366,7 +14366,7 @@
         <w:pStyle w:val="FirstParagraph"/>
       </w:pPr>
       <w:r>
-        <w:t xml:space="preserve">The constant is stable within the noise for most gauges, but invariance between trucks can be shown only within margins of 10–27 %. On day 1, eight of the twelve gauges scatter as much as the measured noise predicts, and one gauge, ch11, gives the same constant for both trucks within ±10 % (Fig. 6a).</w:t>
+        <w:t xml:space="preserve">The constant is stable within the noise for most gauges, but invariance between trucks can be shown only within margins of 10–27 %. On day 1, the χ² test accepts consistency with the measured noise for eight of the twelve gauges, but only one gauge, ch11, shows that both trucks give the same constant within ±10 % (Fig. 6a).</w:t>
       </w:r>
     </w:p>
     <w:p>
@@ -14374,7 +14374,7 @@
         <w:pStyle w:val="BodyText"/>
       </w:pPr>
       <w:r>
-        <w:t xml:space="preserve">The four gauges without axle spikes fail this test: their constant is 22–26 % lower for the second truck. On day 1, however, speed and truck are almost perfectly confounded (correlation 0.98), so the difference may reflect a different wheel path, local deck action or speed.</w:t>
+        <w:t xml:space="preserve">The four gauges without axle spikes fail the invariance test: their constant is 22–26 % lower for the second truck, and the 95 % CIs of the ratio exclude 1. On day 1, however, speed and truck are almost perfectly confounded (correlation 0.98), so the difference may reflect a different wheel path, local deck action or speed.</w:t>
       </w:r>
     </w:p>
     <w:p>
@@ -14382,7 +14382,7 @@
         <w:pStyle w:val="BodyText"/>
       </w:pPr>
       <w:r>
-        <w:t xml:space="preserve">On day 2, the ratio of the gauge-average constants of the 5-axle and the 3-axle truck is 0.98 (95 % CI 0.70–1.37; Fig. 6b). The result is consistent with Eq. (2), but with eight runs it cannot exclude differences of up to about 27 %. It is therefore a coarse check of linearity and processing, not a sharp test of the identity. No speed effect was resolved.</w:t>
+        <w:t xml:space="preserve">On day 2, the ratio of the gauge-average constants of the 5-axle and the 3-axle truck is 0.98 (95 % CI 0.70–1.37; Fig. 6b). The result is consistent with Eq. (2), but with eight runs it cannot exclude differences of up to about 27 %. It is therefore a coarse check of linearity and processing, not a sharp test of the identity. No speed effect was resolved, but the confidence interval of the slope is too wide to call the constant speed-independent (Supplementary Fig. S2).</w:t>
       </w:r>
     </w:p>
     <w:p>
@@ -14390,7 +14390,7 @@
         <w:pStyle w:val="BodyText"/>
       </w:pPr>
       <w:r>
-        <w:t xml:space="preserve">Each lane needs its own constant. For the gauge average, return trips in lane B gave constants 0.79 times those of lane A (95 % CI 0.59–1.00), as also found on another continuous girder [40]. The two in-line two-truck runs gave 0.92 of the summed single-truck predictions, consistent with superposition.</w:t>
+        <w:t xml:space="preserve">Each lane needs its own constant. For the gauge average, return trips in lane B gave constants 0.79 times those of lane A (95 % CI 0.59–1.00), as also found on another continuous girder [40]. The lane effect is clearly resolved for one gauge only (st36: 0.64, 95 % CI 0.47–0.81). For the gauge average, the two in-line two-truck runs gave 0.92 of the summed single-truck predictions (pooled 95 % CI 0.77–1.06), consistent with superposition although both fall below the prediction.</w:t>
       </w:r>
     </w:p>
     <w:p>
@@ -14398,7 +14398,7 @@
         <w:pStyle w:val="BodyText"/>
       </w:pPr>
       <w:r>
-        <w:t xml:space="preserve">Each deck gauge also needs its own constant. On day 1 the constant of ch11 is 3.9 times that of ch8, although the two gauges are within 6 m of each other and a one-dimensional beam model predicts nearly equal constants. The ratio of the st36 and st40 constants also changes with the lane, so gauge-factor spread is an unlikely cause; the deck-soffit gauges respond to slab bending and shear lag as well as to girder bending. The constant must therefore come from a weighed reference vehicle or a three-dimensional model, and a beam-model BPM would fail.</w:t>
+        <w:t xml:space="preserve">Each deck gauge also needs its own constant. On day 1 the constant of ch11 is 3.9 times that of ch8, although the two gauges are within 6 m of each other and a one-dimensional beam model predicts nearly equal constants. The ratio of the st36 and st40 constants also changes with the lane, by about 2.5 standard errors, so gauge-factor spread is an unlikely cause; the deck-soffit gauges respond to slab bending and shear lag as well as to girder bending. The constant must therefore come from a weighed reference vehicle or a three-dimensional model, and a beam-model BPM would fail.</w:t>
       </w:r>
     </w:p>
     <w:p>
@@ -14406,7 +14406,27 @@
         <w:pStyle w:val="BodyText"/>
       </w:pPr>
       <w:r>
-        <w:t xml:space="preserve">A beam model of the girder nevertheless explains two global features. The gauges are not blind: the zeros of the uniform-load moment diagram in span 2 lie about 35 m from them. The whole 605 m crossing must be integrated, because span 2 contributes about 170 % of the net integral and the adjacent spans cancel the excess.</w:t>
+        <w:t xml:space="preserve">A beam model of the girder nevertheless reproduces the global shape of the strain histories (</w:t>
+      </w:r>
+      <m:oMath>
+        <m:sSup>
+          <m:e>
+            <m:r>
+              <m:t>r</m:t>
+            </m:r>
+          </m:e>
+          <m:sup>
+            <m:r>
+              <m:t>2</m:t>
+            </m:r>
+          </m:sup>
+        </m:sSup>
+      </m:oMath>
+      <w:r>
+        <w:t xml:space="preserve"> </w:t>
+      </w:r>
+      <w:r>
+        <w:t xml:space="preserve">= 0.79–0.94) and explains two features. The gauges are not blind: the zeros of the uniform-load moment diagram in span 2 lie about 35 m from them. The whole 605 m crossing must be integrated, because span 2 contributes about 170 % of the net integral and the adjacent spans −26 % and −66 %.</w:t>
       </w:r>
     </w:p>
     <w:bookmarkEnd w:id="31"/>
@@ -14456,7 +14476,7 @@
         <w:t xml:space="preserve"> </w:t>
       </w:r>
       <w:r>
-        <w:t xml:space="preserve">Mean absolute error of the gross weight (% of GVW), leave-one-run-out, with 95 % bootstrap CIs over the test runs (n = 8 on day 2, n = 7 on day 1). Leave-one-truck-out and in-sample results are in the Supplementary Material.</w:t>
+        <w:t xml:space="preserve">Mean absolute error of the gross weight (% of GVW), leave-one-run-out, with 95 % bootstrap CIs over the test runs (n = 8 on day 2, n = 7 on day 1). Leave-one-truck-out results and the four wheel-path gauges of day 1: Supplementary Table S5.</w:t>
       </w:r>
     </w:p>
     <w:tbl>
@@ -14956,7 +14976,21 @@
         <w:pStyle w:val="BodyText"/>
       </w:pPr>
       <w:r>
-        <w:t xml:space="preserve">Each crossing thus carries a gauge-specific component, plausibly from the wheel path and local slab action, and GLS amplifies it by giving st40 and st36 large weights of opposite sign. As anticipated in Section 2.4, the zero-sum estimator helps only when the disturbance is common-mode during the crossings themselves.</w:t>
+        <w:t xml:space="preserve">Each crossing thus carries a gauge-specific component, plausibly from the wheel path and local slab action, and GLS amplifies it by giving st40 and st36 large weights of opposite sign. Estimating</w:t>
+      </w:r>
+      <w:r>
+        <w:t xml:space="preserve"> </w:t>
+      </w:r>
+      <m:oMath>
+        <m:r>
+          <m:t>Σ</m:t>
+        </m:r>
+      </m:oMath>
+      <w:r>
+        <w:t xml:space="preserve"> </w:t>
+      </w:r>
+      <w:r>
+        <w:t xml:space="preserve">from the crossing residuals instead over-fits with only eight runs (Supplementary Material). As anticipated in Section 2.4, the zero-sum estimator helps only when the disturbance is common-mode during the crossings themselves.</w:t>
       </w:r>
     </w:p>
     <w:bookmarkEnd w:id="32"/>
@@ -25905,7 +25939,7 @@
         <w:pStyle w:val="FirstParagraph"/>
       </w:pPr>
       <w:r>
-        <w:t xml:space="preserve">The supplementary material contains: (i) the analysis scripts and the console output of each run, with a README that maps every table and figure to a script and log; (ii) the derived data behind every figure and table; (iii) the laboratory specimen, influence line, quadrature study and full data; (iv) the field-record tables: per-channel constants and scatter with χ² tests (Table S1), truck-to-truck ratios with equivalence tests (Table S2), correlations of vehicle-free noise and crossing residuals (Table S3) and the per-crossing standard deviations predicted by both covariance models (Table S4); the processing details and excluded runs, the speed regressions, lane-B and two-truck results, and all estimator results including leave-one-truck-out, in-sample and GLS with the covariance estimated from crossing residuals (Figs. S1–S2); (v) the beam model of the five-span girder, including the strain constant of the gauges relative to the largest on the girder, and the synthetic records of the dataset authors (Figs. S3–S4); (vi) strain blind-locus maps (Figs. S5–S6); (vii) the multi-channel placement study (brute-force search over all cases), Monte Carlo verification and structure-aware weighting functions (Figs. S7–S9); (viii) the asymmetric three-span closed forms; (ix) the Cầu Mây design section properties and concrete modulus, the model-form variants (depth lengths, exponents, rigid pier zone), the frequency interpretation, admissible sets against tolerance (3 %, 4 % and 5.3 %, with and without a prior on</w:t>
+        <w:t xml:space="preserve">The supplementary material contains: (i) the analysis scripts and the console output of each run, with a README that maps every table and figure to a script and log; (ii) the derived data behind every figure and table; (iii) the laboratory specimen, influence line, quadrature study and full data; (iv) the field-record tables: per-channel constants and scatter with χ² tests (Table S1), truck-to-truck ratios with equivalence tests (Table S2), correlations of vehicle-free noise and crossing residuals (Table S3) the per-crossing standard deviations predicted by both covariance models (Table S4) and the full table of estimator errors (Table S5); the processing details and excluded runs, the speed regressions, lane-B and two-truck results, and all estimator results including leave-one-truck-out, in-sample and GLS with the covariance estimated from crossing residuals (Figs. S1–S2); (v) the beam model of the five-span girder, including the strain constant of the gauges relative to the largest on the girder, and the synthetic records of the dataset authors (Figs. S3–S4); (vi) strain blind-locus maps (Figs. S5–S6); (vii) the multi-channel placement study (brute-force search over all cases), Monte Carlo verification and structure-aware weighting functions (Figs. S7–S9); (viii) the asymmetric three-span closed forms; (ix) the Cầu Mây design section properties and concrete modulus, the model-form variants (depth lengths, exponents, rigid pier zone), the frequency interpretation, admissible sets against tolerance (3 %, 4 % and 5.3 %, with and without a prior on</w:t>
       </w:r>
       <w:r>
         <w:t xml:space="preserve"> </w:t>

</xml_diff>

<commit_message>
v4.4: cite Deng et al. 2025 (absolute-area influence-line weighing on a continuous rigid-frame bridge); renumber references 44-55
Co-Authored-By: Claude Opus 5.5 <noreply@anthropic.com>
Claude-Session: https://claude.ai/code/session_01LGLpDzAMfdMgWcXQjLxauw
</commit_message>
<xml_diff>
--- a/manuscript/v4/word/Manuscript_v4.docx
+++ b/manuscript/v4/word/Manuscript_v4.docx
@@ -3652,7 +3652,7 @@
         <w:pStyle w:val="BodyText"/>
       </w:pPr>
       <w:r>
-        <w:t xml:space="preserve">On continuous girders, however, the influence line changes sign over each interior support, and positive and negative areas partly cancel. Gross weight has been obtained without influence lines from distributed fibre-optic strain on a five-span continuous bridge [39]. Lane-specific influence lines were needed on a continuous multi-girder bridge [40], and long-span continuous box girders have been weighed from deck strain [41–43]. Optimal sensor placement for BWIM has been posed through an augmented Kalman filter [44], deflection-based load identification as a regularised stochastic problem [45,46], and measured deflection influence lines have been inverted for the stiffness of continuous girders [47]. None of these studies gives a criterion, available before installation, that says which channel at which position can observe the total load at all, how robustly to uncertain boundary conditions, and what a multi-channel integral estimator can deliver on real records.</w:t>
+        <w:t xml:space="preserve">On continuous girders, however, the influence line changes sign over each interior support, and positive and negative areas partly cancel. Gross weight has been obtained without influence lines from distributed fibre-optic strain on a five-span continuous bridge [39]. Lane-specific influence lines were needed on a continuous multi-girder bridge [40], and long-span continuous box girders have been weighed from deck strain [41–43]. Deng et al. used the area under displacement influence lines of a continuous rigid-frame bridge and, because the net area of a multi-span influence line is small, replaced it by the area of its absolute value [44]. Optimal sensor placement for BWIM has been posed through an augmented Kalman filter [45], deflection-based load identification as a regularised stochastic problem [46,47], and measured deflection influence lines have been inverted for the stiffness of continuous girders [48]. None of these studies gives a criterion, available before installation, that says which channel at which position can observe the total load at all, how robustly to uncertain boundary conditions, and what a multi-channel integral estimator can deliver on real records.</w:t>
       </w:r>
     </w:p>
     <w:p>
@@ -14251,7 +14251,7 @@
         <w:pStyle w:val="FirstParagraph"/>
       </w:pPr>
       <w:r>
-        <w:t xml:space="preserve">The Nothing-on-Road BWIM (NOR-BWIM) dataset [48] (CC0 licence) contains strain records of the Virginia Smart Road Bridge, documented in [41–43,49]. The bridge is a post-tensioned concrete box girder continuous over five spans of 86.5 + 3 × 144 + 86.5 m = 605 m. Strain transducers on the soffit of the top slab lie near mid-span of span 2, 158.5 m from the first abutment, in longitudinal stations about 2 m apart under the wheel path.</w:t>
+        <w:t xml:space="preserve">The Nothing-on-Road BWIM (NOR-BWIM) dataset [49] (CC0 licence) contains strain records of the Virginia Smart Road Bridge, documented in [41–43,50]. The bridge is a post-tensioned concrete box girder continuous over five spans of 86.5 + 3 × 144 + 86.5 m = 605 m. Strain transducers on the soffit of the top slab lie near mid-span of span 2, 158.5 m from the first abutment, in longitudinal stations about 2 m apart under the wheel path.</w:t>
       </w:r>
     </w:p>
     <w:p>
@@ -14300,7 +14300,7 @@
         <w:pStyle w:val="BodyText"/>
       </w:pPr>
       <w:r>
-        <w:t xml:space="preserve">The reference weights differ in quality between the days. On day 1, two 3-axle trucks ran in the instrumented lane, and their gross weights were reported by the drivers [49]. On day 2, a 3-axle truck of 26.8 t and a 5-axle truck of 25.9 t were weighed on a static scale [49]. They ran in the instrumented lane (lane A), on the return trip in the other lane (lane B), and in two in-line two-truck runs.</w:t>
+        <w:t xml:space="preserve">The reference weights differ in quality between the days. On day 1, two 3-axle trucks ran in the instrumented lane, and their gross weights were reported by the drivers [50]. On day 2, a 3-axle truck of 26.8 t and a 5-axle truck of 25.9 t were weighed on a static scale [50]. They ran in the instrumented lane (lane A), on the return trip in the other lane (lane B), and in two in-line two-truck runs.</w:t>
       </w:r>
     </w:p>
     <w:p>
@@ -18131,7 +18131,7 @@
         </m:sSub>
       </m:oMath>
       <w:r>
-        <w:t xml:space="preserve">, is at least 8, and it exceeds 15 % below 2.5 [50]. This bound omits vehicle–bridge interaction and road roughness.</w:t>
+        <w:t xml:space="preserve">, is at least 8, and it exceeds 15 % below 2.5 [51]. This bound omits vehicle–bridge interaction and road roughness.</w:t>
       </w:r>
     </w:p>
     <w:p>
@@ -18186,7 +18186,7 @@
         <w:t xml:space="preserve"> </w:t>
       </w:r>
       <w:r>
-        <w:t xml:space="preserve">m and the mean weighed truck of 25.06 t. The smaller offsets in Table 7 are typical of displacement transducers. Absolute deflection on a 90 m span over water would usually come from a non-contact technique, whose residual offset after re-zeroing has to be established on site, since environmental effects act over the same window [51,52].</w:t>
+        <w:t xml:space="preserve">m and the mean weighed truck of 25.06 t. The smaller offsets in Table 7 are typical of displacement transducers. Absolute deflection on a 90 m span over water would usually come from a non-contact technique, whose residual offset after re-zeroing has to be established on site, since environmental effects act over the same window [52,53].</w:t>
       </w:r>
     </w:p>
     <w:p>
@@ -19667,7 +19667,7 @@
         <w:pStyle w:val="BodyText"/>
       </w:pPr>
       <w:r>
-        <w:t xml:space="preserve">The method is therefore proposed for preliminary overload screening, with the decision threshold set apart from the legal limit and the design live loads [53,54]. Setting that threshold needs field calibration with trucks of clearly different weights, which this study did not have.</w:t>
+        <w:t xml:space="preserve">The method is therefore proposed for preliminary overload screening, with the decision threshold set apart from the legal limit and the design live loads [54,55]. Setting that threshold needs field calibration with trucks of clearly different weights, which this study did not have.</w:t>
       </w:r>
     </w:p>
     <w:bookmarkEnd w:id="39"/>
@@ -24881,7 +24881,7 @@
         <w:t xml:space="preserve"> </w:t>
       </w:r>
       <w:r>
-        <w:t xml:space="preserve">is therefore constant, and the only freedom lies across channels. When the influence line is known, other invariant weighting functions exist; for two equal spans their white-noise variance is 1.5–6.6 times smaller, but a 20 % stiffness error in the adjacent span then produces configuration-dependent errors of −1.1 % to +2.0 % (Supplementary Material).</w:t>
+        <w:t xml:space="preserve">is therefore constant, and the only freedom lies across channels. An estimate built on the absolute value of the record [44] is not linear in the axle loads, so it loses this invariance whenever contributions of opposite sign overlap. When the influence line is known, other invariant weighting functions exist; for two equal spans their white-noise variance is 1.5–6.6 times smaller, but a 20 % stiffness error in the adjacent span then produces configuration-dependent errors of −1.1 % to +2.0 % (Supplementary Material).</w:t>
       </w:r>
     </w:p>
     <w:bookmarkEnd w:id="43"/>
@@ -25789,7 +25789,7 @@
         <w:pStyle w:val="FirstParagraph"/>
       </w:pPr>
       <w:r>
-        <w:t xml:space="preserve">The field strain records analysed in Section 4 are publicly available in the NOR-BWIM dataset (figshare, https://doi.org/10.7294/26880898.v1, CC0) [48]. The laboratory deflection data are given in full in the Supplementary Material. The derived data behind every figure and table, the analysis scripts and the console output of each run are provided as supplementary material. The Cầu Mây load test was performed by an author of this paper, and the authors are permitted to publish the processed data (static deflection readings, truck positions, weighed truck masses and reported frequencies), which are available at [NEED VALUE: repository name and DOI].</w:t>
+        <w:t xml:space="preserve">The field strain records analysed in Section 4 are publicly available in the NOR-BWIM dataset (figshare, https://doi.org/10.7294/26880898.v1, CC0) [49]. The laboratory deflection data are given in full in the Supplementary Material. The derived data behind every figure and table, the analysis scripts and the console output of each run are provided as supplementary material. The Cầu Mây load test was performed by an author of this paper, and the authors are permitted to publish the processed data (static deflection readings, truck positions, weighed truck masses and reported frequencies), which are available at [NEED VALUE: repository name and DOI].</w:t>
       </w:r>
     </w:p>
     <w:bookmarkEnd w:id="46"/>
@@ -26349,7 +26349,7 @@
         <w:pStyle w:val="BodyText"/>
       </w:pPr>
       <w:r>
-        <w:t xml:space="preserve">[44] C. Zhou, C. Demartino, Y. Narazaki, Y. Xu, E. Chatzi, B.F. Spencer, Optimal sensor placement for bridge weigh-in-motion using an augmented Kalman filter, Mech. Syst. Signal Process. 241 (2025) 113522. https://doi.org/10.1016/j.ymssp.2025.113522</w:t>
+        <w:t xml:space="preserve">[44] L. Deng, P. Liu, T. Huang, S. Kaewunruen, A novel moving load identification method for continuous rigid-frame bridges using a field-based displacement influence line, Appl. Sci. 15 (11) (2025) 6028. https://doi.org/10.3390/app15116028</w:t>
       </w:r>
     </w:p>
     <w:p>
@@ -26357,7 +26357,7 @@
         <w:pStyle w:val="BodyText"/>
       </w:pPr>
       <w:r>
-        <w:t xml:space="preserve">[45] J. Zhang, Y. Liu, X. Fan, An AR(1)-Tikhonov-SVD-GCV framework for stochastic moving load identification driven by bridge multi-point deflection data, Structures 88 (2026) 111844. https://doi.org/10.1016/j.istruc.2026.111844</w:t>
+        <w:t xml:space="preserve">[45] C. Zhou, C. Demartino, Y. Narazaki, Y. Xu, E. Chatzi, B.F. Spencer, Optimal sensor placement for bridge weigh-in-motion using an augmented Kalman filter, Mech. Syst. Signal Process. 241 (2025) 113522. https://doi.org/10.1016/j.ymssp.2025.113522</w:t>
       </w:r>
     </w:p>
     <w:p>
@@ -26365,7 +26365,7 @@
         <w:pStyle w:val="BodyText"/>
       </w:pPr>
       <w:r>
-        <w:t xml:space="preserve">[46] Z. Shen, W. Peng, X. Zhang, et al., A lightweight weigh-in-motion system based on vehicle-induced bridge deflection and impact dynamic responses, Int. J. Struct. Stab. Dyn. (2026), online. https://doi.org/10.1142/s0219455427503664</w:t>
+        <w:t xml:space="preserve">[46] J. Zhang, Y. Liu, X. Fan, An AR(1)-Tikhonov-SVD-GCV framework for stochastic moving load identification driven by bridge multi-point deflection data, Structures 88 (2026) 111844. https://doi.org/10.1016/j.istruc.2026.111844</w:t>
       </w:r>
     </w:p>
     <w:p>
@@ -26373,7 +26373,7 @@
         <w:pStyle w:val="BodyText"/>
       </w:pPr>
       <w:r>
-        <w:t xml:space="preserve">[47] Y. Zhou, Z. Feng, S.-K. Di, Z.-J. Jia, A novel approach for bending stiffness inversion and rapid evaluation of continuous beam bridges based on a deflection influence line, Struct. Control Health Monit. 2026 (2026) 1361157. https://doi.org/10.1155/stc/1361157</w:t>
+        <w:t xml:space="preserve">[47] Z. Shen, W. Peng, X. Zhang, et al., A lightweight weigh-in-motion system based on vehicle-induced bridge deflection and impact dynamic responses, Int. J. Struct. Stab. Dyn. (2026), online. https://doi.org/10.1142/s0219455427503664</w:t>
       </w:r>
     </w:p>
     <w:p>
@@ -26381,7 +26381,7 @@
         <w:pStyle w:val="BodyText"/>
       </w:pPr>
       <w:r>
-        <w:t xml:space="preserve">[48] A. Moghadam, R. Sarlo, Nothing-on-Road Bridge-Weigh-In-Motion (NOR-BWIM) Dataset, version 1, University Libraries, Virginia Tech, figshare, 2024. https://doi.org/10.7294/26880898.v1</w:t>
+        <w:t xml:space="preserve">[48] Y. Zhou, Z. Feng, S.-K. Di, Z.-J. Jia, A novel approach for bending stiffness inversion and rapid evaluation of continuous beam bridges based on a deflection influence line, Struct. Control Health Monit. 2026 (2026) 1361157. https://doi.org/10.1155/stc/1361157</w:t>
       </w:r>
     </w:p>
     <w:p>
@@ -26389,7 +26389,7 @@
         <w:pStyle w:val="BodyText"/>
       </w:pPr>
       <w:r>
-        <w:t xml:space="preserve">[49] A. Moghadam, Integration of Traffic and Structural Health Monitoring Systems Using a Novel Nothing-On-Road (NOR) Bridge-Weigh-In-Motion (BWIM) System, PhD dissertation, Virginia Polytechnic Institute and State University, Blacksburg, VA, 2022. http://hdl.handle.net/10919/111390</w:t>
+        <w:t xml:space="preserve">[49] A. Moghadam, R. Sarlo, Nothing-on-Road Bridge-Weigh-In-Motion (NOR-BWIM) Dataset, version 1, University Libraries, Virginia Tech, figshare, 2024. https://doi.org/10.7294/26880898.v1</w:t>
       </w:r>
     </w:p>
     <w:p>
@@ -26397,7 +26397,7 @@
         <w:pStyle w:val="BodyText"/>
       </w:pPr>
       <w:r>
-        <w:t xml:space="preserve">[50] L. Frýba, Vibration of Solids and Structures under Moving Loads, 3rd ed., Thomas Telford, London, 1999.</w:t>
+        <w:t xml:space="preserve">[50] A. Moghadam, Integration of Traffic and Structural Health Monitoring Systems Using a Novel Nothing-On-Road (NOR) Bridge-Weigh-In-Motion (BWIM) System, PhD dissertation, Virginia Polytechnic Institute and State University, Blacksburg, VA, 2022. http://hdl.handle.net/10919/111390</w:t>
       </w:r>
     </w:p>
     <w:p>
@@ -26405,7 +26405,7 @@
         <w:pStyle w:val="BodyText"/>
       </w:pPr>
       <w:r>
-        <w:t xml:space="preserve">[51] H. Sohn, Effects of environmental and operational variability on structural health monitoring, Philos. Trans. R. Soc. A 365 (1851) (2007) 539–560. https://doi.org/10.1098/rsta.2006.1935</w:t>
+        <w:t xml:space="preserve">[51] L. Frýba, Vibration of Solids and Structures under Moving Loads, 3rd ed., Thomas Telford, London, 1999.</w:t>
       </w:r>
     </w:p>
     <w:p>
@@ -26413,7 +26413,7 @@
         <w:pStyle w:val="BodyText"/>
       </w:pPr>
       <w:r>
-        <w:t xml:space="preserve">[52] E.J. Cross, K.Y. Koo, J.M.W. Brownjohn, K. Worden, Long-term monitoring and data analysis of the Tamar Bridge, Mech. Syst. Signal Process. 35 (1–2) (2013) 16–34. https://doi.org/10.1016/j.ymssp.2012.08.026</w:t>
+        <w:t xml:space="preserve">[52] H. Sohn, Effects of environmental and operational variability on structural health monitoring, Philos. Trans. R. Soc. A 365 (1851) (2007) 539–560. https://doi.org/10.1098/rsta.2006.1935</w:t>
       </w:r>
     </w:p>
     <w:p>
@@ -26421,7 +26421,7 @@
         <w:pStyle w:val="BodyText"/>
       </w:pPr>
       <w:r>
-        <w:t xml:space="preserve">[53] EN 1991-2:2003, Eurocode 1: Actions on Structures – Part 2: Traffic Loads on Bridges, CEN, Brussels, 2003.</w:t>
+        <w:t xml:space="preserve">[53] E.J. Cross, K.Y. Koo, J.M.W. Brownjohn, K. Worden, Long-term monitoring and data analysis of the Tamar Bridge, Mech. Syst. Signal Process. 35 (1–2) (2013) 16–34. https://doi.org/10.1016/j.ymssp.2012.08.026</w:t>
       </w:r>
     </w:p>
     <w:p>
@@ -26429,7 +26429,15 @@
         <w:pStyle w:val="BodyText"/>
       </w:pPr>
       <w:r>
-        <w:t xml:space="preserve">[54] AASHTO, LRFD Bridge Design Specifications, 10th ed., American Association of State Highway and Transportation Officials, Washington, DC, 2024.</w:t>
+        <w:t xml:space="preserve">[54] EN 1991-2:2003, Eurocode 1: Actions on Structures – Part 2: Traffic Loads on Bridges, CEN, Brussels, 2003.</w:t>
+      </w:r>
+    </w:p>
+    <w:p>
+      <w:pPr>
+        <w:pStyle w:val="BodyText"/>
+      </w:pPr>
+      <w:r>
+        <w:t xml:space="preserve">[55] AASHTO, LRFD Bridge Design Specifications, 10th ed., American Association of State Highway and Transportation Officials, Washington, DC, 2024.</w:t>
       </w:r>
     </w:p>
     <w:bookmarkEnd w:id="53"/>

</xml_diff>

<commit_message>
XII.13 round 1: fix 18 mandatory items; apply author-approved readability items (five channel types, sigma_P,noise, in-line, N8 position 22 m from T8, six readings = 3 points x 2 arrangements)
Co-Authored-By: Claude Opus 5.5 <noreply@anthropic.com>
Claude-Session: https://claude.ai/code/session_01LGLpDzAMfdMgWcXQjLxauw
</commit_message>
<xml_diff>
--- a/manuscript/v4/word/Manuscript_v4.docx
+++ b/manuscript/v4/word/Manuscript_v4.docx
@@ -90,7 +90,7 @@
         <w:pStyle w:val="FirstParagraph"/>
       </w:pPr>
       <w:r>
-        <w:t xml:space="preserve">Influence-area weigh-in-motion estimates gross vehicle weight from the area under a response record. On a continuous girder, positive and negative parts of the influence line can cancel, leaving a gauge blind to the load. This paper gives criteria for choosing, before installation, channels that observe the total load. They build on the influence-area identity: the area under a record equals the load times the channel’s response to a uniform unit load, the integral constant. Closed forms give the blind loci of four channel types (deflection, strain, rotation, reaction) on continuous and haunched girders. Strain gauges are blind wherever the uniform-load moment vanishes, and nearly blind in a band around these points. A cancellation ratio separates cancellation from restraint. Optimal sensors lie at the extremes of the uniform-load response. A closed-form law gives the integral constant as a function of uncertain pier stiffness. A static test on a laboratory two-span beam confirms the identity. On public moving-truck records from a five-span box girder, invariance of the constant could be shown only within margins of 10–27 %, and the narrow range of reference weights did not allow weight discrimination to be tested. Generalised least-squares weights estimated from vehicle-free noise performed worse out of sample than the gauge average, because crossing residuals are much less correlated between gauges than vehicle-free noise. On an in-service three-span box girder, two static readings leave the constant of a side-span deflection gauge uncertain by a factor of 6.6, while the centre-span gauge is well determined.</w:t>
+        <w:t xml:space="preserve">Influence-area weigh-in-motion estimates gross vehicle weight from the area under a response record. On a continuous girder, positive and negative parts of the influence line can cancel, leaving a gauge blind to the load. This paper gives criteria for choosing, before installation, channels that observe the total load. They build on the influence-area identity: the area under a record equals the load times the channel’s response to a uniform unit load, the integral constant. Closed forms give the blind loci of five channel types (deflection, strain, rotation, shear, reaction) on continuous and haunched girders. Strain gauges are blind wherever the uniform-load moment vanishes, and nearly blind in a band around these points. A cancellation ratio separates cancellation from restraint. Optimal sensors lie at the extremes of the uniform-load response. A closed-form law gives the integral constant as a function of uncertain pier stiffness. A static test on a laboratory two-span beam confirms the identity. On public moving-truck records from a five-span box girder, invariance of the constant could be shown only within margins of 10–27 %, and the narrow range of reference weights did not allow weight discrimination to be tested. Generalised least-squares weights estimated from vehicle-free noise performed worse out of sample than the gauge average, because crossing residuals are much less correlated between gauges than vehicle-free noise. On an in-service three-span box girder, two static readings leave the constant of a side-span deflection gauge uncertain by a factor of 6.6, while the main-span gauge is well determined.</w:t>
       </w:r>
     </w:p>
     <w:p>
@@ -1134,7 +1134,28 @@
                 </m:e>
                 <m:sub>
                   <m:r>
+                    <m:rPr>
+                      <m:sty m:val="p"/>
+                    </m:rPr>
                     <m:t>s</m:t>
+                  </m:r>
+                  <m:r>
+                    <m:rPr>
+                      <m:sty m:val="p"/>
+                    </m:rPr>
+                    <m:t>i</m:t>
+                  </m:r>
+                  <m:r>
+                    <m:rPr>
+                      <m:sty m:val="p"/>
+                    </m:rPr>
+                    <m:t>d</m:t>
+                  </m:r>
+                  <m:r>
+                    <m:rPr>
+                      <m:sty m:val="p"/>
+                    </m:rPr>
+                    <m:t>e</m:t>
                   </m:r>
                 </m:sub>
               </m:sSub>
@@ -1155,7 +1176,28 @@
                 </m:e>
                 <m:sub>
                   <m:r>
+                    <m:rPr>
+                      <m:sty m:val="p"/>
+                    </m:rPr>
                     <m:t>s</m:t>
+                  </m:r>
+                  <m:r>
+                    <m:rPr>
+                      <m:sty m:val="p"/>
+                    </m:rPr>
+                    <m:t>i</m:t>
+                  </m:r>
+                  <m:r>
+                    <m:rPr>
+                      <m:sty m:val="p"/>
+                    </m:rPr>
+                    <m:t>d</m:t>
+                  </m:r>
+                  <m:r>
+                    <m:rPr>
+                      <m:sty m:val="p"/>
+                    </m:rPr>
+                    <m:t>e</m:t>
                   </m:r>
                 </m:sub>
               </m:sSub>
@@ -2453,7 +2495,7 @@
               <w:jc w:val="left"/>
             </w:pPr>
             <w:r>
-              <w:t xml:space="preserve">centre-to-side span ratio</w:t>
+              <w:t xml:space="preserve">main-to-side span ratio</w:t>
             </w:r>
             <w:r>
               <w:t xml:space="preserve"> </w:t>
@@ -2467,7 +2509,28 @@
                 </m:e>
                 <m:sub>
                   <m:r>
-                    <m:t>c</m:t>
+                    <m:rPr>
+                      <m:sty m:val="p"/>
+                    </m:rPr>
+                    <m:t>m</m:t>
+                  </m:r>
+                  <m:r>
+                    <m:rPr>
+                      <m:sty m:val="p"/>
+                    </m:rPr>
+                    <m:t>a</m:t>
+                  </m:r>
+                  <m:r>
+                    <m:rPr>
+                      <m:sty m:val="p"/>
+                    </m:rPr>
+                    <m:t>i</m:t>
+                  </m:r>
+                  <m:r>
+                    <m:rPr>
+                      <m:sty m:val="p"/>
+                    </m:rPr>
+                    <m:t>n</m:t>
                   </m:r>
                 </m:sub>
               </m:sSub>
@@ -2485,7 +2548,28 @@
                 </m:e>
                 <m:sub>
                   <m:r>
+                    <m:rPr>
+                      <m:sty m:val="p"/>
+                    </m:rPr>
                     <m:t>s</m:t>
+                  </m:r>
+                  <m:r>
+                    <m:rPr>
+                      <m:sty m:val="p"/>
+                    </m:rPr>
+                    <m:t>i</m:t>
+                  </m:r>
+                  <m:r>
+                    <m:rPr>
+                      <m:sty m:val="p"/>
+                    </m:rPr>
+                    <m:t>d</m:t>
+                  </m:r>
+                  <m:r>
+                    <m:rPr>
+                      <m:sty m:val="p"/>
+                    </m:rPr>
+                    <m:t>e</m:t>
                   </m:r>
                 </m:sub>
               </m:sSub>
@@ -2494,35 +2578,7 @@
               <w:t xml:space="preserve"> </w:t>
             </w:r>
             <w:r>
-              <w:t xml:space="preserve">(three spans;</w:t>
-            </w:r>
-            <w:r>
-              <w:t xml:space="preserve"> </w:t>
-            </w:r>
-            <m:oMath>
-              <m:r>
-                <m:t>c</m:t>
-              </m:r>
-            </m:oMath>
-            <w:r>
-              <w:t xml:space="preserve"> </w:t>
-            </w:r>
-            <w:r>
-              <w:t xml:space="preserve">= centre or main span,</w:t>
-            </w:r>
-            <w:r>
-              <w:t xml:space="preserve"> </w:t>
-            </w:r>
-            <m:oMath>
-              <m:r>
-                <m:t>s</m:t>
-              </m:r>
-            </m:oMath>
-            <w:r>
-              <w:t xml:space="preserve"> </w:t>
-            </w:r>
-            <w:r>
-              <w:t xml:space="preserve">= side span)</w:t>
+              <w:t xml:space="preserve">(three spans)</w:t>
             </w:r>
           </w:p>
         </w:tc>
@@ -2618,7 +2674,28 @@
                 </m:e>
                 <m:sub>
                   <m:r>
-                    <m:t>c</m:t>
+                    <m:rPr>
+                      <m:sty m:val="p"/>
+                    </m:rPr>
+                    <m:t>m</m:t>
+                  </m:r>
+                  <m:r>
+                    <m:rPr>
+                      <m:sty m:val="p"/>
+                    </m:rPr>
+                    <m:t>a</m:t>
+                  </m:r>
+                  <m:r>
+                    <m:rPr>
+                      <m:sty m:val="p"/>
+                    </m:rPr>
+                    <m:t>i</m:t>
+                  </m:r>
+                  <m:r>
+                    <m:rPr>
+                      <m:sty m:val="p"/>
+                    </m:rPr>
+                    <m:t>n</m:t>
                   </m:r>
                 </m:sub>
               </m:sSub>
@@ -2639,7 +2716,28 @@
                 </m:e>
                 <m:sub>
                   <m:r>
+                    <m:rPr>
+                      <m:sty m:val="p"/>
+                    </m:rPr>
                     <m:t>s</m:t>
+                  </m:r>
+                  <m:r>
+                    <m:rPr>
+                      <m:sty m:val="p"/>
+                    </m:rPr>
+                    <m:t>i</m:t>
+                  </m:r>
+                  <m:r>
+                    <m:rPr>
+                      <m:sty m:val="p"/>
+                    </m:rPr>
+                    <m:t>d</m:t>
+                  </m:r>
+                  <m:r>
+                    <m:rPr>
+                      <m:sty m:val="p"/>
+                    </m:rPr>
+                    <m:t>e</m:t>
                   </m:r>
                 </m:sub>
               </m:sSub>
@@ -3150,6 +3248,83 @@
               <w:jc w:val="left"/>
             </w:pPr>
             <m:oMath>
+              <m:sSub>
+                <m:e>
+                  <m:r>
+                    <m:t>σ</m:t>
+                  </m:r>
+                </m:e>
+                <m:sub>
+                  <m:r>
+                    <m:t>P</m:t>
+                  </m:r>
+                  <m:r>
+                    <m:rPr>
+                      <m:sty m:val="p"/>
+                    </m:rPr>
+                    <m:t>,</m:t>
+                  </m:r>
+                  <m:r>
+                    <m:rPr>
+                      <m:sty m:val="p"/>
+                    </m:rPr>
+                    <m:t>n</m:t>
+                  </m:r>
+                  <m:r>
+                    <m:rPr>
+                      <m:sty m:val="p"/>
+                    </m:rPr>
+                    <m:t>o</m:t>
+                  </m:r>
+                  <m:r>
+                    <m:rPr>
+                      <m:sty m:val="p"/>
+                    </m:rPr>
+                    <m:t>i</m:t>
+                  </m:r>
+                  <m:r>
+                    <m:rPr>
+                      <m:sty m:val="p"/>
+                    </m:rPr>
+                    <m:t>s</m:t>
+                  </m:r>
+                  <m:r>
+                    <m:rPr>
+                      <m:sty m:val="p"/>
+                    </m:rPr>
+                    <m:t>e</m:t>
+                  </m:r>
+                </m:sub>
+              </m:sSub>
+            </m:oMath>
+          </w:p>
+        </w:tc>
+        <w:tc>
+          <w:tcPr>
+            <w:tcW w:type="dxa" w:w="6177"/>
+          </w:tcPr>
+          <w:p>
+            <w:pPr>
+              <w:pStyle w:val="Compact"/>
+              <w:jc w:val="left"/>
+            </w:pPr>
+            <w:r>
+              <w:t xml:space="preserve">standard deviation of the load estimate caused by white noise</w:t>
+            </w:r>
+          </w:p>
+        </w:tc>
+      </w:tr>
+      <w:tr>
+        <w:tc>
+          <w:tcPr>
+            <w:tcW w:type="dxa" w:w="2892"/>
+          </w:tcPr>
+          <w:p>
+            <w:pPr>
+              <w:pStyle w:val="Compact"/>
+              <w:jc w:val="left"/>
+            </w:pPr>
+            <m:oMath>
               <m:r>
                 <m:t>τ</m:t>
               </m:r>
@@ -3672,7 +3847,7 @@
         <w:pStyle w:val="BodyText"/>
       </w:pPr>
       <w:r>
-        <w:t xml:space="preserve">a closed-form catalogue of blind loci for deflection, strain, rotation, shear and reaction channels on two- and three-span and haunched girders, including the near-blind band that can catch strain gauges set back from the piers;</w:t>
+        <w:t xml:space="preserve">a closed-form catalogue of blind loci for deflection, strain, rotation, shear and reaction channels on two- and three-span and haunched girders, including the near-blind band that can contain strain gauges set back from the piers;</w:t>
       </w:r>
     </w:p>
     <w:p>
@@ -3704,7 +3879,7 @@
         </m:sSub>
       </m:oMath>
       <w:r>
-        <w:t xml:space="preserve">, which needs no reference stiffness, the cancellation ratio</w:t>
+        <w:t xml:space="preserve">, which needs no reference rigidity, the cancellation ratio</w:t>
       </w:r>
       <w:r>
         <w:t xml:space="preserve"> </w:t>
@@ -3774,7 +3949,7 @@
         <w:pStyle w:val="BodyText"/>
       </w:pPr>
       <w:r>
-        <w:t xml:space="preserve">an identifiability analysis of the indicator under boundary uncertainty, in which the constant depends on pier stiffness only through the scaled pier stiffness</w:t>
+        <w:t xml:space="preserve">an identifiability analysis of the constant under boundary uncertainty: the constant depends on pier stiffness only through the scaled pier stiffness</w:t>
       </w:r>
       <w:r>
         <w:t xml:space="preserve"> </w:t>
@@ -3803,10 +3978,7 @@
         </m:r>
       </m:oMath>
       <w:r>
-        <w:t xml:space="preserve"> </w:t>
-      </w:r>
-      <w:r>
-        <w:t xml:space="preserve">and a linear-fractional (Möbius) law, and which names the measurement that resolves it;</w:t>
+        <w:t xml:space="preserve">, following a linear-fractional (Möbius) law, and the analysis names the measurement that resolves it;</w:t>
       </w:r>
     </w:p>
     <w:p>
@@ -3891,7 +4063,7 @@
         <w:t xml:space="preserve"> </w:t>
       </w:r>
       <w:r>
-        <w:t xml:space="preserve">and any linear elastic supports. A response channel at a fixed point</w:t>
+        <w:t xml:space="preserve">and any linear-elastic supports. A response channel at a fixed point</w:t>
       </w:r>
       <w:r>
         <w:t xml:space="preserve"> </w:t>
@@ -5717,7 +5889,28 @@
           </m:e>
           <m:sub>
             <m:r>
-              <m:t>c</m:t>
+              <m:rPr>
+                <m:sty m:val="p"/>
+              </m:rPr>
+              <m:t>m</m:t>
+            </m:r>
+            <m:r>
+              <m:rPr>
+                <m:sty m:val="p"/>
+              </m:rPr>
+              <m:t>a</m:t>
+            </m:r>
+            <m:r>
+              <m:rPr>
+                <m:sty m:val="p"/>
+              </m:rPr>
+              <m:t>i</m:t>
+            </m:r>
+            <m:r>
+              <m:rPr>
+                <m:sty m:val="p"/>
+              </m:rPr>
+              <m:t>n</m:t>
             </m:r>
           </m:sub>
         </m:sSub>
@@ -5735,7 +5928,28 @@
           </m:e>
           <m:sub>
             <m:r>
+              <m:rPr>
+                <m:sty m:val="p"/>
+              </m:rPr>
               <m:t>s</m:t>
+            </m:r>
+            <m:r>
+              <m:rPr>
+                <m:sty m:val="p"/>
+              </m:rPr>
+              <m:t>i</m:t>
+            </m:r>
+            <m:r>
+              <m:rPr>
+                <m:sty m:val="p"/>
+              </m:rPr>
+              <m:t>d</m:t>
+            </m:r>
+            <m:r>
+              <m:rPr>
+                <m:sty m:val="p"/>
+              </m:rPr>
+              <m:t>e</m:t>
             </m:r>
           </m:sub>
         </m:sSub>
@@ -5819,7 +6033,28 @@
           </m:e>
           <m:sub>
             <m:r>
-              <m:t>c</m:t>
+              <m:rPr>
+                <m:sty m:val="p"/>
+              </m:rPr>
+              <m:t>m</m:t>
+            </m:r>
+            <m:r>
+              <m:rPr>
+                <m:sty m:val="p"/>
+              </m:rPr>
+              <m:t>a</m:t>
+            </m:r>
+            <m:r>
+              <m:rPr>
+                <m:sty m:val="p"/>
+              </m:rPr>
+              <m:t>i</m:t>
+            </m:r>
+            <m:r>
+              <m:rPr>
+                <m:sty m:val="p"/>
+              </m:rPr>
+              <m:t>n</m:t>
             </m:r>
           </m:sub>
         </m:sSub>
@@ -5840,7 +6075,28 @@
           </m:e>
           <m:sub>
             <m:r>
+              <m:rPr>
+                <m:sty m:val="p"/>
+              </m:rPr>
               <m:t>s</m:t>
+            </m:r>
+            <m:r>
+              <m:rPr>
+                <m:sty m:val="p"/>
+              </m:rPr>
+              <m:t>i</m:t>
+            </m:r>
+            <m:r>
+              <m:rPr>
+                <m:sty m:val="p"/>
+              </m:rPr>
+              <m:t>d</m:t>
+            </m:r>
+            <m:r>
+              <m:rPr>
+                <m:sty m:val="p"/>
+              </m:rPr>
+              <m:t>e</m:t>
             </m:r>
           </m:sub>
         </m:sSub>
@@ -11360,7 +11616,66 @@
         </m:sSubSup>
       </m:oMath>
       <w:r>
-        <w:t xml:space="preserve">.</w:t>
+        <w:t xml:space="preserve">, where</w:t>
+      </w:r>
+      <w:r>
+        <w:t xml:space="preserve"> </w:t>
+      </w:r>
+      <m:oMath>
+        <m:sSub>
+          <m:e>
+            <m:r>
+              <m:t>σ</m:t>
+            </m:r>
+          </m:e>
+          <m:sub>
+            <m:r>
+              <m:t>P</m:t>
+            </m:r>
+            <m:r>
+              <m:rPr>
+                <m:sty m:val="p"/>
+              </m:rPr>
+              <m:t>,</m:t>
+            </m:r>
+            <m:r>
+              <m:rPr>
+                <m:sty m:val="p"/>
+              </m:rPr>
+              <m:t>n</m:t>
+            </m:r>
+            <m:r>
+              <m:rPr>
+                <m:sty m:val="p"/>
+              </m:rPr>
+              <m:t>o</m:t>
+            </m:r>
+            <m:r>
+              <m:rPr>
+                <m:sty m:val="p"/>
+              </m:rPr>
+              <m:t>i</m:t>
+            </m:r>
+            <m:r>
+              <m:rPr>
+                <m:sty m:val="p"/>
+              </m:rPr>
+              <m:t>s</m:t>
+            </m:r>
+            <m:r>
+              <m:rPr>
+                <m:sty m:val="p"/>
+              </m:rPr>
+              <m:t>e</m:t>
+            </m:r>
+          </m:sub>
+        </m:sSub>
+      </m:oMath>
+      <w:r>
+        <w:t xml:space="preserve"> </w:t>
+      </w:r>
+      <w:r>
+        <w:t xml:space="preserve">is the standard deviation of the load estimate caused by white noise.</w:t>
       </w:r>
     </w:p>
     <w:p>
@@ -11409,7 +11724,7 @@
         <w:t xml:space="preserve"> </w:t>
       </w:r>
       <w:r>
-        <w:t xml:space="preserve">keeps the estimate independent of the axle configuration for every structure, and SLM relies on this invariance. It also links SLM to transmissibility-based weighing [34]: a transmissibility is a ratio of response spectra, and at zero frequency it equals the ratio of record integrals. A record integrated uniformly in time weights space by</w:t>
+        <w:t xml:space="preserve">keeps the estimate independent of the axle configuration for every structure, and SLM relies on this invariance. Appendix B also links SLM to transmissibility-based weighing [34]: a transmissibility is a ratio of response spectra, and at zero frequency it equals the ratio of record integrals. A record integrated uniformly in time weights space by</w:t>
       </w:r>
       <w:r>
         <w:t xml:space="preserve"> </w:t>
@@ -13394,7 +13709,28 @@
                       </m:e>
                       <m:sub>
                         <m:r>
+                          <m:rPr>
+                            <m:sty m:val="p"/>
+                          </m:rPr>
                           <m:t>s</m:t>
+                        </m:r>
+                        <m:r>
+                          <m:rPr>
+                            <m:sty m:val="p"/>
+                          </m:rPr>
+                          <m:t>i</m:t>
+                        </m:r>
+                        <m:r>
+                          <m:rPr>
+                            <m:sty m:val="p"/>
+                          </m:rPr>
+                          <m:t>d</m:t>
+                        </m:r>
+                        <m:r>
+                          <m:rPr>
+                            <m:sty m:val="p"/>
+                          </m:rPr>
+                          <m:t>e</m:t>
                         </m:r>
                       </m:sub>
                     </m:sSub>
@@ -13411,7 +13747,28 @@
                       </m:e>
                       <m:sub>
                         <m:r>
+                          <m:rPr>
+                            <m:sty m:val="p"/>
+                          </m:rPr>
                           <m:t>s</m:t>
+                        </m:r>
+                        <m:r>
+                          <m:rPr>
+                            <m:sty m:val="p"/>
+                          </m:rPr>
+                          <m:t>i</m:t>
+                        </m:r>
+                        <m:r>
+                          <m:rPr>
+                            <m:sty m:val="p"/>
+                          </m:rPr>
+                          <m:t>d</m:t>
+                        </m:r>
+                        <m:r>
+                          <m:rPr>
+                            <m:sty m:val="p"/>
+                          </m:rPr>
+                          <m:t>e</m:t>
                         </m:r>
                       </m:sub>
                     </m:sSub>
@@ -14274,7 +14631,7 @@
         <w:t xml:space="preserve">”</w:t>
       </w:r>
       <w:r>
-        <w:t xml:space="preserve">. They fall into three groups: four wheel-path gauges with clear axle spikes (ch4, ch5, ch11, ch12), a partner gauge at each of these four stations, and four further gauges without axle spikes (ch1, ch2, ch8, ch9). Day 2 has four in-line channels, labelled with the prefix</w:t>
+        <w:t xml:space="preserve">. They fall into three groups: four wheel-path gauges with clear axle spikes (ch4, ch5, ch11, ch12), a partner gauge at each of these four stations, and four further gauges without axle spikes (ch1, ch2, ch8, ch9). Day 2 has four channels in one longitudinal line under the wheel path, labelled with the prefix</w:t>
       </w:r>
       <w:r>
         <w:t xml:space="preserve"> </w:t>
@@ -14300,7 +14657,7 @@
         <w:pStyle w:val="BodyText"/>
       </w:pPr>
       <w:r>
-        <w:t xml:space="preserve">The reference weights differ in quality between the days. On day 1, two 3-axle trucks ran in the instrumented lane, and their gross weights were reported by the drivers [50]. On day 2, a 3-axle truck of 26.8 t and a 5-axle truck of 25.9 t were weighed on a static scale [50]. They ran in the instrumented lane (lane A), on the return trip in the other lane (lane B), and in two in-line two-truck runs.</w:t>
+        <w:t xml:space="preserve">The reference weights differ in quality between the days. On day 1, two 3-axle trucks ran in the instrumented lane, and their gross weights were reported by the drivers [50]. On day 2, a 3-axle truck of 26.8 t and a 5-axle truck of 25.9 t were weighed on a static scale [50]. They ran in the instrumented lane (lane A), on the return trip in the other lane (lane B), and in two runs with the two trucks one behind the other.</w:t>
       </w:r>
     </w:p>
     <w:p>
@@ -14366,7 +14723,7 @@
         <w:pStyle w:val="FirstParagraph"/>
       </w:pPr>
       <w:r>
-        <w:t xml:space="preserve">The constant is stable within the noise for most gauges, but invariance between trucks can be shown only within margins of 10–27 %. On day 1, the χ² test accepts consistency with the measured noise for eight of the twelve gauges, but only one gauge, ch11, shows that both trucks give the same constant within ±10 % (Fig. 6a).</w:t>
+        <w:t xml:space="preserve">The constant is stable within the noise for most gauges, but invariance between trucks can be shown only within margins of 10–27 %. On day 1, the χ² test does not reject consistency with the measured noise for eight of the twelve gauges, but only one gauge, ch11, shows that both trucks give the same constant within ±10 % (Fig. 6a).</w:t>
       </w:r>
     </w:p>
     <w:p>
@@ -14390,7 +14747,7 @@
         <w:pStyle w:val="BodyText"/>
       </w:pPr>
       <w:r>
-        <w:t xml:space="preserve">Each lane needs its own constant. For the gauge average, return trips in lane B gave constants 0.79 times those of lane A (95 % CI 0.59–1.00), as also found on another continuous girder [40]. The lane effect is clearly resolved for one gauge only (st36: 0.64, 95 % CI 0.47–0.81). For the gauge average, the two in-line two-truck runs gave 0.92 of the summed single-truck predictions (pooled 95 % CI 0.77–1.06), consistent with superposition although both fall below the prediction.</w:t>
+        <w:t xml:space="preserve">Each lane needs its own constant. For the gauge average, return trips in lane B gave constants 0.79 times those of lane A (95 % CI 0.59–1.00), as also found on another continuous girder [40]. The lane effect is clearly resolved for one gauge only (st36: 0.64, 95 % CI 0.47–0.81). For the gauge average, the two runs with the trucks one behind the other gave 0.92 of the summed single-truck predictions (pooled 95 % CI 0.77–1.06), consistent with superposition although both fall below the prediction.</w:t>
       </w:r>
     </w:p>
     <w:p>
@@ -14444,7 +14801,7 @@
         <w:pStyle w:val="FirstParagraph"/>
       </w:pPr>
       <w:r>
-        <w:t xml:space="preserve">Combining gauges did not help on these records. Four kinds of estimator were compared by leave-one-run-out cross-validation: single gauges, the gauge average, GLS (Eq. 13) and the zero-sum estimator (Eq. 14). In each fold the constants were calibrated without the test run, and</w:t>
+        <w:t xml:space="preserve">Combining gauges did not help on these records. Four kinds of estimator were compared by leave-one-run-out cross-validation: single gauges, the gauge average, GLS (Eq. (13)) and the zero-sum estimator (Eq. (14)). In each fold the constants were calibrated without the test run, and</w:t>
       </w:r>
       <w:r>
         <w:t xml:space="preserve"> </w:t>
@@ -14960,7 +15317,7 @@
         <w:pStyle w:val="BodyText"/>
       </w:pPr>
       <w:r>
-        <w:t xml:space="preserve">On day 2, GLS with the measured covariance was worse than the gauge average: 20.4 % against 11.9 % MAE. The paired difference is +8.5 points (95 % CI +2.3 to +15.1), so GLS and the zero-sum estimator are both significantly worse than the average. On day 1 the estimators cannot be told apart, and on both days every estimator is worse than the mean-weight predictor.</w:t>
+        <w:t xml:space="preserve">On day 2, GLS with the measured covariance was worse than the gauge average: 20.4 % against 11.9 % MAE. The paired difference is +8.5 percentage points (95 % CI +2.3 to +15.1), so GLS and the zero-sum estimator are both significantly worse than the average. On day 1 the estimators cannot be told apart, and on both days every estimator is worse than the mean-weight predictor.</w:t>
       </w:r>
     </w:p>
     <w:p>
@@ -15052,7 +15409,7 @@
         <w:pStyle w:val="FirstParagraph"/>
       </w:pPr>
       <w:r>
-        <w:t xml:space="preserve">The Cầu Mây Bridge carries provincial road DT389 over the Kinh Môn River in Hải Dương, Viet Nam. Its main bridge is a three-span continuous prestressed concrete box girder of 55 + 90 + 55 m, built by balanced cantilever (</w:t>
+        <w:t xml:space="preserve">The Cầu Mây Bridge carries provincial road ĐT389 over the Kinh Môn River in Hải Dương, Viet Nam. Its main bridge is a three-span continuous prestressed concrete box girder of 55 + 90 + 55 m, built by balanced cantilever (</w:t>
       </w:r>
       <m:oMath>
         <m:r>
@@ -15077,7 +15434,7 @@
         <w:pStyle w:val="BodyText"/>
       </w:pPr>
       <w:r>
-        <w:t xml:space="preserve">Two deflection gauges were read: N8 at 0.4L of the side span between pier T7 and end support T8, and N7 at mid main span. In the June 2020 acceptance test, four trucks stood in the side span (gauge N8) and six in the main span (gauge N7). The trucks were 3-axle, nominally 5 + 10 + 10 t, with a weighed mean of 25.06 t. Dial gauges read the peak deflection under centric and eccentric transverse positions [NEED VALUE: instrument type and fixed reference datum of the dial gauges, temperature correction, load-hold time and zero-reading procedure]. Each gauge has six readings (three lines, each centric and eccentric); their mean is 5.55 mm at N8 and 15.42 mm at N7.</w:t>
+        <w:t xml:space="preserve">Two deflection gauges were read: N8 in the side span between pier T7 and end support T8, at 0.4L (22 m) from T8, and N7 at mid main span. In the June 2020 acceptance test, four trucks stood in the side span (gauge N8) and six in the main span (gauge N7). The trucks were 3-axle, nominally 5 + 10 + 10 t, with a weighed mean of 25.06 t. Dial gauges read the peak deflection under centric and eccentric transverse positions [NEED VALUE: instrument type and fixed reference datum of the dial gauges, temperature correction, load-hold time and zero-reading procedure]. Each gauge section has six readings (three measuring points across the section, on the axis and at both edges, under centric and eccentric truck arrangements); their mean is 5.55 mm at N8 and 15.42 mm at N7.</w:t>
       </w:r>
     </w:p>
     <w:p>
@@ -15390,7 +15747,7 @@
         <w:pStyle w:val="FirstParagraph"/>
       </w:pPr>
       <w:r>
-        <w:t xml:space="preserve">The static data leave the constant of the side-span gauge N8 uncertain by a factor of 6.6, whereas the constant of the centre-span gauge N7 is well determined. Two facts explain this: a model-form misfit that no pier stiffness removes, and the Möbius law of Eq. (15).</w:t>
+        <w:t xml:space="preserve">The static data leave the constant of the side-span gauge N8 uncertain by a factor of 6.6, whereas the constant of the main-span gauge N7 is well determined. Two facts explain this: a model-form misfit that no pier stiffness removes, and the Möbius law of Eq. (15).</w:t>
       </w:r>
     </w:p>
     <w:p>
@@ -15481,7 +15838,7 @@
         <w:t xml:space="preserve"> </w:t>
       </w:r>
       <w:r>
-        <w:t xml:space="preserve">would mean a 28 % loss of rigidity in a young prestressed girder.</w:t>
+        <w:t xml:space="preserve">would mean a 28 % loss of rigidity in a recently built prestressed girder.</w:t>
       </w:r>
     </w:p>
     <w:p>
@@ -15500,7 +15857,7 @@
         </m:r>
       </m:oMath>
       <w:r>
-        <w:t xml:space="preserve">. The six readings of each gauge spread by 1.9–2.0 % about their mean. This spread comes from the transverse positions and is not a repeatability, because the readings are not replicates. Combined in quadrature with a model-form spread of 1.75 %, it gives a standard uncertainty of 2.64 % per reading, and</w:t>
+        <w:t xml:space="preserve">. The six readings of each gauge section spread by 1.9–2.0 % about their mean. This spread comes from the transverse positions and is not a measure of repeatability, because the readings are not replicates. Combined in quadrature with a model-form spread of 1.75 %, it gives a standard uncertainty of 2.64 % per reading, and</w:t>
       </w:r>
       <w:r>
         <w:t xml:space="preserve"> </w:t>
@@ -17104,7 +17461,7 @@
         <w:pStyle w:val="BodyText"/>
       </w:pPr>
       <w:r>
-        <w:t xml:space="preserve">The centre-span indicator is low (0.19–0.29) although</w:t>
+        <w:t xml:space="preserve">The main-span indicator is low (0.19–0.29) although</w:t>
       </w:r>
       <w:r>
         <w:t xml:space="preserve"> </w:t>
@@ -17786,7 +18143,7 @@
         <w:pStyle w:val="BodyText"/>
       </w:pPr>
       <w:r>
-        <w:t xml:space="preserve">A moving-load test with weighed trucks has been designed for this bridge, and Table 6 gives the predicted values that would decide between the reference calibrations. These are predictions, not results. The ratio of integrals at the side-span and centre-span deflection gauges is independent of truck weight and absolute rigidity, and it differs by a factor of 2.3 between calibrations A and B.</w:t>
+        <w:t xml:space="preserve">A moving-load test with weighed trucks has been designed for this bridge, and Table 6 gives the predicted values that would decide between the reference calibrations. These are predictions, not results. The ratio of integrals at the side-span and main-span deflection gauges is independent of truck weight and absolute rigidity, and it differs by a factor of 2.3 between calibrations A and B.</w:t>
       </w:r>
     </w:p>
     <w:p>
@@ -18030,7 +18387,7 @@
         <w:pStyle w:val="BodyText"/>
       </w:pPr>
       <w:r>
-        <w:t xml:space="preserve">The in-service girder shows that a side-span deflection gauge on a layout near the prismatic blind locus is not identifiable from static acceptance data, whereas a centre-span gauge is. One tiltmeter or one integral ratio would discriminate between the reference calibrations.</w:t>
+        <w:t xml:space="preserve">The in-service girder shows that a side-span deflection gauge on a layout near the prismatic blind locus is not identifiable from static acceptance data, whereas a main-span gauge is. One tiltmeter or one integral ratio would discriminate between the reference calibrations.</w:t>
       </w:r>
     </w:p>
     <w:bookmarkEnd w:id="37"/>
@@ -18719,7 +19076,7 @@
         <w:t xml:space="preserve"> </w:t>
       </w:r>
       <w:r>
-        <w:t xml:space="preserve">mm a single centre-span gauge biases a 25 t truck by 16–25 %, and a single side-span gauge by 41–271 %. With present absolute-deflection technology, single-point integral weighing on a long-span girder is therefore marginal even at the best location. The zero-sum pair addresses this term only to the extent that the offset is common-mode during crossings (Section 4.3).</w:t>
+        <w:t xml:space="preserve">mm a single main-span gauge biases a 25 t truck by 16–25 %, and a single side-span gauge by 41–271 %. With present absolute-deflection technology, single-point integral weighing on a long-span girder is therefore marginal even at the best location. The zero-sum pair addresses this term only to the extent that the offset is common-mode during crossings (Section 4.3).</w:t>
       </w:r>
     </w:p>
     <w:p>
@@ -20483,7 +20840,7 @@
         <w:pStyle w:val="FirstParagraph"/>
       </w:pPr>
       <w:r>
-        <w:t xml:space="preserve">The integral is a reduced alternative to influence-line BWIM, not a competitor. It returns the gross weight of a vehicle or group from one scalar constant per channel and one weighted sum. Its natural role is low-cost screening across many continuous structures, with instrumented BWIM or enforcement weighing for the vehicles it flags. Influence-line BWIM does not suffer the blindness of Table 1, because it fits the whole record shape.</w:t>
+        <w:t xml:space="preserve">The integral is a simplified alternative to influence-line BWIM, not a competitor. It returns the gross weight of a vehicle or group from one scalar constant per channel and one weighted sum. Its natural role is low-cost screening across many continuous structures, with instrumented BWIM or enforcement weighing for the vehicles it flags. Influence-line BWIM does not suffer the blindness of Table 1, because it fits the whole record shape.</w:t>
       </w:r>
     </w:p>
     <w:p>
@@ -20638,7 +20995,7 @@
         <w:t xml:space="preserve"> </w:t>
       </w:r>
       <w:r>
-        <w:t xml:space="preserve">needs no reference stiffness, and the cancellation ratio</w:t>
+        <w:t xml:space="preserve">needs no reference rigidity, and the cancellation ratio</w:t>
       </w:r>
       <w:r>
         <w:t xml:space="preserve"> </w:t>
@@ -20723,7 +21080,7 @@
         <w:pStyle w:val="BodyText"/>
       </w:pPr>
       <w:r>
-        <w:t xml:space="preserve">On a 55 + 90 + 55 m box girder, two static readings bound the scaled pier stiffness only from below at a 5.3 % tolerance, leaving the constant of the side-span deflection gauge uncertain by a factor of 6.6, whereas the centre-span gauge is well determined. A pier tiltmeter would reduce the Cramér–Rao bound on</w:t>
+        <w:t xml:space="preserve">On a 55 + 90 + 55 m box girder, two static readings bound the scaled pier stiffness only from below at a 5.3 % tolerance, leaving the constant of the side-span deflection gauge uncertain by a factor of 6.6, whereas the main-span gauge is well determined. A pier tiltmeter would reduce the Cramér–Rao bound on</w:t>
       </w:r>
       <w:r>
         <w:t xml:space="preserve"> </w:t>
@@ -21582,7 +21939,7 @@
         <w:t xml:space="preserve"> </w:t>
       </w:r>
       <w:r>
-        <w:t xml:space="preserve">from 0.5 to 2.0, whereas the negative contribution of the adjacent span sweeps from −0.125 to −4.00; the degeneracy is driven almost entirely by the adjacent span.</w:t>
+        <w:t xml:space="preserve">from 0.5 to 2.0, whereas the negative contribution of the adjacent span sweeps from −0.125 to −4.00; the cancellation is driven almost entirely by the adjacent span.</w:t>
       </w:r>
     </w:p>
     <w:p>
@@ -21658,7 +22015,28 @@
           </m:e>
           <m:sub>
             <m:r>
+              <m:rPr>
+                <m:sty m:val="p"/>
+              </m:rPr>
               <m:t>s</m:t>
+            </m:r>
+            <m:r>
+              <m:rPr>
+                <m:sty m:val="p"/>
+              </m:rPr>
+              <m:t>i</m:t>
+            </m:r>
+            <m:r>
+              <m:rPr>
+                <m:sty m:val="p"/>
+              </m:rPr>
+              <m:t>d</m:t>
+            </m:r>
+            <m:r>
+              <m:rPr>
+                <m:sty m:val="p"/>
+              </m:rPr>
+              <m:t>e</m:t>
             </m:r>
           </m:sub>
           <m:sup>
@@ -22030,7 +22408,28 @@
           </m:e>
           <m:sub>
             <m:r>
-              <m:t>c</m:t>
+              <m:rPr>
+                <m:sty m:val="p"/>
+              </m:rPr>
+              <m:t>m</m:t>
+            </m:r>
+            <m:r>
+              <m:rPr>
+                <m:sty m:val="p"/>
+              </m:rPr>
+              <m:t>a</m:t>
+            </m:r>
+            <m:r>
+              <m:rPr>
+                <m:sty m:val="p"/>
+              </m:rPr>
+              <m:t>i</m:t>
+            </m:r>
+            <m:r>
+              <m:rPr>
+                <m:sty m:val="p"/>
+              </m:rPr>
+              <m:t>n</m:t>
             </m:r>
           </m:sub>
         </m:sSub>
@@ -22089,7 +22488,28 @@
           </m:e>
           <m:sub>
             <m:r>
-              <m:t>c</m:t>
+              <m:rPr>
+                <m:sty m:val="p"/>
+              </m:rPr>
+              <m:t>m</m:t>
+            </m:r>
+            <m:r>
+              <m:rPr>
+                <m:sty m:val="p"/>
+              </m:rPr>
+              <m:t>a</m:t>
+            </m:r>
+            <m:r>
+              <m:rPr>
+                <m:sty m:val="p"/>
+              </m:rPr>
+              <m:t>i</m:t>
+            </m:r>
+            <m:r>
+              <m:rPr>
+                <m:sty m:val="p"/>
+              </m:rPr>
+              <m:t>n</m:t>
             </m:r>
           </m:sub>
           <m:sup>
@@ -22440,7 +22860,7 @@
         <w:t xml:space="preserve"> </w:t>
       </w:r>
       <w:r>
-        <w:t xml:space="preserve">(Eq. 10; 2.5 for a simply supported mid-span).</w:t>
+        <w:t xml:space="preserve">(Eq. (10); 2.5 for a simply supported mid-span).</w:t>
       </w:r>
     </w:p>
     <w:tbl>
@@ -24378,7 +24798,7 @@
           </m:naryPr>
           <m:sub>
             <m:r>
-              <m:t>a</m:t>
+              <m:t>i</m:t>
             </m:r>
           </m:sub>
           <m:sup>
@@ -24395,7 +24815,7 @@
               </m:e>
               <m:sub>
                 <m:r>
-                  <m:t>a</m:t>
+                  <m:t>i</m:t>
                 </m:r>
               </m:sub>
             </m:sSub>
@@ -24420,7 +24840,7 @@
               </m:e>
               <m:sub>
                 <m:r>
-                  <m:t>a</m:t>
+                  <m:t>i</m:t>
                 </m:r>
               </m:sub>
             </m:sSub>
@@ -25807,7 +26227,7 @@
         <w:pStyle w:val="FirstParagraph"/>
       </w:pPr>
       <w:r>
-        <w:t xml:space="preserve">The Cầu Mây load test analysed in Section 5 was performed by the authors’ team as part of inspection work carried out by Công ty TNHH Tư vấn Đại học Xây dựng (HUCE consultancy) [NEED VALUE: name(s) of authors involved and nature of relationship]. The authors declare that there is no other conflict of interest regarding the publication of this article.</w:t>
+        <w:t xml:space="preserve">The Cầu Mây load test analysed in Section 5 was performed by an author of this paper as part of inspection work carried out by Công ty TNHH Tư vấn Đại học Xây dựng (HUCE consultancy) [NEED VALUE: name(s) of authors involved and nature of relationship]. The authors declare that there is no other conflict of interest regarding the publication of this article.</w:t>
       </w:r>
     </w:p>
     <w:bookmarkEnd w:id="47"/>
@@ -25939,7 +26359,7 @@
         <w:pStyle w:val="FirstParagraph"/>
       </w:pPr>
       <w:r>
-        <w:t xml:space="preserve">The supplementary material contains: (i) the analysis scripts and the console output of each run, with a README that maps every table and figure to a script and log; (ii) the derived data behind every figure and table; (iii) the laboratory specimen, influence line, quadrature study and full data; (iv) the field-record tables: per-channel constants and scatter with χ² tests (Table S1), truck-to-truck ratios with equivalence tests (Table S2), correlations of vehicle-free noise and crossing residuals (Table S3) the per-crossing standard deviations predicted by both covariance models (Table S4) and the full table of estimator errors (Table S5); the processing details and excluded runs, the speed regressions, lane-B and two-truck results, and all estimator results including leave-one-truck-out, in-sample and GLS with the covariance estimated from crossing residuals (Figs. S1–S2); (v) the beam model of the five-span girder, including the strain constant of the gauges relative to the largest on the girder, and the synthetic records of the dataset authors (Figs. S3–S4); (vi) strain blind-locus maps (Figs. S5–S6); (vii) the multi-channel placement study (brute-force search over all cases), Monte Carlo verification and structure-aware weighting functions (Figs. S7–S9); (viii) the asymmetric three-span closed forms; (ix) the Cầu Mây design section properties and concrete modulus, the model-form variants (depth lengths, exponents, rigid pier zone), the frequency interpretation, admissible sets against tolerance (3 %, 4 % and 5.3 %, with and without a prior on</w:t>
+        <w:t xml:space="preserve">The supplementary material contains: (i) the analysis scripts and the console output of each run, with a README that maps every table and figure to a script and log; (ii) the derived data behind every figure and table; (iii) the laboratory specimen, influence line, quadrature study and full data; (iv) the field-record tables: per-channel constants and scatter with χ² tests (Table S1), truck-to-truck ratios with equivalence tests (Table S2), correlations of vehicle-free noise and crossing residuals (Table S3), the per-crossing standard deviations predicted by both covariance models (Table S4) and the full table of estimator errors (Table S5); the processing details and excluded runs, the speed regressions, lane-B and two-truck results, and all estimator results including leave-one-truck-out, in-sample and GLS with the covariance estimated from crossing residuals (Figs. S1–S2); (v) the beam model of the five-span girder, including the strain constant of the gauges relative to the largest on the girder, and the synthetic records of the dataset authors (Figs. S3–S4); (vi) strain blind-locus maps (Figs. S5–S6); (vii) the multi-channel placement study (brute-force search over all cases), Monte Carlo verification and structure-aware weighting functions (Figs. S7–S9); (viii) the asymmetric three-span closed forms; (ix) the Cầu Mây design section properties and concrete modulus, the model-form variants (depth lengths, exponents, rigid pier zone), the frequency interpretation, admissible sets against tolerance (3 %, 4 % and 5.3 %, with and without a prior on</w:t>
       </w:r>
       <w:r>
         <w:t xml:space="preserve"> </w:t>
@@ -26109,7 +26529,7 @@
         <w:pStyle w:val="BodyText"/>
       </w:pPr>
       <w:r>
-        <w:t xml:space="preserve">[14] W. He, T. Ling, E.J. OBrien, et al., Virtual axle method for bridge weigh-in-motion systems requiring no axle detector, J. Bridge Eng. 24 (9) (2019) 04019086. https://doi.org/10.1061/(asce)be.1943-5592.0001474</w:t>
+        <w:t xml:space="preserve">[14] W. He, T. Ling, E.J. OBrien, et al., Virtual axle method for bridge weigh-in-motion systems requiring no axle detector, J. Bridge Eng. 24 (9) (2019) 04019086. https://doi.org/10.1061/(ASCE)BE.1943-5592.0001474</w:t>
       </w:r>
     </w:p>
     <w:p>
@@ -26229,7 +26649,7 @@
         <w:pStyle w:val="BodyText"/>
       </w:pPr>
       <w:r>
-        <w:t xml:space="preserve">[29] P. Agüero-Barrantes, R.E. Christenson, S. Lobo-Aguilar, Utilizing Kriging metamodeling to provide practical and effective bridge weigh-in-motion, J. Bridge Eng. 28 (2) (2023) 04022138. https://doi.org/10.1061/jbenf2.beeng-5760</w:t>
+        <w:t xml:space="preserve">[29] P. Agüero-Barrantes, R.E. Christenson, S. Lobo-Aguilar, Utilizing Kriging metamodeling to provide practical and effective bridge weigh-in-motion, J. Bridge Eng. 28 (2) (2023) 04022138. https://doi.org/10.1061/JBENF2.BEENG-5760</w:t>
       </w:r>
     </w:p>
     <w:p>
@@ -26253,7 +26673,7 @@
         <w:pStyle w:val="BodyText"/>
       </w:pPr>
       <w:r>
-        <w:t xml:space="preserve">[32] N. Zolghadri, M.W. Halling, N.R. Johnson, P.J. Barr, Field verification of simplified bridge weigh-in-motion techniques, J. Bridge Eng. 21 (6) (2016) 04016063. https://doi.org/10.1061/(asce)be.1943-5592.0000930</w:t>
+        <w:t xml:space="preserve">[32] N. Zolghadri, M.W. Halling, N.R. Johnson, P.J. Barr, Field verification of simplified bridge weigh-in-motion techniques, J. Bridge Eng. 21 (6) (2016) 04016063. https://doi.org/10.1061/(ASCE)BE.1943-5592.0000930</w:t>
       </w:r>
     </w:p>
     <w:p>
@@ -26293,7 +26713,7 @@
         <w:pStyle w:val="BodyText"/>
       </w:pPr>
       <w:r>
-        <w:t xml:space="preserve">[37] Q.B. Nguyen, T. Hoang, H.S. Nguyen, [Determination of the load applied on a simply supported beam based on measured deflection data], J. Sci. Technol. Civ. Eng. (HUCE) 18 (2V) (2024) 61–71 (in Vietnamese). https://doi.org/10.31814/stce.huce2024-18(2V)-05</w:t>
+        <w:t xml:space="preserve">[37] Q.-B. Nguyen, T. Hoang, H.-S. Nguyen, [Determination of the load applied on a simply supported beam based on measured deflection data], J. Sci. Technol. Civ. Eng. (HUCE) 18 (2V) (2024) 61–71 (in Vietnamese). https://doi.org/10.31814/stce.huce2024-18(2V)-05</w:t>
       </w:r>
     </w:p>
     <w:p>
@@ -26574,7 +26994,28 @@
           </m:e>
           <m:sub>
             <m:r>
+              <m:rPr>
+                <m:sty m:val="p"/>
+              </m:rPr>
               <m:t>s</m:t>
+            </m:r>
+            <m:r>
+              <m:rPr>
+                <m:sty m:val="p"/>
+              </m:rPr>
+              <m:t>i</m:t>
+            </m:r>
+            <m:r>
+              <m:rPr>
+                <m:sty m:val="p"/>
+              </m:rPr>
+              <m:t>d</m:t>
+            </m:r>
+            <m:r>
+              <m:rPr>
+                <m:sty m:val="p"/>
+              </m:rPr>
+              <m:t>e</m:t>
             </m:r>
           </m:sub>
         </m:sSub>
@@ -26594,7 +27035,28 @@
           </m:e>
           <m:sub>
             <m:r>
-              <m:t>c</m:t>
+              <m:rPr>
+                <m:sty m:val="p"/>
+              </m:rPr>
+              <m:t>m</m:t>
+            </m:r>
+            <m:r>
+              <m:rPr>
+                <m:sty m:val="p"/>
+              </m:rPr>
+              <m:t>a</m:t>
+            </m:r>
+            <m:r>
+              <m:rPr>
+                <m:sty m:val="p"/>
+              </m:rPr>
+              <m:t>i</m:t>
+            </m:r>
+            <m:r>
+              <m:rPr>
+                <m:sty m:val="p"/>
+              </m:rPr>
+              <m:t>n</m:t>
             </m:r>
           </m:sub>
         </m:sSub>
@@ -26615,7 +27077,28 @@
           </m:e>
           <m:sub>
             <m:r>
+              <m:rPr>
+                <m:sty m:val="p"/>
+              </m:rPr>
               <m:t>s</m:t>
+            </m:r>
+            <m:r>
+              <m:rPr>
+                <m:sty m:val="p"/>
+              </m:rPr>
+              <m:t>i</m:t>
+            </m:r>
+            <m:r>
+              <m:rPr>
+                <m:sty m:val="p"/>
+              </m:rPr>
+              <m:t>d</m:t>
+            </m:r>
+            <m:r>
+              <m:rPr>
+                <m:sty m:val="p"/>
+              </m:rPr>
+              <m:t>e</m:t>
             </m:r>
           </m:sub>
         </m:sSub>
@@ -26641,7 +27124,28 @@
           </m:e>
           <m:sub>
             <m:r>
+              <m:rPr>
+                <m:sty m:val="p"/>
+              </m:rPr>
               <m:t>s</m:t>
+            </m:r>
+            <m:r>
+              <m:rPr>
+                <m:sty m:val="p"/>
+              </m:rPr>
+              <m:t>i</m:t>
+            </m:r>
+            <m:r>
+              <m:rPr>
+                <m:sty m:val="p"/>
+              </m:rPr>
+              <m:t>d</m:t>
+            </m:r>
+            <m:r>
+              <m:rPr>
+                <m:sty m:val="p"/>
+              </m:rPr>
+              <m:t>e</m:t>
             </m:r>
           </m:sub>
         </m:sSub>
@@ -26841,7 +27345,7 @@
         <w:t xml:space="preserve"> </w:t>
       </w:r>
       <w:r>
-        <w:t xml:space="preserve">(dashed) and the Cầu Mây layout with a mid side-span sensor (open circle); (b) asymmetric beam, sensor at mid span 1, over</w:t>
+        <w:t xml:space="preserve">(dashed) and the Cầu Mây layout with a mid side-span sensor (open circle); (b) asymmetric beam, sensor at mid-span of span 1, over</w:t>
       </w:r>
       <w:r>
         <w:t xml:space="preserve"> </w:t>
@@ -27008,7 +27512,7 @@
         <w:t xml:space="preserve"> </w:t>
       </w:r>
       <w:r>
-        <w:t xml:space="preserve">(Eq. 10; 2.5 at a simply supported mid-span), rotation</w:t>
+        <w:t xml:space="preserve">(Eq. (10); 2.5 at a simply supported mid-span), rotation</w:t>
       </w:r>
       <w:r>
         <w:t xml:space="preserve"> </w:t>

</xml_diff>

<commit_message>
XII.13 round 2: fix 7 mandatory items and 8 author-approved readability items (axle offsets d_i, standard deviation wording, deflection influence line, gauge sections)
Co-Authored-By: Claude Opus 5.5 <noreply@anthropic.com>
Claude-Session: https://claude.ai/code/session_01LGLpDzAMfdMgWcXQjLxauw
</commit_message>
<xml_diff>
--- a/manuscript/v4/word/Manuscript_v4.docx
+++ b/manuscript/v4/word/Manuscript_v4.docx
@@ -659,6 +659,61 @@
             </w:pPr>
             <w:r>
               <w:t xml:space="preserve">distance of the gauged fibre from the neutral axis (m)</w:t>
+            </w:r>
+          </w:p>
+        </w:tc>
+      </w:tr>
+      <w:tr>
+        <w:tc>
+          <w:tcPr>
+            <w:tcW w:type="dxa" w:w="2892"/>
+          </w:tcPr>
+          <w:p>
+            <w:pPr>
+              <w:pStyle w:val="Compact"/>
+              <w:jc w:val="left"/>
+            </w:pPr>
+            <m:oMath>
+              <m:sSub>
+                <m:e>
+                  <m:r>
+                    <m:t>d</m:t>
+                  </m:r>
+                </m:e>
+                <m:sub>
+                  <m:r>
+                    <m:t>i</m:t>
+                  </m:r>
+                </m:sub>
+              </m:sSub>
+            </m:oMath>
+          </w:p>
+        </w:tc>
+        <w:tc>
+          <w:tcPr>
+            <w:tcW w:type="dxa" w:w="6177"/>
+          </w:tcPr>
+          <w:p>
+            <w:pPr>
+              <w:pStyle w:val="Compact"/>
+              <w:jc w:val="left"/>
+            </w:pPr>
+            <w:r>
+              <w:t xml:space="preserve">distance of axle</w:t>
+            </w:r>
+            <w:r>
+              <w:t xml:space="preserve"> </w:t>
+            </w:r>
+            <m:oMath>
+              <m:r>
+                <m:t>i</m:t>
+              </m:r>
+            </m:oMath>
+            <w:r>
+              <w:t xml:space="preserve"> </w:t>
+            </w:r>
+            <w:r>
+              <w:t xml:space="preserve">behind the first axle (m)</w:t>
             </w:r>
           </w:p>
         </w:tc>
@@ -4323,7 +4378,7 @@
         <m:sSub>
           <m:e>
             <m:r>
-              <m:t>a</m:t>
+              <m:t>d</m:t>
             </m:r>
           </m:e>
           <m:sub>
@@ -4343,7 +4398,7 @@
         <m:sSub>
           <m:e>
             <m:r>
-              <m:t>a</m:t>
+              <m:t>d</m:t>
             </m:r>
           </m:e>
           <m:sub>
@@ -4507,7 +4562,7 @@
                     <m:sSub>
                       <m:e>
                         <m:r>
-                          <m:t>a</m:t>
+                          <m:t>d</m:t>
                         </m:r>
                       </m:e>
                       <m:sub>
@@ -4576,7 +4631,7 @@
         <m:sSub>
           <m:e>
             <m:r>
-              <m:t>a</m:t>
+              <m:t>d</m:t>
             </m:r>
           </m:e>
           <m:sub>
@@ -4679,7 +4734,7 @@
                     <m:sSub>
                       <m:e>
                         <m:r>
-                          <m:t>a</m:t>
+                          <m:t>d</m:t>
                         </m:r>
                       </m:e>
                       <m:sub>
@@ -7076,7 +7131,7 @@
         </m:r>
       </m:oMath>
       <w:r>
-        <w:t xml:space="preserve">. For a mid-span sensor on two spans of equal rigidity, the blind span ratio and the optimal sensor position are</w:t>
+        <w:t xml:space="preserve">. For a mid-span sensor on two spans of equal rigidity, the blind span ratio and, for equal spans, the optimal sensor position are</w:t>
       </w:r>
     </w:p>
     <w:tbl>
@@ -10168,7 +10223,7 @@
         <w:pStyle w:val="BodyText"/>
       </w:pPr>
       <w:r>
-        <w:t xml:space="preserve">Because the two references differ, a common threshold of 0.2 means different things for the two channels: relative to the simply supported mid-span value, it is 8 % for deflection and 20 % for strain. Both thresholds are design conventions and are used as stated throughout.</w:t>
+        <w:t xml:space="preserve">Because the two reference values (2.5 and 1) differ, a common threshold of 0.2 means different things for the two channels: relative to the simply supported mid-span value, it is 8 % for deflection and 20 % for strain. Both thresholds are design conventions and are used as stated throughout.</w:t>
       </w:r>
     </w:p>
     <w:p>
@@ -10558,7 +10613,7 @@
         <w:t xml:space="preserve"> </w:t>
       </w:r>
       <w:r>
-        <w:t xml:space="preserve">near 1 therefore indicates restraint, not cancellation. The strain influence line is more local than the deflection line, so it cancels less at every prismatic location examined: at mid-span of two equal spans,</w:t>
+        <w:t xml:space="preserve">near 1 therefore indicates restraint, not cancellation. The strain influence line is more local than the deflection influence line, so it cancels less at every prismatic location examined: at mid-span of two equal spans,</w:t>
       </w:r>
       <w:r>
         <w:t xml:space="preserve"> </w:t>
@@ -14082,7 +14137,7 @@
         <w:t xml:space="preserve"> </w:t>
       </w:r>
       <w:r>
-        <w:t xml:space="preserve">is the span length. Deflection at that point was measured with a linear variable differential transformer of 0.005 mm resolution, while calibrated weights were suspended at 250 mm steps along the traverse.</w:t>
+        <w:t xml:space="preserve">is the span length. Deflection at that point was measured with a linear variable differential transformer of 0.005 mm resolution, while calibrated weights were suspended at 250 mm steps along the beam.</w:t>
       </w:r>
     </w:p>
     <w:p>
@@ -14755,7 +14810,7 @@
         <w:pStyle w:val="BodyText"/>
       </w:pPr>
       <w:r>
-        <w:t xml:space="preserve">Each deck gauge also needs its own constant. On day 1 the constant of ch11 is 3.9 times that of ch8, although the two gauges are within 6 m of each other and a one-dimensional beam model predicts nearly equal constants. The ratio of the st36 and st40 constants also changes with the lane, by about 2.5 standard errors, so gauge-factor spread is an unlikely cause; the deck-soffit gauges respond to slab bending and shear lag as well as to girder bending. The constant must therefore come from a weighed reference vehicle or a three-dimensional model, and a beam-model BPM would fail.</w:t>
+        <w:t xml:space="preserve">Each deck gauge also needs its own constant. On day 1 the constant of ch11 is 3.9 times that of ch8, although the two gauges are within 6 m of each other and a one-dimensional beam model predicts nearly equal constants. The ratio of the st36 and st40 constants also changes with the lane, by about 2.5 standard errors, so gauge-factor spread is an unlikely cause of the gauge-to-gauge differences; the deck-soffit gauges respond to slab bending and shear lag as well as to girder bending. The constant must therefore come from a weighed reference vehicle or a three-dimensional model, and a beam-model BPM would fail.</w:t>
       </w:r>
     </w:p>
     <w:p>
@@ -15434,7 +15489,7 @@
         <w:pStyle w:val="BodyText"/>
       </w:pPr>
       <w:r>
-        <w:t xml:space="preserve">Two deflection gauges were read: N8 in the side span between pier T7 and end support T8, at 0.4L (22 m) from T8, and N7 at mid main span. In the June 2020 acceptance test, four trucks stood in the side span (gauge N8) and six in the main span (gauge N7). The trucks were 3-axle, nominally 5 + 10 + 10 t, with a weighed mean of 25.06 t. Dial gauges read the peak deflection under centric and eccentric transverse positions [NEED VALUE: instrument type and fixed reference datum of the dial gauges, temperature correction, load-hold time and zero-reading procedure]. Each gauge section has six readings (three measuring points across the section, on the axis and at both edges, under centric and eccentric truck arrangements); their mean is 5.55 mm at N8 and 15.42 mm at N7.</w:t>
+        <w:t xml:space="preserve">Two deflection gauge sections were read: N8 in the side span between pier T7 and end support T8, at 0.4L (22 m) from T8, and N7 at mid main span. In the June 2020 acceptance test, four trucks stood in the side span (gauge N8) and six in the main span (gauge N7). The trucks were 3-axle, nominally 5 + 10 + 10 t, with a weighed mean of 25.06 t. Dial gauges read the peak deflection under centric and eccentric transverse positions [NEED VALUE: instrument type and fixed reference datum of the dial gauges, temperature correction, load-hold time and zero-reading procedure]. Each gauge section has six readings (three measuring points across the section, on the axis and at both edges, under centric and eccentric truck arrangements); their mean is 5.55 mm at N8 and 15.42 mm at N7.</w:t>
       </w:r>
     </w:p>
     <w:p>
@@ -15857,7 +15912,7 @@
         </m:r>
       </m:oMath>
       <w:r>
-        <w:t xml:space="preserve">. The six readings of each gauge section spread by 1.9–2.0 % about their mean. This spread comes from the transverse positions and is not a measure of repeatability, because the readings are not replicates. Combined in quadrature with a model-form spread of 1.75 %, it gives a standard uncertainty of 2.64 % per reading, and</w:t>
+        <w:t xml:space="preserve">. The six readings of each gauge section have a standard deviation of 1.9–2.0 % about their mean. This scatter comes from the transverse positions and is not a measure of repeatability, because the readings are not replicates. Combined in quadrature with a model-form standard uncertainty of 1.75 %, it gives a standard uncertainty of 2.64 % per reading, and</w:t>
       </w:r>
       <w:r>
         <w:t xml:space="preserve"> </w:t>
@@ -18677,13 +18732,13 @@
         </w:tblBorders>
       </w:tblPr>
       <w:tblGrid>
-        <w:gridCol w:w="1562"/>
-        <w:gridCol w:w="1302"/>
-        <w:gridCol w:w="1302"/>
-        <w:gridCol w:w="1149"/>
-        <w:gridCol w:w="1149"/>
-        <w:gridCol w:w="1149"/>
-        <w:gridCol w:w="1455"/>
+        <w:gridCol w:w="1536"/>
+        <w:gridCol w:w="1431"/>
+        <w:gridCol w:w="1280"/>
+        <w:gridCol w:w="1129"/>
+        <w:gridCol w:w="1129"/>
+        <w:gridCol w:w="1129"/>
+        <w:gridCol w:w="1431"/>
       </w:tblGrid>
       <w:tr>
         <w:trPr>
@@ -18691,7 +18746,7 @@
         </w:trPr>
         <w:tc>
           <w:tcPr>
-            <w:tcW w:type="dxa" w:w="1562"/>
+            <w:tcW w:type="dxa" w:w="1536"/>
             <w:tcBorders>
               <w:top w:val="nil"/>
               <w:left w:val="nil"/>
@@ -18711,7 +18766,7 @@
         </w:tc>
         <w:tc>
           <w:tcPr>
-            <w:tcW w:type="dxa" w:w="1302"/>
+            <w:tcW w:type="dxa" w:w="1431"/>
             <w:tcBorders>
               <w:top w:val="nil"/>
               <w:left w:val="nil"/>
@@ -18739,7 +18794,7 @@
         </w:tc>
         <w:tc>
           <w:tcPr>
-            <w:tcW w:type="dxa" w:w="1302"/>
+            <w:tcW w:type="dxa" w:w="1280"/>
             <w:tcBorders>
               <w:top w:val="nil"/>
               <w:left w:val="nil"/>
@@ -18759,7 +18814,7 @@
         </w:tc>
         <w:tc>
           <w:tcPr>
-            <w:tcW w:type="dxa" w:w="1149"/>
+            <w:tcW w:type="dxa" w:w="1129"/>
             <w:tcBorders>
               <w:top w:val="nil"/>
               <w:left w:val="nil"/>
@@ -18779,7 +18834,7 @@
         </w:tc>
         <w:tc>
           <w:tcPr>
-            <w:tcW w:type="dxa" w:w="1149"/>
+            <w:tcW w:type="dxa" w:w="1129"/>
             <w:tcBorders>
               <w:top w:val="nil"/>
               <w:left w:val="nil"/>
@@ -18799,7 +18854,7 @@
         </w:tc>
         <w:tc>
           <w:tcPr>
-            <w:tcW w:type="dxa" w:w="1149"/>
+            <w:tcW w:type="dxa" w:w="1129"/>
             <w:tcBorders>
               <w:top w:val="nil"/>
               <w:left w:val="nil"/>
@@ -18819,7 +18874,7 @@
         </w:tc>
         <w:tc>
           <w:tcPr>
-            <w:tcW w:type="dxa" w:w="1455"/>
+            <w:tcW w:type="dxa" w:w="1431"/>
             <w:tcBorders>
               <w:top w:val="nil"/>
               <w:left w:val="nil"/>
@@ -18841,7 +18896,7 @@
       <w:tr>
         <w:tc>
           <w:tcPr>
-            <w:tcW w:type="dxa" w:w="1562"/>
+            <w:tcW w:type="dxa" w:w="1536"/>
           </w:tcPr>
           <w:p>
             <w:pPr>
@@ -18855,7 +18910,7 @@
         </w:tc>
         <w:tc>
           <w:tcPr>
-            <w:tcW w:type="dxa" w:w="1302"/>
+            <w:tcW w:type="dxa" w:w="1431"/>
           </w:tcPr>
           <w:p>
             <w:pPr>
@@ -18869,7 +18924,7 @@
         </w:tc>
         <w:tc>
           <w:tcPr>
-            <w:tcW w:type="dxa" w:w="1302"/>
+            <w:tcW w:type="dxa" w:w="1280"/>
           </w:tcPr>
           <w:p>
             <w:pPr>
@@ -18883,7 +18938,7 @@
         </w:tc>
         <w:tc>
           <w:tcPr>
-            <w:tcW w:type="dxa" w:w="1149"/>
+            <w:tcW w:type="dxa" w:w="1129"/>
           </w:tcPr>
           <w:p>
             <w:pPr>
@@ -18897,7 +18952,7 @@
         </w:tc>
         <w:tc>
           <w:tcPr>
-            <w:tcW w:type="dxa" w:w="1149"/>
+            <w:tcW w:type="dxa" w:w="1129"/>
           </w:tcPr>
           <w:p>
             <w:pPr>
@@ -18911,7 +18966,7 @@
         </w:tc>
         <w:tc>
           <w:tcPr>
-            <w:tcW w:type="dxa" w:w="1149"/>
+            <w:tcW w:type="dxa" w:w="1129"/>
           </w:tcPr>
           <w:p>
             <w:pPr>
@@ -18925,7 +18980,7 @@
         </w:tc>
         <w:tc>
           <w:tcPr>
-            <w:tcW w:type="dxa" w:w="1455"/>
+            <w:tcW w:type="dxa" w:w="1431"/>
           </w:tcPr>
           <w:p>
             <w:pPr>
@@ -18941,7 +18996,7 @@
       <w:tr>
         <w:tc>
           <w:tcPr>
-            <w:tcW w:type="dxa" w:w="1562"/>
+            <w:tcW w:type="dxa" w:w="1536"/>
           </w:tcPr>
           <w:p>
             <w:pPr>
@@ -18955,21 +19010,21 @@
         </w:tc>
         <w:tc>
           <w:tcPr>
-            <w:tcW w:type="dxa" w:w="1302"/>
-          </w:tcPr>
-          <w:p>
-            <w:pPr>
-              <w:pStyle w:val="Compact"/>
-              <w:jc w:val="left"/>
-            </w:pPr>
-            <w:r>
-              <w:t xml:space="preserve">3.0–20 × 10⁻⁵</w:t>
-            </w:r>
-          </w:p>
-        </w:tc>
-        <w:tc>
-          <w:tcPr>
-            <w:tcW w:type="dxa" w:w="1302"/>
+            <w:tcW w:type="dxa" w:w="1431"/>
+          </w:tcPr>
+          <w:p>
+            <w:pPr>
+              <w:pStyle w:val="Compact"/>
+              <w:jc w:val="left"/>
+            </w:pPr>
+            <w:r>
+              <w:t xml:space="preserve">0.30–2.0 × 10⁻⁴</w:t>
+            </w:r>
+          </w:p>
+        </w:tc>
+        <w:tc>
+          <w:tcPr>
+            <w:tcW w:type="dxa" w:w="1280"/>
           </w:tcPr>
           <w:p>
             <w:pPr>
@@ -18983,7 +19038,7 @@
         </w:tc>
         <w:tc>
           <w:tcPr>
-            <w:tcW w:type="dxa" w:w="1149"/>
+            <w:tcW w:type="dxa" w:w="1129"/>
           </w:tcPr>
           <w:p>
             <w:pPr>
@@ -18997,7 +19052,7 @@
         </w:tc>
         <w:tc>
           <w:tcPr>
-            <w:tcW w:type="dxa" w:w="1149"/>
+            <w:tcW w:type="dxa" w:w="1129"/>
           </w:tcPr>
           <w:p>
             <w:pPr>
@@ -19011,7 +19066,7 @@
         </w:tc>
         <w:tc>
           <w:tcPr>
-            <w:tcW w:type="dxa" w:w="1149"/>
+            <w:tcW w:type="dxa" w:w="1129"/>
           </w:tcPr>
           <w:p>
             <w:pPr>
@@ -19025,7 +19080,7 @@
         </w:tc>
         <w:tc>
           <w:tcPr>
-            <w:tcW w:type="dxa" w:w="1455"/>
+            <w:tcW w:type="dxa" w:w="1431"/>
           </w:tcPr>
           <w:p>
             <w:pPr>
@@ -19084,7 +19139,7 @@
         <w:pStyle w:val="BodyText"/>
       </w:pPr>
       <w:r>
-        <w:t xml:space="preserve">Transverse position and multiple presence add further terms; Table 8 collects all terms. On the five-span girder the far-lane constant was 0.79 of the near-lane value. At Cầu Mây the readings across one section spread by up to 2.05 mm in the eccentric N7 case, about 13 % of the mean reading.</w:t>
+        <w:t xml:space="preserve">Transverse position and multiple presence add further terms; Table 8 collects all terms. On the five-span girder the far-lane constant was 0.79 of the near-lane value. At Cầu Mây the readings across one section differ by up to 2.05 mm in the eccentric N7 case, about 13 % of the mean reading.</w:t>
       </w:r>
     </w:p>
     <w:p>
@@ -19889,7 +19944,7 @@
               <w:jc w:val="left"/>
             </w:pPr>
             <w:r>
-              <w:t xml:space="preserve">field lane ratio 0.79; Cầu Mây spread 2.05 mm</w:t>
+              <w:t xml:space="preserve">field lane ratio 0.79; Cầu Mây range 2.05 mm across a section</w:t>
             </w:r>
           </w:p>
         </w:tc>
@@ -20005,7 +20060,7 @@
               <w:jc w:val="left"/>
             </w:pPr>
             <w:r>
-              <w:t xml:space="preserve">laboratory step 1.010 → 1.017</w:t>
+              <w:t xml:space="preserve">laboratory integral ratio 1.010 → 1.017</w:t>
             </w:r>
           </w:p>
         </w:tc>
@@ -20016,7 +20071,7 @@
         <w:pStyle w:val="BodyText"/>
       </w:pPr>
       <w:r>
-        <w:t xml:space="preserve">In the laboratory, the reference record and the load-dependent step limit SLM to 0.6–0.7 %. In the field, the noise, the lane and the gauge position dominate, and the weight errors of single crossings, 5–12 % on these records, exceed the spread of the reference weights.</w:t>
+        <w:t xml:space="preserve">In the laboratory, the reference record and the load-dependent growth of the integral ratio cause the SLM deviations of 0.6–0.7 %. In the field, the noise, the lane and the gauge position dominate, and the weight errors of single crossings, 5–12 % on these records, exceed the spread of the reference weights.</w:t>
       </w:r>
     </w:p>
     <w:p>
@@ -20024,7 +20079,7 @@
         <w:pStyle w:val="BodyText"/>
       </w:pPr>
       <w:r>
-        <w:t xml:space="preserve">The method is therefore proposed for preliminary overload screening, with the decision threshold set apart from the legal limit and the design live loads [54,55]. Setting that threshold needs field calibration with trucks of clearly different weights, which this study did not have.</w:t>
+        <w:t xml:space="preserve">The method is therefore proposed for preliminary overload screening, with the decision threshold set with a margin below the legal limit and the design live loads [54,55]. Setting that threshold needs field calibration with trucks of clearly different weights, which this study did not have.</w:t>
       </w:r>
     </w:p>
     <w:bookmarkEnd w:id="39"/>
@@ -20809,7 +20864,7 @@
         <w:t xml:space="preserve"> </w:t>
       </w:r>
       <w:r>
-        <w:t xml:space="preserve">Integrate in space over the complete crossing, re-zero before and after each crossing, remove dynamics with a low-pass filter well below the fundamental frequency</w:t>
+        <w:t xml:space="preserve">Integrate in space over the complete crossing, re-zero before and after each crossing, remove dynamics with a low-pass filter whose cut-off is well below the fundamental frequency</w:t>
       </w:r>
       <w:r>
         <w:t xml:space="preserve"> </w:t>
@@ -22458,7 +22513,28 @@
           </m:e>
           <m:sub>
             <m:r>
-              <m:t>c</m:t>
+              <m:rPr>
+                <m:sty m:val="p"/>
+              </m:rPr>
+              <m:t>m</m:t>
+            </m:r>
+            <m:r>
+              <m:rPr>
+                <m:sty m:val="p"/>
+              </m:rPr>
+              <m:t>a</m:t>
+            </m:r>
+            <m:r>
+              <m:rPr>
+                <m:sty m:val="p"/>
+              </m:rPr>
+              <m:t>i</m:t>
+            </m:r>
+            <m:r>
+              <m:rPr>
+                <m:sty m:val="p"/>
+              </m:rPr>
+              <m:t>n</m:t>
             </m:r>
           </m:sub>
         </m:sSub>
@@ -26191,7 +26267,7 @@
         <w:pStyle w:val="FirstParagraph"/>
       </w:pPr>
       <w:r>
-        <w:t xml:space="preserve">All analyses were implemented by the authors in reproducible scripts: the closed forms and their FE verification, the multi-channel estimators, placement study and Monte Carlo simulation, the identifiability analysis of the in-service girder, the processing of the public field records and the laboratory evaluation. Generative artificial intelligence was used as an assistance tool during code development and debugging. Every equation and numerical output was checked independently against an analytical, finite element or convergence-based route, and the scripts and the console output of each run are provided as supplementary material.</w:t>
+        <w:t xml:space="preserve">All analyses were implemented by the authors in reproducible scripts: the closed forms and their FE verification, the multi-channel estimators, placement study and Monte Carlo simulation, the identifiability analysis of the in-service girder, the processing of the public field records and the laboratory evaluation. Generative artificial intelligence was used as an assistance tool during code development and debugging. Every equation and numerical output was checked independently against an analytical, finite element or convergence-based route, and the scripts and the console output of each run are provided as Supplementary Material.</w:t>
       </w:r>
     </w:p>
     <w:bookmarkEnd w:id="45"/>
@@ -26209,7 +26285,7 @@
         <w:pStyle w:val="FirstParagraph"/>
       </w:pPr>
       <w:r>
-        <w:t xml:space="preserve">The field strain records analysed in Section 4 are publicly available in the NOR-BWIM dataset (figshare, https://doi.org/10.7294/26880898.v1, CC0) [49]. The laboratory deflection data are given in full in the Supplementary Material. The derived data behind every figure and table, the analysis scripts and the console output of each run are provided as supplementary material. The Cầu Mây load test was performed by an author of this paper, and the authors are permitted to publish the processed data (static deflection readings, truck positions, weighed truck masses and reported frequencies), which are available at [NEED VALUE: repository name and DOI].</w:t>
+        <w:t xml:space="preserve">The field strain records analysed in Section 4 are publicly available in the NOR-BWIM dataset (figshare, https://doi.org/10.7294/26880898.v1, CC0) [49]. The laboratory deflection data are given in full in the Supplementary Material. The derived data behind every figure and table, the analysis scripts and the console output of each run are provided as Supplementary Material. The Cầu Mây load test was performed by an author of this paper, and the authors are permitted to publish the processed data (static deflection readings, truck positions, weighed truck masses and reported frequencies), which are available at [NEED VALUE: repository name and DOI].</w:t>
       </w:r>
     </w:p>
     <w:bookmarkEnd w:id="46"/>
@@ -26345,13 +26421,13 @@
       </w:r>
     </w:p>
     <w:bookmarkEnd w:id="51"/>
-    <w:bookmarkStart w:id="52" w:name="supplementary-materials"/>
+    <w:bookmarkStart w:id="52" w:name="supplementary-material"/>
     <w:p>
       <w:pPr>
         <w:pStyle w:val="Heading2"/>
       </w:pPr>
       <w:r>
-        <w:t xml:space="preserve">Supplementary Materials</w:t>
+        <w:t xml:space="preserve">Supplementary Material</w:t>
       </w:r>
     </w:p>
     <w:p>
@@ -26359,7 +26435,7 @@
         <w:pStyle w:val="FirstParagraph"/>
       </w:pPr>
       <w:r>
-        <w:t xml:space="preserve">The supplementary material contains: (i) the analysis scripts and the console output of each run, with a README that maps every table and figure to a script and log; (ii) the derived data behind every figure and table; (iii) the laboratory specimen, influence line, quadrature study and full data; (iv) the field-record tables: per-channel constants and scatter with χ² tests (Table S1), truck-to-truck ratios with equivalence tests (Table S2), correlations of vehicle-free noise and crossing residuals (Table S3), the per-crossing standard deviations predicted by both covariance models (Table S4) and the full table of estimator errors (Table S5); the processing details and excluded runs, the speed regressions, lane-B and two-truck results, and all estimator results including leave-one-truck-out, in-sample and GLS with the covariance estimated from crossing residuals (Figs. S1–S2); (v) the beam model of the five-span girder, including the strain constant of the gauges relative to the largest on the girder, and the synthetic records of the dataset authors (Figs. S3–S4); (vi) strain blind-locus maps (Figs. S5–S6); (vii) the multi-channel placement study (brute-force search over all cases), Monte Carlo verification and structure-aware weighting functions (Figs. S7–S9); (viii) the asymmetric three-span closed forms; (ix) the Cầu Mây design section properties and concrete modulus, the model-form variants (depth lengths, exponents, rigid pier zone), the frequency interpretation, admissible sets against tolerance (3 %, 4 % and 5.3 %, with and without a prior on</w:t>
+        <w:t xml:space="preserve">The Supplementary Material contains: (i) the analysis scripts and the console output of each run, with a README that maps every table and figure to a script and log; (ii) the derived data behind every figure and table; (iii) the laboratory specimen, influence line, quadrature study and full data; (iv) the field-record tables: per-channel constants and scatter with χ² tests (Table S1), truck-to-truck ratios with equivalence tests (Table S2), correlations of vehicle-free noise and crossing residuals (Table S3), the per-crossing standard deviations predicted by both covariance models (Table S4) and the full table of estimator errors (Table S5); the processing details and excluded runs, the speed regressions, lane-B and two-truck results, and all estimator results including leave-one-truck-out, in-sample and GLS with the covariance estimated from crossing residuals (Figs. S1–S2); (v) the beam model of the five-span girder, including the strain constant of the gauges relative to the largest on the girder, and the synthetic records of the dataset authors (Figs. S3–S4); (vi) strain blind-locus maps (Figs. S5–S6); (vii) the multi-channel placement study (brute-force search over all cases), Monte Carlo verification and structure-aware weighting functions (Figs. S7–S9); (viii) the asymmetric three-span closed forms; (ix) the Cầu Mây design section properties and concrete modulus, the model-form variants (depth lengths, exponents, rigid pier zone), the frequency interpretation, admissible sets against tolerance (3 %, 4 % and 5.3 %, with and without a prior on</w:t>
       </w:r>
       <w:r>
         <w:t xml:space="preserve"> </w:t>

</xml_diff>

<commit_message>
XII.13 final round: fix 10 mandatory items and 8 author-approved readability items; renumber supplementary figures (lab influence line = Fig. S1); move supplementary notes to their sections
Co-Authored-By: Claude Opus 5.5 <noreply@anthropic.com>
Claude-Session: https://claude.ai/code/session_01LGLpDzAMfdMgWcXQjLxauw
</commit_message>
<xml_diff>
--- a/manuscript/v4/word/Manuscript_v4.docx
+++ b/manuscript/v4/word/Manuscript_v4.docx
@@ -90,7 +90,7 @@
         <w:pStyle w:val="FirstParagraph"/>
       </w:pPr>
       <w:r>
-        <w:t xml:space="preserve">Influence-area weigh-in-motion estimates gross vehicle weight from the area under a response record. On a continuous girder, positive and negative parts of the influence line can cancel, leaving a gauge blind to the load. This paper gives criteria for choosing, before installation, channels that observe the total load. They build on the influence-area identity: the area under a record equals the load times the channel’s response to a uniform unit load, the integral constant. Closed forms give the blind loci of five channel types (deflection, strain, rotation, shear, reaction) on continuous and haunched girders. Strain gauges are blind wherever the uniform-load moment vanishes, and nearly blind in a band around these points. A cancellation ratio separates cancellation from restraint. Optimal sensors lie at the extremes of the uniform-load response. A closed-form law gives the integral constant as a function of uncertain pier stiffness. A static test on a laboratory two-span beam confirms the identity. On public moving-truck records from a five-span box girder, invariance of the constant could be shown only within margins of 10–27 %, and the narrow range of reference weights did not allow weight discrimination to be tested. Generalised least-squares weights estimated from vehicle-free noise performed worse out of sample than the gauge average, because crossing residuals are much less correlated between gauges than vehicle-free noise. On an in-service three-span box girder, two static readings leave the constant of a side-span deflection gauge uncertain by a factor of 6.6, while the main-span gauge is well determined.</w:t>
+        <w:t xml:space="preserve">Influence-area weigh-in-motion estimates gross vehicle weight from the area under a response record. On a continuous girder, positive and negative parts of the influence line can cancel, leaving a gauge blind to the load. This paper gives criteria for choosing, before installation, channels that observe the total load. The criteria build on the influence-area identity: the area under a record equals the load times the channel’s response to a uniform unit load, the integral constant. Closed forms give the blind loci of five channel types (deflection, strain, rotation, shear, reaction) on continuous and haunched girders. Strain gauges are blind wherever the uniform-load moment vanishes, and nearly blind in a band around these points. A cancellation ratio separates cancellation from restraint. Optimal sensors lie at the extremes of the uniform-load response. A closed-form law gives the integral constant as a function of uncertain pier stiffness. A static test on a laboratory two-span beam confirms the identity. On public moving-truck records from a five-span box girder, invariance of the constant could be shown only within margins of 10–27 %, and the narrow range of reference weights did not allow weight discrimination to be tested. Generalised least-squares weights estimated from vehicle-free noise performed worse out of sample than the gauge average, because crossing residuals are much less correlated between gauges than vehicle-free noise. On an in-service three-span box girder, two static readings leave the constant of a side-span deflection gauge uncertain by a factor of 6.6, while the main-span gauge is well determined.</w:t>
       </w:r>
     </w:p>
     <w:p>
@@ -995,6 +995,38 @@
             </w:pPr>
             <w:r>
               <w:t xml:space="preserve">weighting function applied along a record</w:t>
+            </w:r>
+          </w:p>
+        </w:tc>
+      </w:tr>
+      <w:tr>
+        <w:tc>
+          <w:tcPr>
+            <w:tcW w:type="dxa" w:w="2892"/>
+          </w:tcPr>
+          <w:p>
+            <w:pPr>
+              <w:pStyle w:val="Compact"/>
+              <w:jc w:val="left"/>
+            </w:pPr>
+            <m:oMath>
+              <m:r>
+                <m:t>h</m:t>
+              </m:r>
+            </m:oMath>
+          </w:p>
+        </w:tc>
+        <w:tc>
+          <w:tcPr>
+            <w:tcW w:type="dxa" w:w="6177"/>
+          </w:tcPr>
+          <w:p>
+            <w:pPr>
+              <w:pStyle w:val="Compact"/>
+              <w:jc w:val="left"/>
+            </w:pPr>
+            <w:r>
+              <w:t xml:space="preserve">girder depth (m)</w:t>
             </w:r>
           </w:p>
         </w:tc>
@@ -3866,7 +3898,7 @@
         <w:pStyle w:val="BodyText"/>
       </w:pPr>
       <w:r>
-        <w:t xml:space="preserve">A simpler family estimates only the gross weight from the area under the response. Ojio and Yamada integrated the strain records of plate-girder stringers, multiplied the result by the speed and calibrated it against a truck of known weight [23]; this calibration is called the standard-load method (SLM) below. The method has been used in long-term monitoring [24]. On a seven-span slab-on-girder bridge it was accurate to within 5 % for test trucks with well-estimated speeds [25,26]. Later work added strain-area and strain-integral variants [27–29], shear-strain weighing [30], a sparse-sensing influence-area system that chose the number and location of strain gauges on a single-span bridge [31], simplified BWIM in the field [32] and load-cell reactions [33]. Yan et al. proposed a probabilistic, influence-line-free gross-weight scheme based on a transmissibility-like index [34]. The integral of the influence line has also served as a damage feature [35,36], and the present authors used the integral of mid-span deflection on a simply supported beam [37].</w:t>
+        <w:t xml:space="preserve">A simpler family estimates only the gross weight from the area under the response. Ojio and Yamada integrated the strain records of plate-girder stringers, multiplied the result by the speed and calibrated it against a truck of known weight [23]; this calibration is called the standard-load method (SLM) below. The method has been used in long-term monitoring [24]. On a seven-span slab-on-girder bridge it was accurate to within 5 % for test trucks with well-estimated speeds [25,26]. Later work added strain-area and strain-integral variants [27–29], shear-strain weighing [30], a sparse-sensing influence-area system that chose the number and location of strain gauges on a single-span bridge [31], simplified BWIM in the field [32] and load-cell reactions [33]. Yan et al. proposed a probabilistic, influence-line-free gross-weight scheme based on a transmissibility-like index [34]. The integral of the influence line has also served as a damage feature [35,36], and two of the present authors used the integral of mid-span deflection on a simply supported beam [37].</w:t>
       </w:r>
     </w:p>
     <w:p>
@@ -4004,7 +4036,21 @@
         <w:pStyle w:val="BodyText"/>
       </w:pPr>
       <w:r>
-        <w:t xml:space="preserve">an identifiability analysis of the constant under boundary uncertainty: the constant depends on pier stiffness only through the scaled pier stiffness</w:t>
+        <w:t xml:space="preserve">an identifiability analysis of the integral constant under boundary uncertainty: the constant depends on the rotational stiffness</w:t>
+      </w:r>
+      <w:r>
+        <w:t xml:space="preserve"> </w:t>
+      </w:r>
+      <m:oMath>
+        <m:r>
+          <m:t>k</m:t>
+        </m:r>
+      </m:oMath>
+      <w:r>
+        <w:t xml:space="preserve"> </w:t>
+      </w:r>
+      <w:r>
+        <w:t xml:space="preserve">of the piers only through the scaled pier stiffness</w:t>
       </w:r>
       <w:r>
         <w:t xml:space="preserve"> </w:t>
@@ -4033,7 +4079,21 @@
         </m:r>
       </m:oMath>
       <w:r>
-        <w:t xml:space="preserve">, following a linear-fractional (Möbius) law, and the analysis names the measurement that resolves it;</w:t>
+        <w:t xml:space="preserve">, where</w:t>
+      </w:r>
+      <w:r>
+        <w:t xml:space="preserve"> </w:t>
+      </w:r>
+      <m:oMath>
+        <m:r>
+          <m:t>α</m:t>
+        </m:r>
+      </m:oMath>
+      <w:r>
+        <w:t xml:space="preserve"> </w:t>
+      </w:r>
+      <w:r>
+        <w:t xml:space="preserve">is the ratio of effective to design girder rigidity, following a linear-fractional (Möbius) law, and the analysis names the measurement that resolves it;</w:t>
       </w:r>
     </w:p>
     <w:p>
@@ -14646,7 +14706,7 @@
         <w:pStyle w:val="FirstParagraph"/>
       </w:pPr>
       <w:r>
-        <w:t xml:space="preserve">This section asks what integral estimators deliver on real moving-load records from a continuous girder. It reports the main results with 95 % confidence intervals (CIs) and compares single- and multi-channel estimators out of sample. The per-channel tables, the equivalence tests, the noise correlations and the full estimator table are in Supplementary Tables S2–S6, and the speed regressions in Supplementary Fig. S2.</w:t>
+        <w:t xml:space="preserve">This section asks what integral estimators deliver on real moving-load records from a continuous girder. It reports the main results with 95 % confidence intervals (CIs) and compares single- and multi-channel estimators out of sample. The per-channel tables, the equivalence tests, the noise correlations and the full estimator table are in Supplementary Tables S2–S6, and the speed regressions in Supplementary Fig. S3.</w:t>
       </w:r>
     </w:p>
     <w:bookmarkStart w:id="30" w:name="data-and-reference-weights"/>
@@ -14663,7 +14723,7 @@
         <w:pStyle w:val="FirstParagraph"/>
       </w:pPr>
       <w:r>
-        <w:t xml:space="preserve">The Nothing-on-Road BWIM (NOR-BWIM) dataset [49] (CC0 licence) contains strain records of the Virginia Smart Road Bridge, documented in [41–43,50]. The bridge is a post-tensioned concrete box girder continuous over five spans of 86.5 + 3 × 144 + 86.5 m = 605 m. Strain transducers on the soffit of the top slab lie near mid-span of span 2, 158.5 m from the first abutment, in longitudinal stations about 2 m apart under the wheel path.</w:t>
+        <w:t xml:space="preserve">The Nothing-on-Road BWIM (NOR-BWIM) dataset [49] (CC0 licence) contains strain records of the Virginia Smart Road Bridge, documented in [41–43,50]. The bridge is a post-tensioned concrete box girder continuous over five spans of 86.5 + 3 × 144 + 86.5 m = 605 m. Strain transducers on the soffit of the top slab lie near mid-span of span 2, 158.5 m from the first abutment, at longitudinal stations about 2 m apart under the wheel path.</w:t>
       </w:r>
     </w:p>
     <w:p>
@@ -14794,7 +14854,7 @@
         <w:pStyle w:val="BodyText"/>
       </w:pPr>
       <w:r>
-        <w:t xml:space="preserve">On day 2, the ratio of the gauge-average constants of the 5-axle and the 3-axle truck is 0.98 (95 % CI 0.70–1.37; Fig. 6b). The result is consistent with Eq. (2), but with eight runs it cannot exclude differences of up to about 27 %. It is therefore a coarse check of linearity and processing, not a sharp test of the identity. No speed effect was resolved, but the confidence interval of the slope is too wide to call the constant speed-independent (Supplementary Fig. S2).</w:t>
+        <w:t xml:space="preserve">On day 2, the ratio of the gauge-average constants of the 5-axle and the 3-axle truck is 0.98 (95 % CI 0.70–1.37; Fig. 6b). The result is consistent with Eq. (2), but with eight runs it cannot exclude differences of up to about 27 %. It is therefore a coarse check of linearity and processing, not a sharp test of the identity. No speed effect was resolved, but the confidence interval of the slope is too wide to call the constant speed-independent (Supplementary Fig. S3).</w:t>
       </w:r>
     </w:p>
     <w:p>
@@ -15372,7 +15432,7 @@
         <w:pStyle w:val="BodyText"/>
       </w:pPr>
       <w:r>
-        <w:t xml:space="preserve">On day 2, GLS with the measured covariance was worse than the gauge average: 20.4 % against 11.9 % MAE. The paired difference is +8.5 percentage points (95 % CI +2.3 to +15.1), so GLS and the zero-sum estimator are both significantly worse than the average. On day 1 the estimators cannot be told apart, and on both days every estimator is worse than the mean-weight predictor.</w:t>
+        <w:t xml:space="preserve">On day 2, GLS with the measured covariance was worse than the gauge average: 20.4 % against 11.9 % MAE. The paired difference is +8.5 percentage points (95 % CI +2.3 to +15.1), so GLS is significantly worse than the average; the zero-sum estimator, with almost the same error (20.3 %), is worse as well. On day 1 the estimators cannot be told apart, and on both days every estimator is worse than the mean-weight predictor.</w:t>
       </w:r>
     </w:p>
     <w:p>
@@ -15549,10 +15609,21 @@
         </m:sSup>
       </m:oMath>
       <w:r>
-        <w:t xml:space="preserve"> </w:t>
-      </w:r>
-      <w:r>
-        <w:t xml:space="preserve">fitted to the two design sections, and a rotational spring</w:t>
+        <w:t xml:space="preserve">, where</w:t>
+      </w:r>
+      <w:r>
+        <w:t xml:space="preserve"> </w:t>
+      </w:r>
+      <m:oMath>
+        <m:r>
+          <m:t>h</m:t>
+        </m:r>
+      </m:oMath>
+      <w:r>
+        <w:t xml:space="preserve"> </w:t>
+      </w:r>
+      <w:r>
+        <w:t xml:space="preserve">is the girder depth, fitted to the two design sections, and a rotational spring</w:t>
       </w:r>
       <w:r>
         <w:t xml:space="preserve"> </w:t>
@@ -15566,7 +15637,7 @@
         <w:t xml:space="preserve"> </w:t>
       </w:r>
       <w:r>
-        <w:t xml:space="preserve">at each inner pier. The depth law and the pier dimensions are not documented, so other depth lengths and exponents and a rigid pier zone were tested as model-form variants (Supplementary Material).</w:t>
+        <w:t xml:space="preserve">at each inner pier. The depth law and the pier dimensions are not documented, so other haunch lengths and exponents and a rigid pier zone were tested as model-form variants (Supplementary Material).</w:t>
       </w:r>
     </w:p>
     <w:p>
@@ -17556,7 +17627,7 @@
         <w:pStyle w:val="BodyText"/>
       </w:pPr>
       <w:r>
-        <w:t xml:space="preserve">Strain channels behave differently (Fig. 8). The haunches move every zero-moment point towards mid-span. Over the range of pier stiffness the side-span zero lies 26.0–33.3 m from the abutment, so a strain gauge at mid side span would be practically blind under calibration A (</w:t>
+        <w:t xml:space="preserve">Strain channels behave differently (Fig. 8). The haunches move every zero-moment point towards mid-span. Over the range of pier stiffness the side-span zero lies 26.0–33.3 m from the end support, so a strain gauge at mid side span would be practically blind under calibration A (</w:t>
       </w:r>
       <m:oMath>
         <m:sSub>
@@ -17582,7 +17653,7 @@
         </m:r>
       </m:oMath>
       <w:r>
-        <w:t xml:space="preserve">) and would change sign with pinned piers. The centre of the main span lies in the strain near-blind band in every haunched model (</w:t>
+        <w:t xml:space="preserve">) and would change sign with pinned piers. The centre of the main span lies in or at the edge of the strain near-blind band in every haunched model (</w:t>
       </w:r>
       <m:oMath>
         <m:sSub>
@@ -18442,7 +18513,7 @@
         <w:pStyle w:val="BodyText"/>
       </w:pPr>
       <w:r>
-        <w:t xml:space="preserve">The in-service girder shows that a side-span deflection gauge on a layout near the prismatic blind locus is not identifiable from static acceptance data, whereas a main-span gauge is. One tiltmeter or one integral ratio would discriminate between the reference calibrations.</w:t>
+        <w:t xml:space="preserve">The in-service girder shows that a side-span deflection gauge on a layout near the prismatic blind locus has a constant that is not identifiable from static acceptance data, whereas a main-span gauge is. One tiltmeter or one integral ratio would discriminate between the reference calibrations.</w:t>
       </w:r>
     </w:p>
     <w:bookmarkEnd w:id="37"/>
@@ -18732,13 +18803,13 @@
         </w:tblBorders>
       </w:tblPr>
       <w:tblGrid>
-        <w:gridCol w:w="1536"/>
-        <w:gridCol w:w="1431"/>
-        <w:gridCol w:w="1280"/>
-        <w:gridCol w:w="1129"/>
-        <w:gridCol w:w="1129"/>
-        <w:gridCol w:w="1129"/>
-        <w:gridCol w:w="1431"/>
+        <w:gridCol w:w="1461"/>
+        <w:gridCol w:w="1805"/>
+        <w:gridCol w:w="1217"/>
+        <w:gridCol w:w="1074"/>
+        <w:gridCol w:w="1074"/>
+        <w:gridCol w:w="1074"/>
+        <w:gridCol w:w="1361"/>
       </w:tblGrid>
       <w:tr>
         <w:trPr>
@@ -18746,7 +18817,7 @@
         </w:trPr>
         <w:tc>
           <w:tcPr>
-            <w:tcW w:type="dxa" w:w="1536"/>
+            <w:tcW w:type="dxa" w:w="1461"/>
             <w:tcBorders>
               <w:top w:val="nil"/>
               <w:left w:val="nil"/>
@@ -18766,7 +18837,7 @@
         </w:tc>
         <w:tc>
           <w:tcPr>
-            <w:tcW w:type="dxa" w:w="1431"/>
+            <w:tcW w:type="dxa" w:w="1805"/>
             <w:tcBorders>
               <w:top w:val="nil"/>
               <w:left w:val="nil"/>
@@ -18794,7 +18865,7 @@
         </w:tc>
         <w:tc>
           <w:tcPr>
-            <w:tcW w:type="dxa" w:w="1280"/>
+            <w:tcW w:type="dxa" w:w="1217"/>
             <w:tcBorders>
               <w:top w:val="nil"/>
               <w:left w:val="nil"/>
@@ -18814,7 +18885,7 @@
         </w:tc>
         <w:tc>
           <w:tcPr>
-            <w:tcW w:type="dxa" w:w="1129"/>
+            <w:tcW w:type="dxa" w:w="1074"/>
             <w:tcBorders>
               <w:top w:val="nil"/>
               <w:left w:val="nil"/>
@@ -18834,7 +18905,7 @@
         </w:tc>
         <w:tc>
           <w:tcPr>
-            <w:tcW w:type="dxa" w:w="1129"/>
+            <w:tcW w:type="dxa" w:w="1074"/>
             <w:tcBorders>
               <w:top w:val="nil"/>
               <w:left w:val="nil"/>
@@ -18854,7 +18925,7 @@
         </w:tc>
         <w:tc>
           <w:tcPr>
-            <w:tcW w:type="dxa" w:w="1129"/>
+            <w:tcW w:type="dxa" w:w="1074"/>
             <w:tcBorders>
               <w:top w:val="nil"/>
               <w:left w:val="nil"/>
@@ -18874,7 +18945,7 @@
         </w:tc>
         <w:tc>
           <w:tcPr>
-            <w:tcW w:type="dxa" w:w="1431"/>
+            <w:tcW w:type="dxa" w:w="1361"/>
             <w:tcBorders>
               <w:top w:val="nil"/>
               <w:left w:val="nil"/>
@@ -18896,7 +18967,7 @@
       <w:tr>
         <w:tc>
           <w:tcPr>
-            <w:tcW w:type="dxa" w:w="1536"/>
+            <w:tcW w:type="dxa" w:w="1461"/>
           </w:tcPr>
           <w:p>
             <w:pPr>
@@ -18910,7 +18981,7 @@
         </w:tc>
         <w:tc>
           <w:tcPr>
-            <w:tcW w:type="dxa" w:w="1431"/>
+            <w:tcW w:type="dxa" w:w="1805"/>
           </w:tcPr>
           <w:p>
             <w:pPr>
@@ -18924,7 +18995,7 @@
         </w:tc>
         <w:tc>
           <w:tcPr>
-            <w:tcW w:type="dxa" w:w="1280"/>
+            <w:tcW w:type="dxa" w:w="1217"/>
           </w:tcPr>
           <w:p>
             <w:pPr>
@@ -18938,7 +19009,7 @@
         </w:tc>
         <w:tc>
           <w:tcPr>
-            <w:tcW w:type="dxa" w:w="1129"/>
+            <w:tcW w:type="dxa" w:w="1074"/>
           </w:tcPr>
           <w:p>
             <w:pPr>
@@ -18952,7 +19023,7 @@
         </w:tc>
         <w:tc>
           <w:tcPr>
-            <w:tcW w:type="dxa" w:w="1129"/>
+            <w:tcW w:type="dxa" w:w="1074"/>
           </w:tcPr>
           <w:p>
             <w:pPr>
@@ -18966,7 +19037,7 @@
         </w:tc>
         <w:tc>
           <w:tcPr>
-            <w:tcW w:type="dxa" w:w="1129"/>
+            <w:tcW w:type="dxa" w:w="1074"/>
           </w:tcPr>
           <w:p>
             <w:pPr>
@@ -18980,7 +19051,7 @@
         </w:tc>
         <w:tc>
           <w:tcPr>
-            <w:tcW w:type="dxa" w:w="1431"/>
+            <w:tcW w:type="dxa" w:w="1361"/>
           </w:tcPr>
           <w:p>
             <w:pPr>
@@ -18996,7 +19067,7 @@
       <w:tr>
         <w:tc>
           <w:tcPr>
-            <w:tcW w:type="dxa" w:w="1536"/>
+            <w:tcW w:type="dxa" w:w="1461"/>
           </w:tcPr>
           <w:p>
             <w:pPr>
@@ -19010,21 +19081,21 @@
         </w:tc>
         <w:tc>
           <w:tcPr>
-            <w:tcW w:type="dxa" w:w="1431"/>
-          </w:tcPr>
-          <w:p>
-            <w:pPr>
-              <w:pStyle w:val="Compact"/>
-              <w:jc w:val="left"/>
-            </w:pPr>
-            <w:r>
-              <w:t xml:space="preserve">0.30–2.0 × 10⁻⁴</w:t>
-            </w:r>
-          </w:p>
-        </w:tc>
-        <w:tc>
-          <w:tcPr>
-            <w:tcW w:type="dxa" w:w="1280"/>
+            <w:tcW w:type="dxa" w:w="1805"/>
+          </w:tcPr>
+          <w:p>
+            <w:pPr>
+              <w:pStyle w:val="Compact"/>
+              <w:jc w:val="left"/>
+            </w:pPr>
+            <w:r>
+              <w:t xml:space="preserve">3.0 × 10⁻⁵–2.0 × 10⁻⁴</w:t>
+            </w:r>
+          </w:p>
+        </w:tc>
+        <w:tc>
+          <w:tcPr>
+            <w:tcW w:type="dxa" w:w="1217"/>
           </w:tcPr>
           <w:p>
             <w:pPr>
@@ -19038,7 +19109,7 @@
         </w:tc>
         <w:tc>
           <w:tcPr>
-            <w:tcW w:type="dxa" w:w="1129"/>
+            <w:tcW w:type="dxa" w:w="1074"/>
           </w:tcPr>
           <w:p>
             <w:pPr>
@@ -19052,7 +19123,7 @@
         </w:tc>
         <w:tc>
           <w:tcPr>
-            <w:tcW w:type="dxa" w:w="1129"/>
+            <w:tcW w:type="dxa" w:w="1074"/>
           </w:tcPr>
           <w:p>
             <w:pPr>
@@ -19066,7 +19137,7 @@
         </w:tc>
         <w:tc>
           <w:tcPr>
-            <w:tcW w:type="dxa" w:w="1129"/>
+            <w:tcW w:type="dxa" w:w="1074"/>
           </w:tcPr>
           <w:p>
             <w:pPr>
@@ -19080,7 +19151,7 @@
         </w:tc>
         <w:tc>
           <w:tcPr>
-            <w:tcW w:type="dxa" w:w="1431"/>
+            <w:tcW w:type="dxa" w:w="1361"/>
           </w:tcPr>
           <w:p>
             <w:pPr>
@@ -21767,7 +21838,7 @@
         <w:t xml:space="preserve"> </w:t>
       </w:r>
       <w:r>
-        <w:t xml:space="preserve">gives Eq. (6). With uniform stiffness, the blind condition for a mid-span sensor is</w:t>
+        <w:t xml:space="preserve">gives Eq. (6). With uniform rigidity, the blind condition for a mid-span sensor is</w:t>
       </w:r>
       <w:r>
         <w:t xml:space="preserve"> </w:t>
@@ -24898,7 +24969,7 @@
           </m:e>
         </m:nary>
         <m:r>
-          <m:t>h</m:t>
+          <m:t>ψ</m:t>
         </m:r>
         <m:d>
           <m:dPr>
@@ -24924,17 +24995,51 @@
         </m:d>
       </m:oMath>
       <w:r>
-        <w:t xml:space="preserve"> </w:t>
-      </w:r>
-      <w:r>
-        <w:t xml:space="preserve">with</w:t>
-      </w:r>
-      <w:r>
-        <w:t xml:space="preserve"> </w:t>
-      </w:r>
-      <m:oMath>
-        <m:r>
-          <m:t>h</m:t>
+        <w:t xml:space="preserve">, with</w:t>
+      </w:r>
+      <w:r>
+        <w:t xml:space="preserve"> </w:t>
+      </w:r>
+      <m:oMath>
+        <m:sSub>
+          <m:e>
+            <m:r>
+              <m:t>s</m:t>
+            </m:r>
+          </m:e>
+          <m:sub>
+            <m:r>
+              <m:t>i</m:t>
+            </m:r>
+          </m:sub>
+        </m:sSub>
+      </m:oMath>
+      <w:r>
+        <w:t xml:space="preserve"> </w:t>
+      </w:r>
+      <w:r>
+        <w:t xml:space="preserve">the position of axle</w:t>
+      </w:r>
+      <w:r>
+        <w:t xml:space="preserve"> </w:t>
+      </w:r>
+      <m:oMath>
+        <m:r>
+          <m:t>i</m:t>
+        </m:r>
+      </m:oMath>
+      <w:r>
+        <w:t xml:space="preserve"> </w:t>
+      </w:r>
+      <w:r>
+        <w:t xml:space="preserve">and</w:t>
+      </w:r>
+      <w:r>
+        <w:t xml:space="preserve"> </w:t>
+      </w:r>
+      <m:oMath>
+        <m:r>
+          <m:t>ψ</m:t>
         </m:r>
         <m:d>
           <m:dPr>
@@ -25061,7 +25166,7 @@
       </w:r>
       <m:oMath>
         <m:r>
-          <m:t>h</m:t>
+          <m:t>ψ</m:t>
         </m:r>
       </m:oMath>
       <w:r>
@@ -25377,7 +25482,7 @@
         <w:t xml:space="preserve"> </w:t>
       </w:r>
       <w:r>
-        <w:t xml:space="preserve">is therefore constant, and the only freedom lies across channels. An estimate built on the absolute value of the record [44] is not linear in the axle loads, so it loses this invariance whenever contributions of opposite sign overlap. When the influence line is known, other invariant weighting functions exist; for two equal spans their white-noise variance is 1.5–6.6 times smaller, but a 20 % stiffness error in the adjacent span then produces configuration-dependent errors of −1.1 % to +2.0 % (Supplementary Material).</w:t>
+        <w:t xml:space="preserve">is therefore constant, and the only freedom lies across channels. An estimate built on the absolute value of the record [44] is not linear in the axle loads, so it loses this invariance whenever contributions of opposite sign overlap. When the influence line is known, other invariant weighting functions exist; for two equal spans their white-noise variance is 1.5–6.6 times smaller, but a 20 % rigidity error in the adjacent span then produces configuration-dependent errors of −1.1 % to +2.0 % (Supplementary Material).</w:t>
       </w:r>
     </w:p>
     <w:bookmarkEnd w:id="43"/>
@@ -26435,7 +26540,7 @@
         <w:pStyle w:val="FirstParagraph"/>
       </w:pPr>
       <w:r>
-        <w:t xml:space="preserve">The Supplementary Material contains: (i) the analysis scripts and the console output of each run, with a README that maps every table and figure to a script and log; (ii) the derived data behind every figure and table; (iii) the laboratory influence line (Fig. S15), the full laboratory data (Table S1) and the quadrature study; (iv) the field-record tables: per-channel constants and scatter with χ² tests (Table S2), truck-to-truck ratios with equivalence tests (Table S3), correlations of vehicle-free noise and crossing residuals (Table S4), the per-crossing standard deviations predicted by both covariance models (Table S5) and the full table of estimator errors (Table S6); the processing details and excluded runs, the speed regressions, lane-B and two-truck results, and all estimator results including leave-one-truck-out, in-sample and GLS with the covariance estimated from crossing residuals (Figs. S1–S2); (v) the beam model of the five-span girder, including the strain constant of the gauges relative to the largest on the girder, and the synthetic records of the dataset authors (Figs. S3–S4); (vi) strain blind-locus maps (Figs. S5–S6); (vii) the multi-channel placement study (brute-force search over all cases), Monte Carlo verification and structure-aware weighting functions (Figs. S7–S9); (viii) the asymmetric three-span closed forms; (ix) the Cầu Mây design section properties and concrete modulus, the model-form variants (depth lengths, exponents, rigid pier zone), the frequency interpretation, admissible sets against tolerance (3 %, 4 % and 5.3 %, with and without a prior on</w:t>
+        <w:t xml:space="preserve">The Supplementary Material contains: (i) the analysis scripts and the console output of each run, with a README that maps every table and figure to a script and log; (ii) the derived data behind every figure and table; (iii) the laboratory influence line (Fig. S1), the full laboratory data (Table S1) and the quadrature study; (iv) the field-record tables: per-channel constants and scatter with χ² tests (Table S2), truck-to-truck ratios with equivalence tests (Table S3), correlations of vehicle-free noise and crossing residuals (Table S4), the per-crossing standard deviations predicted by both covariance models (Table S5) and the full table of estimator errors (Table S6); the processing details and excluded runs, the speed regressions, lane-B and two-truck results, and all estimator results including leave-one-truck-out, in-sample and GLS with the covariance estimated from crossing residuals (Figs. S2–S3); (v) the beam model of the five-span girder, including the strain constant of the gauges relative to the largest on the girder, and the synthetic records of the dataset authors (Figs. S4–S5); (vi) strain blind-locus maps (Figs. S6–S7); (vii) the multi-channel placement study (brute-force search over all cases), Monte Carlo verification and structure-aware weighting functions (Figs. S8–S10); (viii) the asymmetric three-span closed forms; (ix) the Cầu Mây design section properties and concrete modulus, the model-form variants (haunch lengths, exponents, rigid pier zone), the frequency interpretation, admissible sets against tolerance (3 %, 4 % and 5.3 %, with and without a prior on</w:t>
       </w:r>
       <w:r>
         <w:t xml:space="preserve"> </w:t>
@@ -26480,7 +26585,7 @@
         </m:r>
       </m:oMath>
       <w:r>
-        <w:t xml:space="preserve">, the closed-form Möbius law (Figs. S10–S12) and the processed acceptance-test data (Tables S8–S10); (x) the moving-force analysis behind the dynamic bound; (xi) the deflection records of two simply supported bridges, which illustrate baseline handling and low-pass filtering (Figs. S13–S14).</w:t>
+        <w:t xml:space="preserve">, the closed-form Möbius law (Figs. S11–S13) and the processed acceptance-test data (Tables S8–S10); (x) the moving-force analysis behind the dynamic bound; (xi) the deflection records of two simply supported bridges, which illustrate baseline handling and low-pass filtering (Figs. S14–S15).</w:t>
       </w:r>
     </w:p>
     <w:bookmarkEnd w:id="52"/>
@@ -26866,7 +26971,7 @@
         <w:pStyle w:val="BodyText"/>
       </w:pPr>
       <w:r>
-        <w:t xml:space="preserve">[47] Z. Shen, W. Peng, X. Zhang, et al., A lightweight weigh-in-motion system based on vehicle-induced bridge deflection and impact dynamic responses, Int. J. Struct. Stab. Dyn. (2026), online. https://doi.org/10.1142/s0219455427503664</w:t>
+        <w:t xml:space="preserve">[47] Z. Shen, W. Peng, X. Zhang, et al., A lightweight weigh-in-motion system based on vehicle-induced bridge deflection and impact dynamic responses, Int. J. Struct. Stab. Dyn. (2026), online first. https://doi.org/10.1142/s0219455427503664</w:t>
       </w:r>
     </w:p>
     <w:p>

</xml_diff>

<commit_message>
XII.13 confirmation read: fix mandatory items (central/eccentric, deviates from), relabel supplementary figures and Figs. 2, 3, 4, 8 with main-text notation; rebuild package
Co-Authored-By: Claude Opus 5.5 <noreply@anthropic.com>
Claude-Session: https://claude.ai/code/session_01LGLpDzAMfdMgWcXQjLxauw
</commit_message>
<xml_diff>
--- a/manuscript/v4/word/Manuscript_v4.docx
+++ b/manuscript/v4/word/Manuscript_v4.docx
@@ -15549,7 +15549,7 @@
         <w:pStyle w:val="BodyText"/>
       </w:pPr>
       <w:r>
-        <w:t xml:space="preserve">Two deflection gauge sections were read: N8 in the side span between pier T7 and end support T8, at 0.4L (22 m) from T8, and N7 at mid main span. In the June 2020 acceptance test, four trucks stood in the side span (gauge N8) and six in the main span (gauge N7). The trucks were 3-axle, nominally 5 + 10 + 10 t, with a weighed mean of 25.06 t. Mitutoyo dial gauges, mounted on independent frames fixed to the ground, read the peak deflection under centric and eccentric transverse positions. Each gauge section has six readings (three measuring points across the section, on the axis and at both edges, under centric and eccentric truck arrangements); their mean is 5.55 mm at N8 and 15.42 mm at N7.</w:t>
+        <w:t xml:space="preserve">Two deflection gauge sections were read: N8 in the side span between pier T7 and end support T8, at 0.4L (22 m) from T8, and N7 at mid main span. In the June 2020 acceptance test, four trucks stood in the side span (gauge N8) and six in the main span (gauge N7). The trucks were 3-axle, nominally 5 + 10 + 10 t, with a weighed mean of 25.06 t. Mitutoyo dial gauges, mounted on independent frames fixed to the ground, read the peak deflection under central and eccentric transverse positions. Each gauge section has six readings (three measuring points across the section, on the axis and at both edges, under central and eccentric truck arrangements); their mean is 5.55 mm at N8 and 15.42 mm at N7.</w:t>
       </w:r>
     </w:p>
     <w:p>
@@ -15709,7 +15709,7 @@
         <w:t xml:space="preserve"> </w:t>
       </w:r>
       <w:r>
-        <w:t xml:space="preserve">kN m/rad fitted to the designer’s FE output; it misfits the measurements by +2.4 % at N8 and +12.3 % at N7. Calibration B is the joint least-squares fit to the two readings, with</w:t>
+        <w:t xml:space="preserve">kN m/rad fitted to the designer’s FE output; it deviates from the measurements by +2.4 % at N8 and +12.3 % at N7. Calibration B is the joint least-squares fit to the two readings, with</w:t>
       </w:r>
       <w:r>
         <w:t xml:space="preserve"> </w:t>
@@ -28133,7 +28133,7 @@
         <w:t xml:space="preserve"> </w:t>
       </w:r>
       <w:r>
-        <w:t xml:space="preserve">of the offset; (b) standard deviation of the load against the offset level for single sensors and three-sensor designs; (c) zero-sum pair (labelled offset-immune in the panel) at</w:t>
+        <w:t xml:space="preserve">of the offset; (b) standard deviation of the load against the offset level for single sensors and three-sensor designs; (c) zero-sum pair at</w:t>
       </w:r>
       <w:r>
         <w:t xml:space="preserve"> </w:t>

</xml_diff>